<commit_message>
Updated diary (I forgot about it so sorry)
</commit_message>
<xml_diff>
--- a/1-Diary2026.docx
+++ b/1-Diary2026.docx
@@ -1260,7 +1260,6 @@
         </w:rPr>
         <w:t xml:space="preserve">work done so far, work you still </w:t>
       </w:r>
-      <w:proofErr w:type="gramStart"/>
       <w:r>
         <w:rPr>
           <w:rFonts w:ascii="Calibri" w:hAnsi="Calibri" w:cs="Calibri"/>
@@ -1272,14 +1271,7 @@
         <w:rPr>
           <w:rFonts w:ascii="Calibri" w:hAnsi="Calibri" w:cs="Calibri"/>
         </w:rPr>
-        <w:t>to</w:t>
-      </w:r>
-      <w:proofErr w:type="gramEnd"/>
-      <w:r>
-        <w:rPr>
-          <w:rFonts w:ascii="Calibri" w:hAnsi="Calibri" w:cs="Calibri"/>
-        </w:rPr>
-        <w:t xml:space="preserve"> do, </w:t>
+        <w:t xml:space="preserve">to do, </w:t>
       </w:r>
       <w:r>
         <w:rPr>
@@ -1452,21 +1444,12 @@
         </w:rPr>
         <w:t>D</w:t>
       </w:r>
-      <w:proofErr w:type="spellStart"/>
       <w:r>
         <w:rPr>
           <w:rFonts w:ascii="Calibri" w:hAnsi="Calibri" w:cs="Calibri"/>
           <w:iCs/>
         </w:rPr>
-        <w:t>etailed</w:t>
-      </w:r>
-      <w:proofErr w:type="spellEnd"/>
-      <w:r>
-        <w:rPr>
-          <w:rFonts w:ascii="Calibri" w:hAnsi="Calibri" w:cs="Calibri"/>
-          <w:iCs/>
-        </w:rPr>
-        <w:t xml:space="preserve"> instructions </w:t>
+        <w:t xml:space="preserve">etailed instructions </w:t>
       </w:r>
       <w:r>
         <w:rPr>
@@ -2882,156 +2865,7 @@
         <w:rPr>
           <w:rFonts w:ascii="Calibri" w:hAnsi="Calibri" w:cs="Arial"/>
         </w:rPr>
-        <w:t xml:space="preserve">Created my project proposal and submit it. Supervisors </w:t>
-      </w:r>
-      <w:proofErr w:type="gramStart"/>
-      <w:r>
-        <w:rPr>
-          <w:rFonts w:ascii="Calibri" w:hAnsi="Calibri" w:cs="Arial"/>
-        </w:rPr>
-        <w:t>assigned</w:t>
-      </w:r>
-      <w:proofErr w:type="gramEnd"/>
-      <w:r>
-        <w:rPr>
-          <w:rFonts w:ascii="Calibri" w:hAnsi="Calibri" w:cs="Arial"/>
-        </w:rPr>
-        <w:t xml:space="preserve"> next week.</w:t>
-      </w:r>
-    </w:p>
-    <w:p>
-      <w:pPr>
-        <w:spacing w:line="480" w:lineRule="auto"/>
-        <w:ind w:left="-709" w:right="-568"/>
-        <w:rPr>
-          <w:rFonts w:ascii="Calibri" w:hAnsi="Calibri" w:cs="Arial"/>
-        </w:rPr>
-      </w:pPr>
-      <w:r>
-        <w:rPr>
-          <w:rFonts w:ascii="Calibri" w:hAnsi="Calibri" w:cs="Arial"/>
-        </w:rPr>
-        <w:t>________________________________________________________________________________</w:t>
-      </w:r>
-    </w:p>
-    <w:p>
-      <w:pPr>
-        <w:spacing w:line="480" w:lineRule="auto"/>
-        <w:ind w:left="-709" w:right="-568"/>
-        <w:rPr>
-          <w:rFonts w:ascii="Calibri" w:hAnsi="Calibri" w:cs="Arial"/>
-        </w:rPr>
-      </w:pPr>
-      <w:r>
-        <w:rPr>
-          <w:rFonts w:ascii="Calibri" w:hAnsi="Calibri" w:cs="Arial"/>
-        </w:rPr>
-        <w:t>________________________________________________________________________________</w:t>
-      </w:r>
-    </w:p>
-    <w:p>
-      <w:pPr>
-        <w:spacing w:line="480" w:lineRule="auto"/>
-        <w:ind w:left="-709" w:right="-568"/>
-        <w:rPr>
-          <w:rFonts w:ascii="Calibri" w:hAnsi="Calibri" w:cs="Arial"/>
-        </w:rPr>
-      </w:pPr>
-      <w:r>
-        <w:rPr>
-          <w:rFonts w:ascii="Calibri" w:hAnsi="Calibri" w:cs="Arial"/>
-        </w:rPr>
-        <w:t>________________________________________________________________________________</w:t>
-      </w:r>
-    </w:p>
-    <w:p>
-      <w:pPr>
-        <w:spacing w:line="480" w:lineRule="auto"/>
-        <w:ind w:left="-709" w:right="-568"/>
-        <w:rPr>
-          <w:rFonts w:ascii="Calibri" w:hAnsi="Calibri" w:cs="Arial"/>
-        </w:rPr>
-      </w:pPr>
-      <w:r>
-        <w:rPr>
-          <w:rFonts w:ascii="Calibri" w:hAnsi="Calibri" w:cs="Arial"/>
-        </w:rPr>
-        <w:t>________________________________________________________________________________</w:t>
-      </w:r>
-    </w:p>
-    <w:p>
-      <w:pPr>
-        <w:spacing w:line="480" w:lineRule="auto"/>
-        <w:ind w:left="-709" w:right="-568"/>
-        <w:rPr>
-          <w:rFonts w:ascii="Calibri" w:hAnsi="Calibri" w:cs="Arial"/>
-        </w:rPr>
-      </w:pPr>
-      <w:r>
-        <w:rPr>
-          <w:rFonts w:ascii="Calibri" w:hAnsi="Calibri" w:cs="Arial"/>
-        </w:rPr>
-        <w:t>________________________________________________________________________________</w:t>
-      </w:r>
-    </w:p>
-    <w:p>
-      <w:pPr>
-        <w:spacing w:line="480" w:lineRule="auto"/>
-        <w:ind w:left="-709" w:right="-568"/>
-        <w:rPr>
-          <w:rFonts w:ascii="Calibri" w:hAnsi="Calibri" w:cs="Arial"/>
-        </w:rPr>
-      </w:pPr>
-      <w:r>
-        <w:rPr>
-          <w:rFonts w:ascii="Calibri" w:hAnsi="Calibri" w:cs="Arial"/>
-        </w:rPr>
-        <w:t>________________________________________________________________________________</w:t>
-      </w:r>
-    </w:p>
-    <w:p>
-      <w:pPr>
-        <w:spacing w:line="480" w:lineRule="auto"/>
-        <w:ind w:left="-709" w:right="-568"/>
-        <w:rPr>
-          <w:rFonts w:ascii="Calibri" w:hAnsi="Calibri" w:cs="Arial"/>
-        </w:rPr>
-      </w:pPr>
-      <w:r>
-        <w:rPr>
-          <w:rFonts w:ascii="Calibri" w:hAnsi="Calibri" w:cs="Arial"/>
-        </w:rPr>
-        <w:t>________________________________________________________________________________</w:t>
-      </w:r>
-    </w:p>
-    <w:p>
-      <w:pPr>
-        <w:spacing w:line="480" w:lineRule="auto"/>
-        <w:ind w:left="-709" w:right="-568"/>
-        <w:rPr>
-          <w:rFonts w:ascii="Calibri" w:hAnsi="Calibri" w:cs="Arial"/>
-        </w:rPr>
-      </w:pPr>
-      <w:r>
-        <w:rPr>
-          <w:rFonts w:ascii="Calibri" w:hAnsi="Calibri" w:cs="Arial"/>
-        </w:rPr>
-        <w:t>________________________________________________________________________________</w:t>
-      </w:r>
-    </w:p>
-    <w:p>
-      <w:pPr>
-        <w:spacing w:line="480" w:lineRule="auto"/>
-        <w:ind w:left="-709" w:right="-568"/>
-        <w:rPr>
-          <w:rFonts w:ascii="Calibri" w:hAnsi="Calibri" w:cs="Arial"/>
-        </w:rPr>
-      </w:pPr>
-      <w:r>
-        <w:rPr>
-          <w:rFonts w:ascii="Calibri" w:hAnsi="Calibri" w:cs="Arial"/>
-        </w:rPr>
-        <w:t>________________________________________________________________________________</w:t>
+        <w:t>Created my project proposal and submit it. Supervisors assigned next week.</w:t>
       </w:r>
     </w:p>
     <w:p>
@@ -3383,7 +3217,6 @@
           <w:sz w:val="28"/>
           <w:szCs w:val="28"/>
         </w:rPr>
-        <w:lastRenderedPageBreak/>
         <w:t xml:space="preserve">Week </w:t>
       </w:r>
       <w:r>
@@ -3488,21 +3321,7 @@
         <w:rPr>
           <w:rFonts w:ascii="Calibri" w:hAnsi="Calibri" w:cs="Arial"/>
         </w:rPr>
-        <w:t xml:space="preserve">Created and submit Deliverable 1; made a project plan and timeline, identified available time and resources, identified personal skill level, described my target audience and intended platform and proposed a basic outline site map with a </w:t>
-      </w:r>
-      <w:proofErr w:type="spellStart"/>
-      <w:r>
-        <w:rPr>
-          <w:rFonts w:ascii="Calibri" w:hAnsi="Calibri" w:cs="Arial"/>
-        </w:rPr>
-        <w:t>moodboard</w:t>
-      </w:r>
-      <w:proofErr w:type="spellEnd"/>
-      <w:r>
-        <w:rPr>
-          <w:rFonts w:ascii="Calibri" w:hAnsi="Calibri" w:cs="Arial"/>
-        </w:rPr>
-        <w:t>.</w:t>
+        <w:t>Created and submit Deliverable 1; made a project plan and timeline, identified available time and resources, identified personal skill level, described my target audience and intended platform and proposed a basic outline site map with a moodboard.</w:t>
       </w:r>
     </w:p>
     <w:p>
@@ -3539,36 +3358,6 @@
           <w:rFonts w:ascii="Calibri" w:hAnsi="Calibri" w:cs="Arial"/>
         </w:rPr>
         <w:t>idea for what the preview of a vinyl looks like.</w:t>
-      </w:r>
-    </w:p>
-    <w:p>
-      <w:pPr>
-        <w:spacing w:line="480" w:lineRule="auto"/>
-        <w:ind w:left="-709" w:right="-568"/>
-        <w:rPr>
-          <w:rFonts w:ascii="Calibri" w:hAnsi="Calibri" w:cs="Arial"/>
-        </w:rPr>
-      </w:pPr>
-      <w:r>
-        <w:rPr>
-          <w:rFonts w:ascii="Calibri" w:hAnsi="Calibri" w:cs="Arial"/>
-        </w:rPr>
-        <w:t>________________________________________________________________________________</w:t>
-      </w:r>
-    </w:p>
-    <w:p>
-      <w:pPr>
-        <w:spacing w:line="480" w:lineRule="auto"/>
-        <w:ind w:left="-709" w:right="-568"/>
-        <w:rPr>
-          <w:rFonts w:ascii="Calibri" w:hAnsi="Calibri" w:cs="Arial"/>
-        </w:rPr>
-      </w:pPr>
-      <w:r>
-        <w:rPr>
-          <w:rFonts w:ascii="Calibri" w:hAnsi="Calibri" w:cs="Arial"/>
-        </w:rPr>
-        <w:t>________________________________________________________________________________</w:t>
       </w:r>
     </w:p>
     <w:p>
@@ -3972,308 +3761,218 @@
         <w:rPr>
           <w:rFonts w:ascii="Calibri" w:hAnsi="Calibri" w:cs="Arial"/>
         </w:rPr>
+        <w:t xml:space="preserve">Started the </w:t>
+      </w:r>
+      <w:r>
+        <w:rPr>
+          <w:rFonts w:ascii="Calibri" w:hAnsi="Calibri" w:cs="Arial"/>
+        </w:rPr>
+        <w:t>coding for the website, currently just got the basics like the top menu.</w:t>
+      </w:r>
+    </w:p>
+    <w:p>
+      <w:pPr>
+        <w:spacing w:line="480" w:lineRule="auto"/>
+        <w:ind w:left="-709" w:right="-568"/>
+        <w:rPr>
+          <w:rFonts w:ascii="Calibri" w:hAnsi="Calibri" w:cs="Arial"/>
+        </w:rPr>
+      </w:pPr>
+      <w:r>
+        <w:rPr>
+          <w:rFonts w:ascii="Calibri" w:hAnsi="Calibri" w:cs="Arial"/>
+        </w:rPr>
+        <w:t>Coded in the grid view of each vinyl, added the pictures and titles for each vinyl album.</w:t>
+      </w:r>
+    </w:p>
+    <w:p>
+      <w:pPr>
+        <w:spacing w:line="480" w:lineRule="auto"/>
+        <w:ind w:left="-709" w:right="-568"/>
+        <w:rPr>
+          <w:rFonts w:ascii="Calibri" w:hAnsi="Calibri" w:cs="Arial"/>
+        </w:rPr>
+      </w:pPr>
+      <w:r>
+        <w:rPr>
+          <w:rFonts w:ascii="Calibri" w:hAnsi="Calibri" w:cs="Arial"/>
+        </w:rPr>
+        <w:t>Started adding in the database, looking to make a log in feature</w:t>
+      </w:r>
+      <w:r>
+        <w:rPr>
+          <w:rFonts w:ascii="Calibri" w:hAnsi="Calibri" w:cs="Arial"/>
+        </w:rPr>
+        <w:t xml:space="preserve"> next</w:t>
+      </w:r>
+    </w:p>
+    <w:p>
+      <w:pPr>
+        <w:ind w:left="-709" w:right="-568"/>
+        <w:rPr>
+          <w:rFonts w:ascii="Calibri" w:hAnsi="Calibri" w:cs="Arial"/>
+        </w:rPr>
+      </w:pPr>
+    </w:p>
+    <w:p>
+      <w:pPr>
+        <w:ind w:left="-709" w:right="-568"/>
+        <w:rPr>
+          <w:rFonts w:ascii="Calibri" w:hAnsi="Calibri" w:cs="Arial"/>
+          <w:b/>
+          <w:bCs/>
+        </w:rPr>
+      </w:pPr>
+    </w:p>
+    <w:p>
+      <w:pPr>
+        <w:ind w:left="-709" w:right="-568"/>
+        <w:rPr>
+          <w:rFonts w:ascii="Calibri" w:hAnsi="Calibri" w:cs="Arial"/>
+          <w:b/>
+          <w:bCs/>
+        </w:rPr>
+      </w:pPr>
+    </w:p>
+    <w:p>
+      <w:pPr>
+        <w:ind w:left="-709" w:right="-568"/>
+        <w:rPr>
+          <w:rFonts w:ascii="Calibri" w:hAnsi="Calibri" w:cs="Arial"/>
+        </w:rPr>
+      </w:pPr>
+      <w:r>
+        <w:rPr>
+          <w:rFonts w:ascii="Calibri" w:hAnsi="Calibri" w:cs="Arial"/>
+          <w:b/>
+          <w:bCs/>
+        </w:rPr>
+        <w:t>Notes (and things to remember)</w:t>
+      </w:r>
+      <w:r>
+        <w:rPr>
+          <w:rFonts w:ascii="Calibri" w:hAnsi="Calibri" w:cs="Arial"/>
+        </w:rPr>
+        <w:t>:</w:t>
+      </w:r>
+    </w:p>
+    <w:p>
+      <w:pPr>
+        <w:ind w:left="-709" w:right="-568"/>
+        <w:rPr>
+          <w:rFonts w:ascii="Calibri" w:hAnsi="Calibri" w:cs="Arial"/>
+        </w:rPr>
+      </w:pPr>
+    </w:p>
+    <w:p>
+      <w:pPr>
+        <w:spacing w:line="480" w:lineRule="auto"/>
+        <w:ind w:left="-709" w:right="-568"/>
+        <w:rPr>
+          <w:rFonts w:ascii="Calibri" w:hAnsi="Calibri" w:cs="Arial"/>
+        </w:rPr>
+      </w:pPr>
+      <w:r>
+        <w:rPr>
+          <w:rFonts w:ascii="Calibri" w:hAnsi="Calibri" w:cs="Arial"/>
+        </w:rPr>
+        <w:t xml:space="preserve">Have </w:t>
+      </w:r>
+      <w:r>
+        <w:rPr>
+          <w:rFonts w:ascii="Calibri" w:hAnsi="Calibri" w:cs="Arial"/>
+        </w:rPr>
+        <w:t>users be able to register and log in</w:t>
+      </w:r>
+    </w:p>
+    <w:p>
+      <w:pPr>
+        <w:spacing w:line="480" w:lineRule="auto"/>
+        <w:ind w:left="-709" w:right="-568"/>
+        <w:rPr>
+          <w:rFonts w:ascii="Calibri" w:hAnsi="Calibri" w:cs="Arial"/>
+        </w:rPr>
+      </w:pPr>
+      <w:r>
+        <w:rPr>
+          <w:rFonts w:ascii="Calibri" w:hAnsi="Calibri" w:cs="Arial"/>
+        </w:rPr>
+        <w:t>Made the popouts for each vinyl</w:t>
+      </w:r>
+    </w:p>
+    <w:p>
+      <w:pPr>
+        <w:spacing w:line="480" w:lineRule="auto"/>
+        <w:ind w:left="-709" w:right="-568"/>
+        <w:rPr>
+          <w:rFonts w:ascii="Calibri" w:hAnsi="Calibri" w:cs="Arial"/>
+        </w:rPr>
+      </w:pPr>
+      <w:r>
+        <w:rPr>
+          <w:rFonts w:ascii="Calibri" w:hAnsi="Calibri" w:cs="Arial"/>
+        </w:rPr>
+        <w:t>________________________________________________________________________________</w:t>
+      </w:r>
+    </w:p>
+    <w:p>
+      <w:pPr>
+        <w:spacing w:line="480" w:lineRule="auto"/>
+        <w:ind w:left="-709" w:right="-568"/>
+        <w:rPr>
+          <w:rFonts w:ascii="Calibri" w:hAnsi="Calibri" w:cs="Arial"/>
+        </w:rPr>
+      </w:pPr>
+      <w:r>
+        <w:rPr>
+          <w:rFonts w:ascii="Calibri" w:hAnsi="Calibri" w:cs="Arial"/>
+        </w:rPr>
+        <w:t>________________________________________________________________________________</w:t>
+      </w:r>
+    </w:p>
+    <w:p>
+      <w:pPr>
+        <w:spacing w:line="480" w:lineRule="auto"/>
+        <w:ind w:left="-709" w:right="-568"/>
+        <w:rPr>
+          <w:rFonts w:ascii="Calibri" w:hAnsi="Calibri" w:cs="Arial"/>
+        </w:rPr>
+      </w:pPr>
+      <w:r>
+        <w:rPr>
+          <w:rFonts w:ascii="Calibri" w:hAnsi="Calibri" w:cs="Arial"/>
+        </w:rPr>
+        <w:t>________________________________________________________________________________</w:t>
+      </w:r>
+    </w:p>
+    <w:p>
+      <w:pPr>
+        <w:spacing w:line="480" w:lineRule="auto"/>
+        <w:ind w:left="-709" w:right="-568"/>
+        <w:rPr>
+          <w:rFonts w:ascii="Calibri" w:hAnsi="Calibri" w:cs="Arial"/>
+        </w:rPr>
+      </w:pPr>
+      <w:r>
+        <w:rPr>
+          <w:rFonts w:ascii="Calibri" w:hAnsi="Calibri" w:cs="Arial"/>
+        </w:rPr>
+        <w:t>________________________________________________________________________________</w:t>
+      </w:r>
+    </w:p>
+    <w:p>
+      <w:pPr>
+        <w:spacing w:line="480" w:lineRule="auto"/>
+        <w:ind w:left="-709" w:right="-568"/>
+        <w:rPr>
+          <w:rFonts w:ascii="Calibri" w:hAnsi="Calibri" w:cs="Arial"/>
+        </w:rPr>
+      </w:pPr>
+      <w:r>
+        <w:rPr>
+          <w:rFonts w:ascii="Calibri" w:hAnsi="Calibri" w:cs="Arial"/>
+        </w:rPr>
         <w:lastRenderedPageBreak/>
-        <w:t xml:space="preserve">Started the </w:t>
-      </w:r>
-      <w:r>
-        <w:rPr>
-          <w:rFonts w:ascii="Calibri" w:hAnsi="Calibri" w:cs="Arial"/>
-        </w:rPr>
-        <w:t>coding for the website, currently just got the basics like the top menu.</w:t>
-      </w:r>
-    </w:p>
-    <w:p>
-      <w:pPr>
-        <w:spacing w:line="480" w:lineRule="auto"/>
-        <w:ind w:left="-709" w:right="-568"/>
-        <w:rPr>
-          <w:rFonts w:ascii="Calibri" w:hAnsi="Calibri" w:cs="Arial"/>
-        </w:rPr>
-      </w:pPr>
-      <w:r>
-        <w:rPr>
-          <w:rFonts w:ascii="Calibri" w:hAnsi="Calibri" w:cs="Arial"/>
-        </w:rPr>
-        <w:t>Coded in the grid view of each vinyl, added the pictures and titles for each vinyl album.</w:t>
-      </w:r>
-    </w:p>
-    <w:p>
-      <w:pPr>
-        <w:spacing w:line="480" w:lineRule="auto"/>
-        <w:ind w:left="-709" w:right="-568"/>
-        <w:rPr>
-          <w:rFonts w:ascii="Calibri" w:hAnsi="Calibri" w:cs="Arial"/>
-        </w:rPr>
-      </w:pPr>
-      <w:r>
-        <w:rPr>
-          <w:rFonts w:ascii="Calibri" w:hAnsi="Calibri" w:cs="Arial"/>
-        </w:rPr>
-        <w:t>Started adding in the database, looking to make a log in feature</w:t>
-      </w:r>
-      <w:r>
-        <w:rPr>
-          <w:rFonts w:ascii="Calibri" w:hAnsi="Calibri" w:cs="Arial"/>
-        </w:rPr>
-        <w:t xml:space="preserve"> next</w:t>
-      </w:r>
-    </w:p>
-    <w:p>
-      <w:pPr>
-        <w:spacing w:line="480" w:lineRule="auto"/>
-        <w:ind w:left="-709" w:right="-568"/>
-        <w:rPr>
-          <w:rFonts w:ascii="Calibri" w:hAnsi="Calibri" w:cs="Arial"/>
-        </w:rPr>
-      </w:pPr>
-      <w:r>
-        <w:rPr>
-          <w:rFonts w:ascii="Calibri" w:hAnsi="Calibri" w:cs="Arial"/>
-        </w:rPr>
-        <w:t>________________________________________________________________________________</w:t>
-      </w:r>
-    </w:p>
-    <w:p>
-      <w:pPr>
-        <w:spacing w:line="480" w:lineRule="auto"/>
-        <w:ind w:left="-709" w:right="-568"/>
-        <w:rPr>
-          <w:rFonts w:ascii="Calibri" w:hAnsi="Calibri" w:cs="Arial"/>
-        </w:rPr>
-      </w:pPr>
-      <w:r>
-        <w:rPr>
-          <w:rFonts w:ascii="Calibri" w:hAnsi="Calibri" w:cs="Arial"/>
-        </w:rPr>
-        <w:t>________________________________________________________________________________</w:t>
-      </w:r>
-    </w:p>
-    <w:p>
-      <w:pPr>
-        <w:spacing w:line="480" w:lineRule="auto"/>
-        <w:ind w:left="-709" w:right="-568"/>
-        <w:rPr>
-          <w:rFonts w:ascii="Calibri" w:hAnsi="Calibri" w:cs="Arial"/>
-        </w:rPr>
-      </w:pPr>
-      <w:r>
-        <w:rPr>
-          <w:rFonts w:ascii="Calibri" w:hAnsi="Calibri" w:cs="Arial"/>
-        </w:rPr>
-        <w:t>________________________________________________________________________________</w:t>
-      </w:r>
-    </w:p>
-    <w:p>
-      <w:pPr>
-        <w:spacing w:line="480" w:lineRule="auto"/>
-        <w:ind w:left="-709" w:right="-568"/>
-        <w:rPr>
-          <w:rFonts w:ascii="Calibri" w:hAnsi="Calibri" w:cs="Arial"/>
-        </w:rPr>
-      </w:pPr>
-      <w:r>
-        <w:rPr>
-          <w:rFonts w:ascii="Calibri" w:hAnsi="Calibri" w:cs="Arial"/>
-        </w:rPr>
-        <w:t>________________________________________________________________________________</w:t>
-      </w:r>
-    </w:p>
-    <w:p>
-      <w:pPr>
-        <w:spacing w:line="480" w:lineRule="auto"/>
-        <w:ind w:left="-709" w:right="-568"/>
-        <w:rPr>
-          <w:rFonts w:ascii="Calibri" w:hAnsi="Calibri" w:cs="Arial"/>
-        </w:rPr>
-      </w:pPr>
-      <w:r>
-        <w:rPr>
-          <w:rFonts w:ascii="Calibri" w:hAnsi="Calibri" w:cs="Arial"/>
-        </w:rPr>
-        <w:t>________________________________________________________________________________</w:t>
-      </w:r>
-    </w:p>
-    <w:p>
-      <w:pPr>
-        <w:spacing w:line="480" w:lineRule="auto"/>
-        <w:ind w:left="-709" w:right="-568"/>
-        <w:rPr>
-          <w:rFonts w:ascii="Calibri" w:hAnsi="Calibri" w:cs="Arial"/>
-        </w:rPr>
-      </w:pPr>
-      <w:r>
-        <w:rPr>
-          <w:rFonts w:ascii="Calibri" w:hAnsi="Calibri" w:cs="Arial"/>
-        </w:rPr>
-        <w:t>________________________________________________________________________________</w:t>
-      </w:r>
-    </w:p>
-    <w:p>
-      <w:pPr>
-        <w:ind w:left="-709" w:right="-568"/>
-        <w:rPr>
-          <w:rFonts w:ascii="Calibri" w:hAnsi="Calibri" w:cs="Arial"/>
-        </w:rPr>
-      </w:pPr>
-    </w:p>
-    <w:p>
-      <w:pPr>
-        <w:ind w:left="-709" w:right="-568"/>
-        <w:rPr>
-          <w:rFonts w:ascii="Calibri" w:hAnsi="Calibri" w:cs="Arial"/>
-          <w:b/>
-          <w:bCs/>
-        </w:rPr>
-      </w:pPr>
-    </w:p>
-    <w:p>
-      <w:pPr>
-        <w:ind w:left="-709" w:right="-568"/>
-        <w:rPr>
-          <w:rFonts w:ascii="Calibri" w:hAnsi="Calibri" w:cs="Arial"/>
-          <w:b/>
-          <w:bCs/>
-        </w:rPr>
-      </w:pPr>
-    </w:p>
-    <w:p>
-      <w:pPr>
-        <w:ind w:left="-709" w:right="-568"/>
-        <w:rPr>
-          <w:rFonts w:ascii="Calibri" w:hAnsi="Calibri" w:cs="Arial"/>
-        </w:rPr>
-      </w:pPr>
-      <w:r>
-        <w:rPr>
-          <w:rFonts w:ascii="Calibri" w:hAnsi="Calibri" w:cs="Arial"/>
-          <w:b/>
-          <w:bCs/>
-        </w:rPr>
-        <w:t>Notes (and things to remember)</w:t>
-      </w:r>
-      <w:r>
-        <w:rPr>
-          <w:rFonts w:ascii="Calibri" w:hAnsi="Calibri" w:cs="Arial"/>
-        </w:rPr>
-        <w:t>:</w:t>
-      </w:r>
-    </w:p>
-    <w:p>
-      <w:pPr>
-        <w:ind w:left="-709" w:right="-568"/>
-        <w:rPr>
-          <w:rFonts w:ascii="Calibri" w:hAnsi="Calibri" w:cs="Arial"/>
-        </w:rPr>
-      </w:pPr>
-    </w:p>
-    <w:p>
-      <w:pPr>
-        <w:spacing w:line="480" w:lineRule="auto"/>
-        <w:ind w:left="-709" w:right="-568"/>
-        <w:rPr>
-          <w:rFonts w:ascii="Calibri" w:hAnsi="Calibri" w:cs="Arial"/>
-        </w:rPr>
-      </w:pPr>
-      <w:r>
-        <w:rPr>
-          <w:rFonts w:ascii="Calibri" w:hAnsi="Calibri" w:cs="Arial"/>
-        </w:rPr>
-        <w:t xml:space="preserve">Have </w:t>
-      </w:r>
-      <w:r>
-        <w:rPr>
-          <w:rFonts w:ascii="Calibri" w:hAnsi="Calibri" w:cs="Arial"/>
-        </w:rPr>
-        <w:t>users be able to register and log in</w:t>
-      </w:r>
-    </w:p>
-    <w:p>
-      <w:pPr>
-        <w:spacing w:line="480" w:lineRule="auto"/>
-        <w:ind w:left="-709" w:right="-568"/>
-        <w:rPr>
-          <w:rFonts w:ascii="Calibri" w:hAnsi="Calibri" w:cs="Arial"/>
-        </w:rPr>
-      </w:pPr>
-      <w:r>
-        <w:rPr>
-          <w:rFonts w:ascii="Calibri" w:hAnsi="Calibri" w:cs="Arial"/>
-        </w:rPr>
-        <w:t>Made the popouts for each vinyl</w:t>
-      </w:r>
-    </w:p>
-    <w:p>
-      <w:pPr>
-        <w:spacing w:line="480" w:lineRule="auto"/>
-        <w:ind w:left="-709" w:right="-568"/>
-        <w:rPr>
-          <w:rFonts w:ascii="Calibri" w:hAnsi="Calibri" w:cs="Arial"/>
-        </w:rPr>
-      </w:pPr>
-      <w:r>
-        <w:rPr>
-          <w:rFonts w:ascii="Calibri" w:hAnsi="Calibri" w:cs="Arial"/>
-        </w:rPr>
-        <w:t>________________________________________________________________________________</w:t>
-      </w:r>
-    </w:p>
-    <w:p>
-      <w:pPr>
-        <w:spacing w:line="480" w:lineRule="auto"/>
-        <w:ind w:left="-709" w:right="-568"/>
-        <w:rPr>
-          <w:rFonts w:ascii="Calibri" w:hAnsi="Calibri" w:cs="Arial"/>
-        </w:rPr>
-      </w:pPr>
-      <w:r>
-        <w:rPr>
-          <w:rFonts w:ascii="Calibri" w:hAnsi="Calibri" w:cs="Arial"/>
-        </w:rPr>
-        <w:t>________________________________________________________________________________</w:t>
-      </w:r>
-    </w:p>
-    <w:p>
-      <w:pPr>
-        <w:spacing w:line="480" w:lineRule="auto"/>
-        <w:ind w:left="-709" w:right="-568"/>
-        <w:rPr>
-          <w:rFonts w:ascii="Calibri" w:hAnsi="Calibri" w:cs="Arial"/>
-        </w:rPr>
-      </w:pPr>
-      <w:r>
-        <w:rPr>
-          <w:rFonts w:ascii="Calibri" w:hAnsi="Calibri" w:cs="Arial"/>
-        </w:rPr>
-        <w:t>________________________________________________________________________________</w:t>
-      </w:r>
-    </w:p>
-    <w:p>
-      <w:pPr>
-        <w:spacing w:line="480" w:lineRule="auto"/>
-        <w:ind w:left="-709" w:right="-568"/>
-        <w:rPr>
-          <w:rFonts w:ascii="Calibri" w:hAnsi="Calibri" w:cs="Arial"/>
-        </w:rPr>
-      </w:pPr>
-      <w:r>
-        <w:rPr>
-          <w:rFonts w:ascii="Calibri" w:hAnsi="Calibri" w:cs="Arial"/>
-        </w:rPr>
-        <w:t>________________________________________________________________________________</w:t>
-      </w:r>
-    </w:p>
-    <w:p>
-      <w:pPr>
-        <w:spacing w:line="480" w:lineRule="auto"/>
-        <w:ind w:left="-709" w:right="-568"/>
-        <w:rPr>
-          <w:rFonts w:ascii="Calibri" w:hAnsi="Calibri" w:cs="Arial"/>
-        </w:rPr>
-      </w:pPr>
-      <w:r>
-        <w:rPr>
-          <w:rFonts w:ascii="Calibri" w:hAnsi="Calibri" w:cs="Arial"/>
-        </w:rPr>
         <w:t>________________________________________________________________________________</w:t>
       </w:r>
     </w:p>
@@ -4580,150 +4279,52 @@
         <w:rPr>
           <w:rFonts w:ascii="Calibri" w:hAnsi="Calibri" w:cs="Arial"/>
         </w:rPr>
-        <w:t>________________________________________________________________________________</w:t>
-      </w:r>
-    </w:p>
-    <w:p>
-      <w:pPr>
-        <w:spacing w:line="480" w:lineRule="auto"/>
-        <w:ind w:left="-709" w:right="-568"/>
-        <w:rPr>
-          <w:rFonts w:ascii="Calibri" w:hAnsi="Calibri" w:cs="Arial"/>
-        </w:rPr>
-      </w:pPr>
-      <w:r>
-        <w:rPr>
-          <w:rFonts w:ascii="Calibri" w:hAnsi="Calibri" w:cs="Arial"/>
-        </w:rPr>
-        <w:t>________________________________________________________________________________</w:t>
-      </w:r>
-    </w:p>
-    <w:p>
-      <w:pPr>
-        <w:spacing w:line="480" w:lineRule="auto"/>
-        <w:ind w:left="-709" w:right="-568"/>
-        <w:rPr>
-          <w:rFonts w:ascii="Calibri" w:hAnsi="Calibri" w:cs="Arial"/>
-        </w:rPr>
-      </w:pPr>
-      <w:r>
-        <w:rPr>
-          <w:rFonts w:ascii="Calibri" w:hAnsi="Calibri" w:cs="Arial"/>
-        </w:rPr>
-        <w:lastRenderedPageBreak/>
-        <w:t>________________________________________________________________________________</w:t>
-      </w:r>
-    </w:p>
-    <w:p>
-      <w:pPr>
-        <w:spacing w:line="480" w:lineRule="auto"/>
-        <w:ind w:left="-709" w:right="-568"/>
-        <w:rPr>
-          <w:rFonts w:ascii="Calibri" w:hAnsi="Calibri" w:cs="Arial"/>
-        </w:rPr>
-      </w:pPr>
-      <w:r>
-        <w:rPr>
-          <w:rFonts w:ascii="Calibri" w:hAnsi="Calibri" w:cs="Arial"/>
-        </w:rPr>
-        <w:t>________________________________________________________________________________</w:t>
-      </w:r>
-    </w:p>
-    <w:p>
-      <w:pPr>
-        <w:spacing w:line="480" w:lineRule="auto"/>
-        <w:ind w:left="-709" w:right="-568"/>
-        <w:rPr>
-          <w:rFonts w:ascii="Calibri" w:hAnsi="Calibri" w:cs="Arial"/>
-        </w:rPr>
-      </w:pPr>
-      <w:r>
-        <w:rPr>
-          <w:rFonts w:ascii="Calibri" w:hAnsi="Calibri" w:cs="Arial"/>
-        </w:rPr>
-        <w:t>________________________________________________________________________________</w:t>
-      </w:r>
-    </w:p>
-    <w:p>
-      <w:pPr>
-        <w:spacing w:line="480" w:lineRule="auto"/>
-        <w:ind w:left="-709" w:right="-568"/>
-        <w:rPr>
-          <w:rFonts w:ascii="Calibri" w:hAnsi="Calibri" w:cs="Arial"/>
-        </w:rPr>
-      </w:pPr>
-      <w:r>
-        <w:rPr>
-          <w:rFonts w:ascii="Calibri" w:hAnsi="Calibri" w:cs="Arial"/>
-        </w:rPr>
-        <w:t>________________________________________________________________________________</w:t>
-      </w:r>
-    </w:p>
-    <w:p>
-      <w:pPr>
-        <w:spacing w:line="480" w:lineRule="auto"/>
-        <w:ind w:left="-709" w:right="-568"/>
-        <w:rPr>
-          <w:rFonts w:ascii="Calibri" w:hAnsi="Calibri" w:cs="Arial"/>
-        </w:rPr>
-      </w:pPr>
-      <w:r>
-        <w:rPr>
-          <w:rFonts w:ascii="Calibri" w:hAnsi="Calibri" w:cs="Arial"/>
-        </w:rPr>
-        <w:t>________________________________________________________________________________</w:t>
-      </w:r>
-    </w:p>
-    <w:p>
-      <w:pPr>
-        <w:spacing w:line="480" w:lineRule="auto"/>
-        <w:ind w:left="-709" w:right="-568"/>
-        <w:rPr>
-          <w:rFonts w:ascii="Calibri" w:hAnsi="Calibri" w:cs="Arial"/>
-        </w:rPr>
-      </w:pPr>
-      <w:r>
-        <w:rPr>
-          <w:rFonts w:ascii="Calibri" w:hAnsi="Calibri" w:cs="Arial"/>
-        </w:rPr>
-        <w:t>________________________________________________________________________________</w:t>
-      </w:r>
-    </w:p>
-    <w:p>
-      <w:pPr>
-        <w:spacing w:line="480" w:lineRule="auto"/>
-        <w:ind w:left="-709" w:right="-568"/>
-        <w:rPr>
-          <w:rFonts w:ascii="Calibri" w:hAnsi="Calibri" w:cs="Arial"/>
-        </w:rPr>
-      </w:pPr>
-      <w:r>
-        <w:rPr>
-          <w:rFonts w:ascii="Calibri" w:hAnsi="Calibri" w:cs="Arial"/>
-        </w:rPr>
-        <w:t>________________________________________________________________________________</w:t>
-      </w:r>
-    </w:p>
-    <w:p>
-      <w:pPr>
-        <w:spacing w:line="480" w:lineRule="auto"/>
-        <w:ind w:left="-709" w:right="-568"/>
-        <w:rPr>
-          <w:rFonts w:ascii="Calibri" w:hAnsi="Calibri" w:cs="Arial"/>
-        </w:rPr>
-      </w:pPr>
-      <w:r>
-        <w:rPr>
-          <w:rFonts w:ascii="Calibri" w:hAnsi="Calibri" w:cs="Arial"/>
-        </w:rPr>
-        <w:t>________________________________________________________________________________</w:t>
-      </w:r>
-    </w:p>
-    <w:p>
-      <w:pPr>
-        <w:ind w:left="-709" w:right="-568"/>
-        <w:rPr>
-          <w:rFonts w:ascii="Calibri" w:hAnsi="Calibri" w:cs="Arial"/>
+        <w:t>Had the progress report submitted</w:t>
+      </w:r>
+      <w:r>
+        <w:rPr>
+          <w:rFonts w:ascii="Calibri" w:hAnsi="Calibri" w:cs="Arial"/>
+        </w:rPr>
+        <w:t>.</w:t>
+      </w:r>
+    </w:p>
+    <w:p>
+      <w:pPr>
+        <w:spacing w:line="480" w:lineRule="auto"/>
+        <w:ind w:left="-709" w:right="-568"/>
+        <w:rPr>
+          <w:rFonts w:ascii="Calibri" w:hAnsi="Calibri" w:cs="Arial"/>
+        </w:rPr>
+      </w:pPr>
+      <w:r>
+        <w:rPr>
+          <w:rFonts w:ascii="Calibri" w:hAnsi="Calibri" w:cs="Arial"/>
+        </w:rPr>
+        <w:t>Other than that, I was away in Dublin for a concert and didn’t really work on anything for the week.</w:t>
+      </w:r>
+    </w:p>
+    <w:p>
+      <w:pPr>
+        <w:spacing w:line="480" w:lineRule="auto"/>
+        <w:ind w:left="-709" w:right="-568"/>
+        <w:rPr>
+          <w:rFonts w:ascii="Calibri" w:hAnsi="Calibri" w:cs="Arial"/>
+        </w:rPr>
+      </w:pPr>
+      <w:r>
+        <w:rPr>
+          <w:rFonts w:ascii="Calibri" w:hAnsi="Calibri" w:cs="Arial"/>
+        </w:rPr>
+        <w:t>Also very terrible at remembering to fill this diary out, apologies.</w:t>
+      </w:r>
+    </w:p>
+    <w:p>
+      <w:pPr>
+        <w:ind w:left="-709" w:right="-568"/>
+        <w:rPr>
+          <w:rFonts w:ascii="Calibri" w:hAnsi="Calibri" w:cs="Arial"/>
+          <w:b/>
+          <w:bCs/>
         </w:rPr>
       </w:pPr>
     </w:p>
@@ -4935,7 +4536,43 @@
         <w:rPr>
           <w:rFonts w:ascii="Calibri" w:hAnsi="Calibri" w:cs="Arial"/>
         </w:rPr>
-        <w:t>_______________________________________    _______________________________________</w:t>
+        <w:t xml:space="preserve">Aleksandra Skarzycka </w:t>
+      </w:r>
+      <w:r>
+        <w:rPr>
+          <w:rFonts w:ascii="Calibri" w:hAnsi="Calibri" w:cs="Arial"/>
+        </w:rPr>
+        <w:t>25/02/26</w:t>
+      </w:r>
+      <w:r>
+        <w:rPr>
+          <w:rFonts w:ascii="Calibri" w:hAnsi="Calibri" w:cs="Arial"/>
+        </w:rPr>
+        <w:t xml:space="preserve">    </w:t>
+      </w:r>
+      <w:r>
+        <w:rPr>
+          <w:rFonts w:ascii="Calibri" w:hAnsi="Calibri" w:cs="Arial"/>
+        </w:rPr>
+        <w:tab/>
+      </w:r>
+      <w:r>
+        <w:rPr>
+          <w:rFonts w:ascii="Calibri" w:hAnsi="Calibri" w:cs="Arial"/>
+        </w:rPr>
+        <w:tab/>
+      </w:r>
+      <w:r>
+        <w:rPr>
+          <w:rFonts w:ascii="Calibri" w:hAnsi="Calibri" w:cs="Arial"/>
+        </w:rPr>
+        <w:tab/>
+      </w:r>
+      <w:r>
+        <w:rPr>
+          <w:rFonts w:ascii="Calibri" w:hAnsi="Calibri" w:cs="Arial"/>
+        </w:rPr>
+        <w:tab/>
       </w:r>
     </w:p>
     <w:p>
@@ -5067,7 +4704,15 @@
           <w:sz w:val="28"/>
           <w:szCs w:val="28"/>
         </w:rPr>
-        <w:t>: ______________________________</w:t>
+        <w:t xml:space="preserve">: </w:t>
+      </w:r>
+      <w:r>
+        <w:rPr>
+          <w:rFonts w:ascii="Calibri" w:hAnsi="Calibri" w:cs="Arial"/>
+          <w:sz w:val="28"/>
+          <w:szCs w:val="28"/>
+        </w:rPr>
+        <w:t>09/02/26</w:t>
       </w:r>
     </w:p>
     <w:p>
@@ -5135,143 +4780,105 @@
         <w:rPr>
           <w:rFonts w:ascii="Calibri" w:hAnsi="Calibri" w:cs="Arial"/>
         </w:rPr>
-        <w:t>________________________________________________________________________________</w:t>
-      </w:r>
-    </w:p>
-    <w:p>
-      <w:pPr>
-        <w:spacing w:line="480" w:lineRule="auto"/>
-        <w:ind w:left="-709" w:right="-568"/>
-        <w:rPr>
-          <w:rFonts w:ascii="Calibri" w:hAnsi="Calibri" w:cs="Arial"/>
-        </w:rPr>
-      </w:pPr>
-      <w:r>
-        <w:rPr>
-          <w:rFonts w:ascii="Calibri" w:hAnsi="Calibri" w:cs="Arial"/>
-        </w:rPr>
-        <w:t>________________________________________________________________________________</w:t>
-      </w:r>
-    </w:p>
-    <w:p>
-      <w:pPr>
-        <w:spacing w:line="480" w:lineRule="auto"/>
-        <w:ind w:left="-709" w:right="-568"/>
-        <w:rPr>
-          <w:rFonts w:ascii="Calibri" w:hAnsi="Calibri" w:cs="Arial"/>
-        </w:rPr>
-      </w:pPr>
-      <w:r>
-        <w:rPr>
-          <w:rFonts w:ascii="Calibri" w:hAnsi="Calibri" w:cs="Arial"/>
-        </w:rPr>
-        <w:t>________________________________________________________________________________</w:t>
-      </w:r>
-    </w:p>
-    <w:p>
-      <w:pPr>
-        <w:spacing w:line="480" w:lineRule="auto"/>
-        <w:ind w:left="-709" w:right="-568"/>
-        <w:rPr>
-          <w:rFonts w:ascii="Calibri" w:hAnsi="Calibri" w:cs="Arial"/>
-        </w:rPr>
-      </w:pPr>
+        <w:t xml:space="preserve">Worked on getting modal pop ups to work for each vinyl so when you click on them it opens up to my personal </w:t>
+      </w:r>
       <w:r>
         <w:rPr>
           <w:rFonts w:ascii="Calibri" w:hAnsi="Calibri" w:cs="Arial"/>
         </w:rPr>
         <w:lastRenderedPageBreak/>
-        <w:t>________________________________________________________________________________</w:t>
-      </w:r>
-    </w:p>
-    <w:p>
-      <w:pPr>
-        <w:spacing w:line="480" w:lineRule="auto"/>
-        <w:ind w:left="-709" w:right="-568"/>
-        <w:rPr>
-          <w:rFonts w:ascii="Calibri" w:hAnsi="Calibri" w:cs="Arial"/>
-        </w:rPr>
-      </w:pPr>
-      <w:r>
-        <w:rPr>
-          <w:rFonts w:ascii="Calibri" w:hAnsi="Calibri" w:cs="Arial"/>
-        </w:rPr>
-        <w:t>________________________________________________________________________________</w:t>
-      </w:r>
-    </w:p>
-    <w:p>
-      <w:pPr>
-        <w:spacing w:line="480" w:lineRule="auto"/>
-        <w:ind w:left="-709" w:right="-568"/>
-        <w:rPr>
-          <w:rFonts w:ascii="Calibri" w:hAnsi="Calibri" w:cs="Arial"/>
-        </w:rPr>
-      </w:pPr>
-      <w:r>
-        <w:rPr>
-          <w:rFonts w:ascii="Calibri" w:hAnsi="Calibri" w:cs="Arial"/>
-        </w:rPr>
-        <w:t>________________________________________________________________________________</w:t>
-      </w:r>
-    </w:p>
-    <w:p>
-      <w:pPr>
-        <w:spacing w:line="480" w:lineRule="auto"/>
-        <w:ind w:left="-709" w:right="-568"/>
-        <w:rPr>
-          <w:rFonts w:ascii="Calibri" w:hAnsi="Calibri" w:cs="Arial"/>
-        </w:rPr>
-      </w:pPr>
-      <w:r>
-        <w:rPr>
-          <w:rFonts w:ascii="Calibri" w:hAnsi="Calibri" w:cs="Arial"/>
-        </w:rPr>
-        <w:t>________________________________________________________________________________</w:t>
-      </w:r>
-    </w:p>
-    <w:p>
-      <w:pPr>
-        <w:spacing w:line="480" w:lineRule="auto"/>
-        <w:ind w:left="-709" w:right="-568"/>
-        <w:rPr>
-          <w:rFonts w:ascii="Calibri" w:hAnsi="Calibri" w:cs="Arial"/>
-        </w:rPr>
-      </w:pPr>
-      <w:r>
-        <w:rPr>
-          <w:rFonts w:ascii="Calibri" w:hAnsi="Calibri" w:cs="Arial"/>
-        </w:rPr>
-        <w:t>________________________________________________________________________________</w:t>
-      </w:r>
-    </w:p>
-    <w:p>
-      <w:pPr>
-        <w:spacing w:line="480" w:lineRule="auto"/>
-        <w:ind w:left="-709" w:right="-568"/>
-        <w:rPr>
-          <w:rFonts w:ascii="Calibri" w:hAnsi="Calibri" w:cs="Arial"/>
-        </w:rPr>
-      </w:pPr>
-      <w:r>
-        <w:rPr>
-          <w:rFonts w:ascii="Calibri" w:hAnsi="Calibri" w:cs="Arial"/>
-        </w:rPr>
-        <w:t>________________________________________________________________________________</w:t>
-      </w:r>
-    </w:p>
-    <w:p>
-      <w:pPr>
-        <w:spacing w:line="480" w:lineRule="auto"/>
-        <w:ind w:left="-709" w:right="-568"/>
-        <w:rPr>
-          <w:rFonts w:ascii="Calibri" w:hAnsi="Calibri" w:cs="Arial"/>
-        </w:rPr>
-      </w:pPr>
-      <w:r>
-        <w:rPr>
-          <w:rFonts w:ascii="Calibri" w:hAnsi="Calibri" w:cs="Arial"/>
-        </w:rPr>
-        <w:t>________________________________________________________________________________</w:t>
+        <w:t xml:space="preserve">thoughts on each, with a vinyl picture and </w:t>
+      </w:r>
+      <w:r>
+        <w:rPr>
+          <w:rFonts w:ascii="Calibri" w:hAnsi="Calibri" w:cs="Arial"/>
+        </w:rPr>
+        <w:t>Spotify</w:t>
+      </w:r>
+      <w:r>
+        <w:rPr>
+          <w:rFonts w:ascii="Calibri" w:hAnsi="Calibri" w:cs="Arial"/>
+        </w:rPr>
+        <w:t xml:space="preserve"> album embed so people can listen to snippets</w:t>
+      </w:r>
+      <w:r>
+        <w:rPr>
+          <w:rFonts w:ascii="Calibri" w:hAnsi="Calibri" w:cs="Arial"/>
+        </w:rPr>
+        <w:t xml:space="preserve"> (only for first 2 I believe)</w:t>
+      </w:r>
+      <w:r>
+        <w:rPr>
+          <w:rFonts w:ascii="Calibri" w:hAnsi="Calibri" w:cs="Arial"/>
+        </w:rPr>
+        <w:t>.</w:t>
+      </w:r>
+    </w:p>
+    <w:p>
+      <w:pPr>
+        <w:spacing w:line="480" w:lineRule="auto"/>
+        <w:ind w:left="-709" w:right="-568"/>
+        <w:rPr>
+          <w:rFonts w:ascii="Calibri" w:hAnsi="Calibri" w:cs="Arial"/>
+        </w:rPr>
+      </w:pPr>
+      <w:r>
+        <w:rPr>
+          <w:rFonts w:ascii="Calibri" w:hAnsi="Calibri" w:cs="Arial"/>
+        </w:rPr>
+        <w:t>Once I got that working, I placed in placeholder images and text so I can work out the layout inside the modals.</w:t>
+      </w:r>
+    </w:p>
+    <w:p>
+      <w:pPr>
+        <w:spacing w:line="480" w:lineRule="auto"/>
+        <w:ind w:left="-709" w:right="-568"/>
+        <w:rPr>
+          <w:rFonts w:ascii="Calibri" w:hAnsi="Calibri" w:cs="Arial"/>
+        </w:rPr>
+      </w:pPr>
+      <w:r>
+        <w:rPr>
+          <w:rFonts w:ascii="Calibri" w:hAnsi="Calibri" w:cs="Arial"/>
+        </w:rPr>
+        <w:t>During reading week</w:t>
+      </w:r>
+      <w:r>
+        <w:rPr>
+          <w:rFonts w:ascii="Calibri" w:hAnsi="Calibri" w:cs="Arial"/>
+        </w:rPr>
+        <w:t xml:space="preserve"> on the 19</w:t>
+      </w:r>
+      <w:r>
+        <w:rPr>
+          <w:rFonts w:ascii="Calibri" w:hAnsi="Calibri" w:cs="Arial"/>
+          <w:vertAlign w:val="superscript"/>
+        </w:rPr>
+        <w:t>th</w:t>
+      </w:r>
+      <w:r>
+        <w:rPr>
+          <w:rFonts w:ascii="Calibri" w:hAnsi="Calibri" w:cs="Arial"/>
+        </w:rPr>
+        <w:t xml:space="preserve"> I believe, I reworked the code after the meeting with my supervisor as I was told there was an easier way with the database after I </w:t>
+      </w:r>
+      <w:r>
+        <w:rPr>
+          <w:rFonts w:ascii="Calibri" w:hAnsi="Calibri" w:cs="Arial"/>
+        </w:rPr>
+        <w:t>worked it out, so there is much less code and it’s so much neater and understandable.</w:t>
+      </w:r>
+      <w:r>
+        <w:rPr>
+          <w:rFonts w:ascii="Calibri" w:hAnsi="Calibri" w:cs="Arial"/>
+        </w:rPr>
+        <w:t xml:space="preserve"> I then also just made colour changes, font changes</w:t>
+      </w:r>
+      <w:r>
+        <w:rPr>
+          <w:rFonts w:ascii="Calibri" w:hAnsi="Calibri" w:cs="Arial"/>
+        </w:rPr>
+        <w:t>, and had to rework the modals so it could work through the database too.</w:t>
       </w:r>
     </w:p>
     <w:p>
@@ -5344,7 +4951,7 @@
         <w:rPr>
           <w:rFonts w:ascii="Calibri" w:hAnsi="Calibri" w:cs="Arial"/>
         </w:rPr>
-        <w:t>________________________________________________________________________________</w:t>
+        <w:t>Get registration done after all thoughts are filled out on each vinyl</w:t>
       </w:r>
     </w:p>
     <w:p>
@@ -5490,7 +5097,37 @@
         <w:rPr>
           <w:rFonts w:ascii="Calibri" w:hAnsi="Calibri" w:cs="Arial"/>
         </w:rPr>
-        <w:t>_______________________________________    _______________________________________</w:t>
+        <w:t>Aleksandra Skarzycka 25/02/26</w:t>
+      </w:r>
+      <w:r>
+        <w:rPr>
+          <w:rFonts w:ascii="Calibri" w:hAnsi="Calibri" w:cs="Arial"/>
+        </w:rPr>
+        <w:t xml:space="preserve">    </w:t>
+      </w:r>
+      <w:r>
+        <w:rPr>
+          <w:rFonts w:ascii="Calibri" w:hAnsi="Calibri" w:cs="Arial"/>
+        </w:rPr>
+        <w:tab/>
+      </w:r>
+      <w:r>
+        <w:rPr>
+          <w:rFonts w:ascii="Calibri" w:hAnsi="Calibri" w:cs="Arial"/>
+        </w:rPr>
+        <w:tab/>
+      </w:r>
+      <w:r>
+        <w:rPr>
+          <w:rFonts w:ascii="Calibri" w:hAnsi="Calibri" w:cs="Arial"/>
+        </w:rPr>
+        <w:tab/>
+      </w:r>
+      <w:r>
+        <w:rPr>
+          <w:rFonts w:ascii="Calibri" w:hAnsi="Calibri" w:cs="Arial"/>
+        </w:rPr>
+        <w:tab/>
       </w:r>
     </w:p>
     <w:p>
@@ -5622,7 +5259,15 @@
           <w:sz w:val="28"/>
           <w:szCs w:val="28"/>
         </w:rPr>
-        <w:t>: ______________________________</w:t>
+        <w:t xml:space="preserve">: </w:t>
+      </w:r>
+      <w:r>
+        <w:rPr>
+          <w:rFonts w:ascii="Calibri" w:hAnsi="Calibri" w:cs="Arial"/>
+          <w:sz w:val="28"/>
+          <w:szCs w:val="28"/>
+        </w:rPr>
+        <w:t>23/02/26</w:t>
       </w:r>
     </w:p>
     <w:p>
@@ -5690,152 +5335,77 @@
         <w:rPr>
           <w:rFonts w:ascii="Calibri" w:hAnsi="Calibri" w:cs="Arial"/>
         </w:rPr>
-        <w:t>________________________________________________________________________________</w:t>
-      </w:r>
-    </w:p>
-    <w:p>
-      <w:pPr>
-        <w:spacing w:line="480" w:lineRule="auto"/>
-        <w:ind w:left="-709" w:right="-568"/>
-        <w:rPr>
-          <w:rFonts w:ascii="Calibri" w:hAnsi="Calibri" w:cs="Arial"/>
-        </w:rPr>
-      </w:pPr>
-      <w:r>
-        <w:rPr>
-          <w:rFonts w:ascii="Calibri" w:hAnsi="Calibri" w:cs="Arial"/>
-        </w:rPr>
-        <w:t>________________________________________________________________________________</w:t>
-      </w:r>
-    </w:p>
-    <w:p>
-      <w:pPr>
-        <w:spacing w:line="480" w:lineRule="auto"/>
-        <w:ind w:left="-709" w:right="-568"/>
-        <w:rPr>
-          <w:rFonts w:ascii="Calibri" w:hAnsi="Calibri" w:cs="Arial"/>
-        </w:rPr>
-      </w:pPr>
-      <w:r>
-        <w:rPr>
-          <w:rFonts w:ascii="Calibri" w:hAnsi="Calibri" w:cs="Arial"/>
-        </w:rPr>
-        <w:t>________________________________________________________________________________</w:t>
-      </w:r>
-    </w:p>
-    <w:p>
-      <w:pPr>
-        <w:spacing w:line="480" w:lineRule="auto"/>
-        <w:ind w:left="-709" w:right="-568"/>
-        <w:rPr>
-          <w:rFonts w:ascii="Calibri" w:hAnsi="Calibri" w:cs="Arial"/>
-        </w:rPr>
-      </w:pPr>
-      <w:r>
-        <w:rPr>
-          <w:rFonts w:ascii="Calibri" w:hAnsi="Calibri" w:cs="Arial"/>
-        </w:rPr>
-        <w:t>________________________________________________________________________________</w:t>
-      </w:r>
-    </w:p>
-    <w:p>
-      <w:pPr>
-        <w:spacing w:line="480" w:lineRule="auto"/>
-        <w:ind w:left="-709" w:right="-568"/>
-        <w:rPr>
-          <w:rFonts w:ascii="Calibri" w:hAnsi="Calibri" w:cs="Arial"/>
-        </w:rPr>
-      </w:pPr>
+        <w:t xml:space="preserve">Set up the new modal layouts and tweaked </w:t>
+      </w:r>
+      <w:r>
+        <w:rPr>
+          <w:rFonts w:ascii="Calibri" w:hAnsi="Calibri" w:cs="Arial"/>
+        </w:rPr>
+        <w:t xml:space="preserve">the fonts for inside the modals. Also changed the fonts for the titles again as well at the banners, </w:t>
+      </w:r>
+      <w:r>
+        <w:rPr>
+          <w:rFonts w:ascii="Calibri" w:hAnsi="Calibri" w:cs="Arial"/>
+        </w:rPr>
+        <w:t>I grew to dislike the scribble-like font as I didn’t think it would suit as well as the old colours.</w:t>
+      </w:r>
+      <w:r>
+        <w:rPr>
+          <w:rFonts w:ascii="Calibri" w:hAnsi="Calibri" w:cs="Arial"/>
+        </w:rPr>
+        <w:t xml:space="preserve"> I will be removing the </w:t>
+      </w:r>
+      <w:r>
+        <w:rPr>
+          <w:rFonts w:ascii="Calibri" w:hAnsi="Calibri" w:cs="Arial"/>
+        </w:rPr>
+        <w:t xml:space="preserve">unused </w:t>
+      </w:r>
+      <w:r>
+        <w:rPr>
+          <w:rFonts w:ascii="Calibri" w:hAnsi="Calibri" w:cs="Arial"/>
+        </w:rPr>
+        <w:t xml:space="preserve">fonts </w:t>
+      </w:r>
+      <w:r>
+        <w:rPr>
+          <w:rFonts w:ascii="Calibri" w:hAnsi="Calibri" w:cs="Arial"/>
+        </w:rPr>
+        <w:t>after I finally decide which ones are definitely staying.</w:t>
+      </w:r>
+    </w:p>
+    <w:p>
+      <w:pPr>
+        <w:ind w:left="-709" w:right="-568"/>
+        <w:rPr>
+          <w:rFonts w:ascii="Calibri" w:hAnsi="Calibri" w:cs="Arial"/>
+        </w:rPr>
+      </w:pPr>
+      <w:r>
+        <w:rPr>
+          <w:rFonts w:ascii="Calibri" w:hAnsi="Calibri" w:cs="Arial"/>
+        </w:rPr>
+        <w:t>Placed in each album embed for each vinyl, and up until Gemini Rights all thoughts have been placed in so far.</w:t>
+      </w:r>
+      <w:r>
+        <w:rPr>
+          <w:rFonts w:ascii="Calibri" w:hAnsi="Calibri" w:cs="Arial"/>
+        </w:rPr>
+        <w:t xml:space="preserve"> Still </w:t>
+      </w:r>
       <w:r>
         <w:rPr>
           <w:rFonts w:ascii="Calibri" w:hAnsi="Calibri" w:cs="Arial"/>
         </w:rPr>
         <w:lastRenderedPageBreak/>
-        <w:t>________________________________________________________________________________</w:t>
-      </w:r>
-    </w:p>
-    <w:p>
-      <w:pPr>
-        <w:spacing w:line="480" w:lineRule="auto"/>
-        <w:ind w:left="-709" w:right="-568"/>
-        <w:rPr>
-          <w:rFonts w:ascii="Calibri" w:hAnsi="Calibri" w:cs="Arial"/>
-        </w:rPr>
-      </w:pPr>
-      <w:r>
-        <w:rPr>
-          <w:rFonts w:ascii="Calibri" w:hAnsi="Calibri" w:cs="Arial"/>
-        </w:rPr>
-        <w:t>________________________________________________________________________________</w:t>
-      </w:r>
-    </w:p>
-    <w:p>
-      <w:pPr>
-        <w:spacing w:line="480" w:lineRule="auto"/>
-        <w:ind w:left="-709" w:right="-568"/>
-        <w:rPr>
-          <w:rFonts w:ascii="Calibri" w:hAnsi="Calibri" w:cs="Arial"/>
-        </w:rPr>
-      </w:pPr>
-      <w:r>
-        <w:rPr>
-          <w:rFonts w:ascii="Calibri" w:hAnsi="Calibri" w:cs="Arial"/>
-        </w:rPr>
-        <w:t>________________________________________________________________________________</w:t>
-      </w:r>
-    </w:p>
-    <w:p>
-      <w:pPr>
-        <w:spacing w:line="480" w:lineRule="auto"/>
-        <w:ind w:left="-709" w:right="-568"/>
-        <w:rPr>
-          <w:rFonts w:ascii="Calibri" w:hAnsi="Calibri" w:cs="Arial"/>
-        </w:rPr>
-      </w:pPr>
-      <w:r>
-        <w:rPr>
-          <w:rFonts w:ascii="Calibri" w:hAnsi="Calibri" w:cs="Arial"/>
-        </w:rPr>
-        <w:t>________________________________________________________________________________</w:t>
-      </w:r>
-    </w:p>
-    <w:p>
-      <w:pPr>
-        <w:spacing w:line="480" w:lineRule="auto"/>
-        <w:ind w:left="-709" w:right="-568"/>
-        <w:rPr>
-          <w:rFonts w:ascii="Calibri" w:hAnsi="Calibri" w:cs="Arial"/>
-        </w:rPr>
-      </w:pPr>
-      <w:r>
-        <w:rPr>
-          <w:rFonts w:ascii="Calibri" w:hAnsi="Calibri" w:cs="Arial"/>
-        </w:rPr>
-        <w:t>________________________________________________________________________________</w:t>
-      </w:r>
-    </w:p>
-    <w:p>
-      <w:pPr>
-        <w:spacing w:line="480" w:lineRule="auto"/>
-        <w:ind w:left="-709" w:right="-568"/>
-        <w:rPr>
-          <w:rFonts w:ascii="Calibri" w:hAnsi="Calibri" w:cs="Arial"/>
-        </w:rPr>
-      </w:pPr>
-      <w:r>
-        <w:rPr>
-          <w:rFonts w:ascii="Calibri" w:hAnsi="Calibri" w:cs="Arial"/>
-        </w:rPr>
-        <w:t>________________________________________________________________________________</w:t>
-      </w:r>
-    </w:p>
-    <w:p>
-      <w:pPr>
-        <w:ind w:left="-709" w:right="-568"/>
-        <w:rPr>
-          <w:rFonts w:ascii="Calibri" w:hAnsi="Calibri" w:cs="Arial"/>
-        </w:rPr>
-      </w:pPr>
+        <w:t>working with the same images</w:t>
+      </w:r>
+      <w:r>
+        <w:rPr>
+          <w:rFonts w:ascii="Calibri" w:hAnsi="Calibri" w:cs="Arial"/>
+        </w:rPr>
+        <w:t xml:space="preserve"> as the cover, not a priority to switch them to my own vinyl until I get the important features done.</w:t>
+      </w:r>
     </w:p>
     <w:p>
       <w:pPr>
@@ -5899,7 +5469,7 @@
         <w:rPr>
           <w:rFonts w:ascii="Calibri" w:hAnsi="Calibri" w:cs="Arial"/>
         </w:rPr>
-        <w:t>________________________________________________________________________________</w:t>
+        <w:t>REGISTRATION FOR USERS!!!</w:t>
       </w:r>
     </w:p>
     <w:p>
@@ -6320,7 +5890,6 @@
         <w:rPr>
           <w:rFonts w:ascii="Calibri" w:hAnsi="Calibri" w:cs="Arial"/>
         </w:rPr>
-        <w:lastRenderedPageBreak/>
         <w:t>________________________________________________________________________________</w:t>
       </w:r>
     </w:p>
@@ -6890,7 +6459,6 @@
         <w:rPr>
           <w:rFonts w:ascii="Calibri" w:hAnsi="Calibri" w:cs="Arial"/>
         </w:rPr>
-        <w:lastRenderedPageBreak/>
         <w:t>________________________________________________________________________________</w:t>
       </w:r>
     </w:p>
@@ -7460,7 +7028,6 @@
         <w:rPr>
           <w:rFonts w:ascii="Calibri" w:hAnsi="Calibri" w:cs="Arial"/>
         </w:rPr>
-        <w:lastRenderedPageBreak/>
         <w:t>________________________________________________________________________________</w:t>
       </w:r>
     </w:p>
@@ -8027,7 +7594,6 @@
         <w:rPr>
           <w:rFonts w:ascii="Calibri" w:hAnsi="Calibri" w:cs="Arial"/>
         </w:rPr>
-        <w:lastRenderedPageBreak/>
         <w:t>________________________________________________________________________________</w:t>
       </w:r>
     </w:p>
@@ -8585,7 +8151,6 @@
         <w:rPr>
           <w:rFonts w:ascii="Calibri" w:hAnsi="Calibri" w:cs="Arial"/>
         </w:rPr>
-        <w:lastRenderedPageBreak/>
         <w:t>________________________________________________________________________________</w:t>
       </w:r>
     </w:p>
@@ -9144,7 +8709,6 @@
         <w:rPr>
           <w:rFonts w:ascii="Calibri" w:hAnsi="Calibri" w:cs="Arial"/>
         </w:rPr>
-        <w:lastRenderedPageBreak/>
         <w:t>________________________________________________________________________________</w:t>
       </w:r>
     </w:p>
@@ -9677,58 +9241,58 @@
         <w:rPr>
           <w:rFonts w:ascii="Calibri" w:hAnsi="Calibri" w:cs="Arial"/>
         </w:rPr>
+        <w:t>________________________________________________________________________________</w:t>
+      </w:r>
+    </w:p>
+    <w:p>
+      <w:pPr>
+        <w:spacing w:line="480" w:lineRule="auto"/>
+        <w:ind w:left="-709" w:right="-568"/>
+        <w:rPr>
+          <w:rFonts w:ascii="Calibri" w:hAnsi="Calibri" w:cs="Arial"/>
+        </w:rPr>
+      </w:pPr>
+      <w:r>
+        <w:rPr>
+          <w:rFonts w:ascii="Calibri" w:hAnsi="Calibri" w:cs="Arial"/>
+        </w:rPr>
+        <w:t>_________________________________________________</w:t>
+      </w:r>
+      <w:r>
+        <w:rPr>
+          <w:rFonts w:ascii="Calibri" w:hAnsi="Calibri" w:cs="Arial"/>
+        </w:rPr>
+        <w:t>_______________________________</w:t>
+      </w:r>
+    </w:p>
+    <w:p>
+      <w:pPr>
+        <w:spacing w:line="480" w:lineRule="auto"/>
+        <w:ind w:left="-709" w:right="-568"/>
+        <w:rPr>
+          <w:rFonts w:ascii="Calibri" w:hAnsi="Calibri" w:cs="Arial"/>
+        </w:rPr>
+      </w:pPr>
+      <w:r>
+        <w:rPr>
+          <w:rFonts w:ascii="Calibri" w:hAnsi="Calibri" w:cs="Arial"/>
+        </w:rPr>
+        <w:t>________________________________________________________________________________</w:t>
+      </w:r>
+    </w:p>
+    <w:p>
+      <w:pPr>
+        <w:spacing w:line="480" w:lineRule="auto"/>
+        <w:ind w:left="-709" w:right="-568"/>
+        <w:rPr>
+          <w:rFonts w:ascii="Calibri" w:hAnsi="Calibri" w:cs="Arial"/>
+        </w:rPr>
+      </w:pPr>
+      <w:r>
+        <w:rPr>
+          <w:rFonts w:ascii="Calibri" w:hAnsi="Calibri" w:cs="Arial"/>
+        </w:rPr>
         <w:lastRenderedPageBreak/>
-        <w:t>________________________________________________________________________________</w:t>
-      </w:r>
-    </w:p>
-    <w:p>
-      <w:pPr>
-        <w:spacing w:line="480" w:lineRule="auto"/>
-        <w:ind w:left="-709" w:right="-568"/>
-        <w:rPr>
-          <w:rFonts w:ascii="Calibri" w:hAnsi="Calibri" w:cs="Arial"/>
-        </w:rPr>
-      </w:pPr>
-      <w:r>
-        <w:rPr>
-          <w:rFonts w:ascii="Calibri" w:hAnsi="Calibri" w:cs="Arial"/>
-        </w:rPr>
-        <w:t>_________________________________________________</w:t>
-      </w:r>
-      <w:r>
-        <w:rPr>
-          <w:rFonts w:ascii="Calibri" w:hAnsi="Calibri" w:cs="Arial"/>
-        </w:rPr>
-        <w:t>_______________________________</w:t>
-      </w:r>
-    </w:p>
-    <w:p>
-      <w:pPr>
-        <w:spacing w:line="480" w:lineRule="auto"/>
-        <w:ind w:left="-709" w:right="-568"/>
-        <w:rPr>
-          <w:rFonts w:ascii="Calibri" w:hAnsi="Calibri" w:cs="Arial"/>
-        </w:rPr>
-      </w:pPr>
-      <w:r>
-        <w:rPr>
-          <w:rFonts w:ascii="Calibri" w:hAnsi="Calibri" w:cs="Arial"/>
-        </w:rPr>
-        <w:t>________________________________________________________________________________</w:t>
-      </w:r>
-    </w:p>
-    <w:p>
-      <w:pPr>
-        <w:spacing w:line="480" w:lineRule="auto"/>
-        <w:ind w:left="-709" w:right="-568"/>
-        <w:rPr>
-          <w:rFonts w:ascii="Calibri" w:hAnsi="Calibri" w:cs="Arial"/>
-        </w:rPr>
-      </w:pPr>
-      <w:r>
-        <w:rPr>
-          <w:rFonts w:ascii="Calibri" w:hAnsi="Calibri" w:cs="Arial"/>
-        </w:rPr>
         <w:t>________________________________________________________________________________</w:t>
       </w:r>
     </w:p>

</xml_diff>

<commit_message>
Added files now oops
</commit_message>
<xml_diff>
--- a/1-Diary2026.docx
+++ b/1-Diary2026.docx
@@ -1,6 +1,6 @@
 
 <file path=word/document.xml><?xml version="1.0" encoding="utf-8"?>
-<w:document xmlns:wpc="http://schemas.microsoft.com/office/word/2010/wordprocessingCanvas" xmlns:cx="http://schemas.microsoft.com/office/drawing/2014/chartex" xmlns:cx1="http://schemas.microsoft.com/office/drawing/2015/9/8/chartex" xmlns:cx2="http://schemas.microsoft.com/office/drawing/2015/10/21/chartex" xmlns:cx3="http://schemas.microsoft.com/office/drawing/2016/5/9/chartex" xmlns:cx4="http://schemas.microsoft.com/office/drawing/2016/5/10/chartex" xmlns:cx5="http://schemas.microsoft.com/office/drawing/2016/5/11/chartex" xmlns:cx6="http://schemas.microsoft.com/office/drawing/2016/5/12/chartex" xmlns:cx7="http://schemas.microsoft.com/office/drawing/2016/5/13/chartex" xmlns:cx8="http://schemas.microsoft.com/office/drawing/2016/5/14/chartex" xmlns:mc="http://schemas.openxmlformats.org/markup-compatibility/2006" xmlns:aink="http://schemas.microsoft.com/office/drawing/2016/ink" xmlns:am3d="http://schemas.microsoft.com/office/drawing/2017/model3d" xmlns:o="urn:schemas-microsoft-com:office:office" xmlns:r="http://schemas.openxmlformats.org/officeDocument/2006/relationships" xmlns:m="http://schemas.openxmlformats.org/officeDocument/2006/math" xmlns:v="urn:schemas-microsoft-com:vml" xmlns:wp14="http://schemas.microsoft.com/office/word/2010/wordprocessingDrawing" xmlns:wp="http://schemas.openxmlformats.org/drawingml/2006/wordprocessingDrawing" xmlns:w10="urn:schemas-microsoft-com:office:word" xmlns:w="http://schemas.openxmlformats.org/wordprocessingml/2006/main" xmlns:w14="http://schemas.microsoft.com/office/word/2010/wordml" xmlns:w15="http://schemas.microsoft.com/office/word/2012/wordml" xmlns:w16cex="http://schemas.microsoft.com/office/word/2018/wordml/cex" xmlns:w16cid="http://schemas.microsoft.com/office/word/2016/wordml/cid" xmlns:w16="http://schemas.microsoft.com/office/word/2018/wordml" xmlns:w16sdtdh="http://schemas.microsoft.com/office/word/2020/wordml/sdtdatahash" xmlns:w16se="http://schemas.microsoft.com/office/word/2015/wordml/symex" xmlns:wpg="http://schemas.microsoft.com/office/word/2010/wordprocessingGroup" xmlns:wpi="http://schemas.microsoft.com/office/word/2010/wordprocessingInk" xmlns:wne="http://schemas.microsoft.com/office/word/2006/wordml" xmlns:wps="http://schemas.microsoft.com/office/word/2010/wordprocessingShape" mc:Ignorable="w14 w15 w16se w16cid w16 w16cex w16sdtdh wp14">
+<w:document xmlns:wpc="http://schemas.microsoft.com/office/word/2010/wordprocessingCanvas" xmlns:cx="http://schemas.microsoft.com/office/drawing/2014/chartex" xmlns:cx1="http://schemas.microsoft.com/office/drawing/2015/9/8/chartex" xmlns:cx2="http://schemas.microsoft.com/office/drawing/2015/10/21/chartex" xmlns:cx3="http://schemas.microsoft.com/office/drawing/2016/5/9/chartex" xmlns:cx4="http://schemas.microsoft.com/office/drawing/2016/5/10/chartex" xmlns:cx5="http://schemas.microsoft.com/office/drawing/2016/5/11/chartex" xmlns:cx6="http://schemas.microsoft.com/office/drawing/2016/5/12/chartex" xmlns:cx7="http://schemas.microsoft.com/office/drawing/2016/5/13/chartex" xmlns:cx8="http://schemas.microsoft.com/office/drawing/2016/5/14/chartex" xmlns:mc="http://schemas.openxmlformats.org/markup-compatibility/2006" xmlns:aink="http://schemas.microsoft.com/office/drawing/2016/ink" xmlns:am3d="http://schemas.microsoft.com/office/drawing/2017/model3d" xmlns:o="urn:schemas-microsoft-com:office:office" xmlns:oel="http://schemas.microsoft.com/office/2019/extlst" xmlns:r="http://schemas.openxmlformats.org/officeDocument/2006/relationships" xmlns:m="http://schemas.openxmlformats.org/officeDocument/2006/math" xmlns:v="urn:schemas-microsoft-com:vml" xmlns:wp14="http://schemas.microsoft.com/office/word/2010/wordprocessingDrawing" xmlns:wp="http://schemas.openxmlformats.org/drawingml/2006/wordprocessingDrawing" xmlns:w10="urn:schemas-microsoft-com:office:word" xmlns:w="http://schemas.openxmlformats.org/wordprocessingml/2006/main" xmlns:w14="http://schemas.microsoft.com/office/word/2010/wordml" xmlns:w15="http://schemas.microsoft.com/office/word/2012/wordml" xmlns:w16cex="http://schemas.microsoft.com/office/word/2018/wordml/cex" xmlns:w16cid="http://schemas.microsoft.com/office/word/2016/wordml/cid" xmlns:w16="http://schemas.microsoft.com/office/word/2018/wordml" xmlns:w16du="http://schemas.microsoft.com/office/word/2023/wordml/word16du" xmlns:w16sdtdh="http://schemas.microsoft.com/office/word/2020/wordml/sdtdatahash" xmlns:w16sdtfl="http://schemas.microsoft.com/office/word/2024/wordml/sdtformatlock" xmlns:w16se="http://schemas.microsoft.com/office/word/2015/wordml/symex" xmlns:wpg="http://schemas.microsoft.com/office/word/2010/wordprocessingGroup" xmlns:wpi="http://schemas.microsoft.com/office/word/2010/wordprocessingInk" xmlns:wne="http://schemas.microsoft.com/office/word/2006/wordml" xmlns:wps="http://schemas.microsoft.com/office/word/2010/wordprocessingShape" mc:Ignorable="w14 w15 w16se w16cid w16 w16cex w16sdtdh w16sdtfl w16du wp14">
   <w:background w:color="FFFFFF"/>
   <w:body>
     <w:p>
@@ -1260,6 +1260,7 @@
         </w:rPr>
         <w:t xml:space="preserve">work done so far, work you still </w:t>
       </w:r>
+      <w:proofErr w:type="gramStart"/>
       <w:r>
         <w:rPr>
           <w:rFonts w:ascii="Calibri" w:hAnsi="Calibri" w:cs="Calibri"/>
@@ -1271,7 +1272,14 @@
         <w:rPr>
           <w:rFonts w:ascii="Calibri" w:hAnsi="Calibri" w:cs="Calibri"/>
         </w:rPr>
-        <w:t xml:space="preserve">to do, </w:t>
+        <w:t>to</w:t>
+      </w:r>
+      <w:proofErr w:type="gramEnd"/>
+      <w:r>
+        <w:rPr>
+          <w:rFonts w:ascii="Calibri" w:hAnsi="Calibri" w:cs="Calibri"/>
+        </w:rPr>
+        <w:t xml:space="preserve"> do, </w:t>
       </w:r>
       <w:r>
         <w:rPr>
@@ -1444,12 +1452,21 @@
         </w:rPr>
         <w:t>D</w:t>
       </w:r>
+      <w:proofErr w:type="spellStart"/>
       <w:r>
         <w:rPr>
           <w:rFonts w:ascii="Calibri" w:hAnsi="Calibri" w:cs="Calibri"/>
           <w:iCs/>
         </w:rPr>
-        <w:t xml:space="preserve">etailed instructions </w:t>
+        <w:t>etailed</w:t>
+      </w:r>
+      <w:proofErr w:type="spellEnd"/>
+      <w:r>
+        <w:rPr>
+          <w:rFonts w:ascii="Calibri" w:hAnsi="Calibri" w:cs="Calibri"/>
+          <w:iCs/>
+        </w:rPr>
+        <w:t xml:space="preserve"> instructions </w:t>
       </w:r>
       <w:r>
         <w:rPr>
@@ -2865,7 +2882,21 @@
         <w:rPr>
           <w:rFonts w:ascii="Calibri" w:hAnsi="Calibri" w:cs="Arial"/>
         </w:rPr>
-        <w:t>Created my project proposal and submit it. Supervisors assigned next week.</w:t>
+        <w:t xml:space="preserve">Created my project proposal and submit it. Supervisors </w:t>
+      </w:r>
+      <w:proofErr w:type="gramStart"/>
+      <w:r>
+        <w:rPr>
+          <w:rFonts w:ascii="Calibri" w:hAnsi="Calibri" w:cs="Arial"/>
+        </w:rPr>
+        <w:t>assigned</w:t>
+      </w:r>
+      <w:proofErr w:type="gramEnd"/>
+      <w:r>
+        <w:rPr>
+          <w:rFonts w:ascii="Calibri" w:hAnsi="Calibri" w:cs="Arial"/>
+        </w:rPr>
+        <w:t xml:space="preserve"> next week.</w:t>
       </w:r>
     </w:p>
     <w:p>
@@ -3321,7 +3352,21 @@
         <w:rPr>
           <w:rFonts w:ascii="Calibri" w:hAnsi="Calibri" w:cs="Arial"/>
         </w:rPr>
-        <w:t>Created and submit Deliverable 1; made a project plan and timeline, identified available time and resources, identified personal skill level, described my target audience and intended platform and proposed a basic outline site map with a moodboard.</w:t>
+        <w:t xml:space="preserve">Created and submit Deliverable 1; made a project plan and timeline, identified available time and resources, identified personal skill level, described my target audience and intended platform and proposed a basic outline site map with a </w:t>
+      </w:r>
+      <w:proofErr w:type="spellStart"/>
+      <w:r>
+        <w:rPr>
+          <w:rFonts w:ascii="Calibri" w:hAnsi="Calibri" w:cs="Arial"/>
+        </w:rPr>
+        <w:t>moodboard</w:t>
+      </w:r>
+      <w:proofErr w:type="spellEnd"/>
+      <w:r>
+        <w:rPr>
+          <w:rFonts w:ascii="Calibri" w:hAnsi="Calibri" w:cs="Arial"/>
+        </w:rPr>
+        <w:t>.</w:t>
       </w:r>
     </w:p>
     <w:p>
@@ -4311,11 +4356,19 @@
           <w:rFonts w:ascii="Calibri" w:hAnsi="Calibri" w:cs="Arial"/>
         </w:rPr>
       </w:pPr>
-      <w:r>
-        <w:rPr>
-          <w:rFonts w:ascii="Calibri" w:hAnsi="Calibri" w:cs="Arial"/>
-        </w:rPr>
-        <w:t>Also very terrible at remembering to fill this diary out, apologies.</w:t>
+      <w:proofErr w:type="gramStart"/>
+      <w:r>
+        <w:rPr>
+          <w:rFonts w:ascii="Calibri" w:hAnsi="Calibri" w:cs="Arial"/>
+        </w:rPr>
+        <w:t>Also</w:t>
+      </w:r>
+      <w:proofErr w:type="gramEnd"/>
+      <w:r>
+        <w:rPr>
+          <w:rFonts w:ascii="Calibri" w:hAnsi="Calibri" w:cs="Arial"/>
+        </w:rPr>
+        <w:t xml:space="preserve"> very terrible at remembering to fill this diary out, apologies.</w:t>
       </w:r>
     </w:p>
     <w:p>
@@ -4780,7 +4833,21 @@
         <w:rPr>
           <w:rFonts w:ascii="Calibri" w:hAnsi="Calibri" w:cs="Arial"/>
         </w:rPr>
-        <w:t xml:space="preserve">Worked on getting modal pop ups to work for each vinyl so when you click on them it opens up to my personal </w:t>
+        <w:t xml:space="preserve">Worked on getting modal pop ups to work for each vinyl so when you click on them it </w:t>
+      </w:r>
+      <w:proofErr w:type="gramStart"/>
+      <w:r>
+        <w:rPr>
+          <w:rFonts w:ascii="Calibri" w:hAnsi="Calibri" w:cs="Arial"/>
+        </w:rPr>
+        <w:t>opens up</w:t>
+      </w:r>
+      <w:proofErr w:type="gramEnd"/>
+      <w:r>
+        <w:rPr>
+          <w:rFonts w:ascii="Calibri" w:hAnsi="Calibri" w:cs="Arial"/>
+        </w:rPr>
+        <w:t xml:space="preserve"> to my personal </w:t>
       </w:r>
       <w:r>
         <w:rPr>
@@ -5371,7 +5438,21 @@
         <w:rPr>
           <w:rFonts w:ascii="Calibri" w:hAnsi="Calibri" w:cs="Arial"/>
         </w:rPr>
-        <w:t>after I finally decide which ones are definitely staying.</w:t>
+        <w:t xml:space="preserve">after I finally decide which ones are </w:t>
+      </w:r>
+      <w:proofErr w:type="gramStart"/>
+      <w:r>
+        <w:rPr>
+          <w:rFonts w:ascii="Calibri" w:hAnsi="Calibri" w:cs="Arial"/>
+        </w:rPr>
+        <w:t>definitely staying</w:t>
+      </w:r>
+      <w:proofErr w:type="gramEnd"/>
+      <w:r>
+        <w:rPr>
+          <w:rFonts w:ascii="Calibri" w:hAnsi="Calibri" w:cs="Arial"/>
+        </w:rPr>
+        <w:t>.</w:t>
       </w:r>
     </w:p>
     <w:p>
@@ -5864,6 +5945,63 @@
           <w:rFonts w:ascii="Calibri" w:hAnsi="Calibri" w:cs="Arial"/>
         </w:rPr>
       </w:pPr>
+    </w:p>
+    <w:p>
+      <w:pPr>
+        <w:spacing w:line="480" w:lineRule="auto"/>
+        <w:ind w:left="-709" w:right="-568"/>
+        <w:rPr>
+          <w:rFonts w:ascii="Calibri" w:hAnsi="Calibri" w:cs="Arial"/>
+        </w:rPr>
+      </w:pPr>
+    </w:p>
+    <w:p>
+      <w:pPr>
+        <w:spacing w:line="480" w:lineRule="auto"/>
+        <w:ind w:left="-709" w:right="-568"/>
+        <w:rPr>
+          <w:rFonts w:ascii="Calibri" w:hAnsi="Calibri" w:cs="Arial"/>
+        </w:rPr>
+      </w:pPr>
+    </w:p>
+    <w:p>
+      <w:pPr>
+        <w:ind w:left="-709" w:right="-568"/>
+        <w:rPr>
+          <w:rFonts w:ascii="Calibri" w:hAnsi="Calibri" w:cs="Arial"/>
+        </w:rPr>
+      </w:pPr>
+      <w:r>
+        <w:rPr>
+          <w:rFonts w:ascii="Calibri" w:hAnsi="Calibri" w:cs="Arial"/>
+          <w:b/>
+          <w:bCs/>
+        </w:rPr>
+        <w:t>Notes (and things to remember)</w:t>
+      </w:r>
+      <w:r>
+        <w:rPr>
+          <w:rFonts w:ascii="Calibri" w:hAnsi="Calibri" w:cs="Arial"/>
+        </w:rPr>
+        <w:t>:</w:t>
+      </w:r>
+    </w:p>
+    <w:p>
+      <w:pPr>
+        <w:ind w:left="-709" w:right="-568"/>
+        <w:rPr>
+          <w:rFonts w:ascii="Calibri" w:hAnsi="Calibri" w:cs="Arial"/>
+        </w:rPr>
+      </w:pPr>
+    </w:p>
+    <w:p>
+      <w:pPr>
+        <w:spacing w:line="480" w:lineRule="auto"/>
+        <w:ind w:left="-709" w:right="-568"/>
+        <w:rPr>
+          <w:rFonts w:ascii="Calibri" w:hAnsi="Calibri" w:cs="Arial"/>
+        </w:rPr>
+      </w:pPr>
       <w:r>
         <w:rPr>
           <w:rFonts w:ascii="Calibri" w:hAnsi="Calibri" w:cs="Arial"/>
@@ -5943,6 +6081,7 @@
         <w:rPr>
           <w:rFonts w:ascii="Calibri" w:hAnsi="Calibri" w:cs="Arial"/>
         </w:rPr>
+        <w:lastRenderedPageBreak/>
         <w:t>________________________________________________________________________________</w:t>
       </w:r>
     </w:p>
@@ -5963,76 +6102,28 @@
     </w:p>
     <w:p>
       <w:pPr>
-        <w:spacing w:line="480" w:lineRule="auto"/>
-        <w:ind w:left="-709" w:right="-568"/>
-        <w:rPr>
-          <w:rFonts w:ascii="Calibri" w:hAnsi="Calibri" w:cs="Arial"/>
-        </w:rPr>
-      </w:pPr>
-      <w:r>
-        <w:rPr>
-          <w:rFonts w:ascii="Calibri" w:hAnsi="Calibri" w:cs="Arial"/>
-        </w:rPr>
-        <w:t>________________________________________________________________________________</w:t>
-      </w:r>
-    </w:p>
-    <w:p>
-      <w:pPr>
-        <w:spacing w:line="480" w:lineRule="auto"/>
-        <w:ind w:left="-709" w:right="-568"/>
-        <w:rPr>
-          <w:rFonts w:ascii="Calibri" w:hAnsi="Calibri" w:cs="Arial"/>
-        </w:rPr>
-      </w:pPr>
-      <w:r>
-        <w:rPr>
-          <w:rFonts w:ascii="Calibri" w:hAnsi="Calibri" w:cs="Arial"/>
-        </w:rPr>
-        <w:t>________________________________________________________________________________</w:t>
-      </w:r>
-    </w:p>
-    <w:p>
-      <w:pPr>
-        <w:ind w:left="-709" w:right="-568"/>
-        <w:rPr>
-          <w:rFonts w:ascii="Calibri" w:hAnsi="Calibri" w:cs="Arial"/>
-        </w:rPr>
-      </w:pPr>
-    </w:p>
-    <w:p>
-      <w:pPr>
-        <w:ind w:left="-709" w:right="-568"/>
-        <w:rPr>
-          <w:rFonts w:ascii="Calibri" w:hAnsi="Calibri" w:cs="Arial"/>
-          <w:b/>
-          <w:bCs/>
-        </w:rPr>
-      </w:pPr>
-    </w:p>
-    <w:p>
-      <w:pPr>
-        <w:ind w:left="-709" w:right="-568"/>
-        <w:rPr>
-          <w:rFonts w:ascii="Calibri" w:hAnsi="Calibri" w:cs="Arial"/>
-          <w:b/>
-          <w:bCs/>
-        </w:rPr>
-      </w:pPr>
-    </w:p>
-    <w:p>
-      <w:pPr>
-        <w:ind w:left="-709" w:right="-568"/>
-        <w:rPr>
-          <w:rFonts w:ascii="Calibri" w:hAnsi="Calibri" w:cs="Arial"/>
-        </w:rPr>
-      </w:pPr>
-      <w:r>
-        <w:rPr>
-          <w:rFonts w:ascii="Calibri" w:hAnsi="Calibri" w:cs="Arial"/>
-          <w:b/>
-          <w:bCs/>
-        </w:rPr>
-        <w:t>Notes (and things to remember)</w:t>
+        <w:ind w:left="-709" w:right="-568"/>
+        <w:rPr>
+          <w:rFonts w:ascii="Calibri" w:hAnsi="Calibri" w:cs="Arial"/>
+          <w:b/>
+          <w:bCs/>
+        </w:rPr>
+      </w:pPr>
+    </w:p>
+    <w:p>
+      <w:pPr>
+        <w:ind w:left="-709" w:right="-568"/>
+        <w:rPr>
+          <w:rFonts w:ascii="Calibri" w:hAnsi="Calibri" w:cs="Arial"/>
+        </w:rPr>
+      </w:pPr>
+      <w:r>
+        <w:rPr>
+          <w:rFonts w:ascii="Calibri" w:hAnsi="Calibri" w:cs="Arial"/>
+          <w:b/>
+          <w:bCs/>
+        </w:rPr>
+        <w:t>Signed (and dated)</w:t>
       </w:r>
       <w:r>
         <w:rPr>
@@ -6051,163 +6142,48 @@
     </w:p>
     <w:p>
       <w:pPr>
-        <w:spacing w:line="480" w:lineRule="auto"/>
-        <w:ind w:left="-709" w:right="-568"/>
-        <w:rPr>
-          <w:rFonts w:ascii="Calibri" w:hAnsi="Calibri" w:cs="Arial"/>
-        </w:rPr>
-      </w:pPr>
-      <w:r>
-        <w:rPr>
-          <w:rFonts w:ascii="Calibri" w:hAnsi="Calibri" w:cs="Arial"/>
-        </w:rPr>
-        <w:t>________________________________________________________________________________</w:t>
-      </w:r>
-    </w:p>
-    <w:p>
-      <w:pPr>
-        <w:spacing w:line="480" w:lineRule="auto"/>
-        <w:ind w:left="-709" w:right="-568"/>
-        <w:rPr>
-          <w:rFonts w:ascii="Calibri" w:hAnsi="Calibri" w:cs="Arial"/>
-        </w:rPr>
-      </w:pPr>
-      <w:r>
-        <w:rPr>
-          <w:rFonts w:ascii="Calibri" w:hAnsi="Calibri" w:cs="Arial"/>
-        </w:rPr>
-        <w:t>________________________________________________________________________________</w:t>
-      </w:r>
-    </w:p>
-    <w:p>
-      <w:pPr>
-        <w:spacing w:line="480" w:lineRule="auto"/>
-        <w:ind w:left="-709" w:right="-568"/>
-        <w:rPr>
-          <w:rFonts w:ascii="Calibri" w:hAnsi="Calibri" w:cs="Arial"/>
-        </w:rPr>
-      </w:pPr>
-      <w:r>
-        <w:rPr>
-          <w:rFonts w:ascii="Calibri" w:hAnsi="Calibri" w:cs="Arial"/>
-        </w:rPr>
-        <w:t>________________________________________________________________________________</w:t>
-      </w:r>
-    </w:p>
-    <w:p>
-      <w:pPr>
-        <w:spacing w:line="480" w:lineRule="auto"/>
-        <w:ind w:left="-709" w:right="-568"/>
-        <w:rPr>
-          <w:rFonts w:ascii="Calibri" w:hAnsi="Calibri" w:cs="Arial"/>
-        </w:rPr>
-      </w:pPr>
-      <w:r>
-        <w:rPr>
-          <w:rFonts w:ascii="Calibri" w:hAnsi="Calibri" w:cs="Arial"/>
-        </w:rPr>
-        <w:t>________________________________________________________________________________</w:t>
-      </w:r>
-    </w:p>
-    <w:p>
-      <w:pPr>
-        <w:spacing w:line="480" w:lineRule="auto"/>
-        <w:ind w:left="-709" w:right="-568"/>
-        <w:rPr>
-          <w:rFonts w:ascii="Calibri" w:hAnsi="Calibri" w:cs="Arial"/>
-        </w:rPr>
-      </w:pPr>
-      <w:r>
-        <w:rPr>
-          <w:rFonts w:ascii="Calibri" w:hAnsi="Calibri" w:cs="Arial"/>
-        </w:rPr>
-        <w:t>________________________________________________________________________________</w:t>
-      </w:r>
-    </w:p>
-    <w:p>
-      <w:pPr>
-        <w:spacing w:line="480" w:lineRule="auto"/>
-        <w:ind w:left="-709" w:right="-568"/>
-        <w:rPr>
-          <w:rFonts w:ascii="Calibri" w:hAnsi="Calibri" w:cs="Arial"/>
-        </w:rPr>
-      </w:pPr>
-      <w:r>
-        <w:rPr>
-          <w:rFonts w:ascii="Calibri" w:hAnsi="Calibri" w:cs="Arial"/>
-        </w:rPr>
-        <w:t>________________________________________________________________________________</w:t>
-      </w:r>
-    </w:p>
-    <w:p>
-      <w:pPr>
-        <w:spacing w:line="480" w:lineRule="auto"/>
-        <w:ind w:left="-709" w:right="-568"/>
-        <w:rPr>
-          <w:rFonts w:ascii="Calibri" w:hAnsi="Calibri" w:cs="Arial"/>
-        </w:rPr>
-      </w:pPr>
-      <w:r>
-        <w:rPr>
-          <w:rFonts w:ascii="Calibri" w:hAnsi="Calibri" w:cs="Arial"/>
-        </w:rPr>
-        <w:t>________________________________________________________________________________</w:t>
-      </w:r>
-    </w:p>
-    <w:p>
-      <w:pPr>
-        <w:ind w:left="-709" w:right="-568"/>
-        <w:rPr>
-          <w:rFonts w:ascii="Calibri" w:hAnsi="Calibri" w:cs="Arial"/>
-          <w:b/>
-          <w:bCs/>
-        </w:rPr>
-      </w:pPr>
-    </w:p>
-    <w:p>
-      <w:pPr>
-        <w:ind w:left="-709" w:right="-568"/>
-        <w:rPr>
-          <w:rFonts w:ascii="Calibri" w:hAnsi="Calibri" w:cs="Arial"/>
-        </w:rPr>
-      </w:pPr>
-      <w:r>
-        <w:rPr>
-          <w:rFonts w:ascii="Calibri" w:hAnsi="Calibri" w:cs="Arial"/>
-          <w:b/>
-          <w:bCs/>
-        </w:rPr>
-        <w:t>Signed (and dated)</w:t>
-      </w:r>
-      <w:r>
-        <w:rPr>
-          <w:rFonts w:ascii="Calibri" w:hAnsi="Calibri" w:cs="Arial"/>
-        </w:rPr>
-        <w:t>:</w:t>
-      </w:r>
-    </w:p>
-    <w:p>
-      <w:pPr>
-        <w:ind w:left="-709" w:right="-568"/>
-        <w:rPr>
-          <w:rFonts w:ascii="Calibri" w:hAnsi="Calibri" w:cs="Arial"/>
-        </w:rPr>
-      </w:pPr>
-    </w:p>
-    <w:p>
-      <w:pPr>
-        <w:ind w:left="-709" w:right="-568"/>
-        <w:rPr>
-          <w:rFonts w:ascii="Calibri" w:hAnsi="Calibri" w:cs="Arial"/>
-          <w:b/>
-          <w:bCs/>
-        </w:rPr>
-      </w:pPr>
-      <w:r>
-        <w:rPr>
-          <w:rFonts w:ascii="Calibri" w:hAnsi="Calibri" w:cs="Arial"/>
-        </w:rPr>
-        <w:t>_______________________________________    _______________________________________</w:t>
+        <w:ind w:left="-709" w:right="-568"/>
+        <w:rPr>
+          <w:rFonts w:ascii="Calibri" w:hAnsi="Calibri" w:cs="Arial"/>
+          <w:b/>
+          <w:bCs/>
+        </w:rPr>
+      </w:pPr>
+      <w:r>
+        <w:rPr>
+          <w:rFonts w:ascii="Calibri" w:hAnsi="Calibri" w:cs="Arial"/>
+        </w:rPr>
+        <w:t>Aleksandra Skarzycka 23/04/26</w:t>
+      </w:r>
+      <w:r>
+        <w:rPr>
+          <w:rFonts w:ascii="Calibri" w:hAnsi="Calibri" w:cs="Arial"/>
+        </w:rPr>
+        <w:t xml:space="preserve">   </w:t>
+      </w:r>
+      <w:r>
+        <w:rPr>
+          <w:rFonts w:ascii="Calibri" w:hAnsi="Calibri" w:cs="Arial"/>
+        </w:rPr>
+        <w:tab/>
+      </w:r>
+      <w:r>
+        <w:rPr>
+          <w:rFonts w:ascii="Calibri" w:hAnsi="Calibri" w:cs="Arial"/>
+        </w:rPr>
+        <w:tab/>
+      </w:r>
+      <w:r>
+        <w:rPr>
+          <w:rFonts w:ascii="Calibri" w:hAnsi="Calibri" w:cs="Arial"/>
+        </w:rPr>
+        <w:tab/>
+      </w:r>
+      <w:r>
+        <w:rPr>
+          <w:rFonts w:ascii="Calibri" w:hAnsi="Calibri" w:cs="Arial"/>
+        </w:rPr>
+        <w:tab/>
       </w:r>
     </w:p>
     <w:p>
@@ -6339,7 +6315,15 @@
           <w:sz w:val="28"/>
           <w:szCs w:val="28"/>
         </w:rPr>
-        <w:t>: ______________________________</w:t>
+        <w:t xml:space="preserve">: </w:t>
+      </w:r>
+      <w:r>
+        <w:rPr>
+          <w:rFonts w:ascii="Calibri" w:hAnsi="Calibri" w:cs="Arial"/>
+          <w:sz w:val="28"/>
+          <w:szCs w:val="28"/>
+        </w:rPr>
+        <w:t>09/03/26</w:t>
       </w:r>
     </w:p>
     <w:p>
@@ -6407,6 +6391,93 @@
         <w:rPr>
           <w:rFonts w:ascii="Calibri" w:hAnsi="Calibri" w:cs="Arial"/>
         </w:rPr>
+        <w:t xml:space="preserve">Started the process of adding in registration/login for users, prepared and added in needed routes following a </w:t>
+      </w:r>
+      <w:proofErr w:type="spellStart"/>
+      <w:r>
+        <w:rPr>
+          <w:rFonts w:ascii="Calibri" w:hAnsi="Calibri" w:cs="Arial"/>
+        </w:rPr>
+        <w:t>Supabase</w:t>
+      </w:r>
+      <w:proofErr w:type="spellEnd"/>
+      <w:r>
+        <w:rPr>
+          <w:rFonts w:ascii="Calibri" w:hAnsi="Calibri" w:cs="Arial"/>
+        </w:rPr>
+        <w:t xml:space="preserve"> Doc.</w:t>
+      </w:r>
+    </w:p>
+    <w:p>
+      <w:pPr>
+        <w:ind w:left="-709" w:right="-568"/>
+        <w:rPr>
+          <w:rFonts w:ascii="Calibri" w:hAnsi="Calibri" w:cs="Arial"/>
+        </w:rPr>
+      </w:pPr>
+    </w:p>
+    <w:p>
+      <w:pPr>
+        <w:ind w:left="-709" w:right="-568"/>
+        <w:rPr>
+          <w:rFonts w:ascii="Calibri" w:hAnsi="Calibri" w:cs="Arial"/>
+          <w:b/>
+          <w:bCs/>
+        </w:rPr>
+      </w:pPr>
+    </w:p>
+    <w:p>
+      <w:pPr>
+        <w:ind w:left="-709" w:right="-568"/>
+        <w:rPr>
+          <w:rFonts w:ascii="Calibri" w:hAnsi="Calibri" w:cs="Arial"/>
+          <w:b/>
+          <w:bCs/>
+        </w:rPr>
+      </w:pPr>
+    </w:p>
+    <w:p>
+      <w:pPr>
+        <w:ind w:left="-709" w:right="-568"/>
+        <w:rPr>
+          <w:rFonts w:ascii="Calibri" w:hAnsi="Calibri" w:cs="Arial"/>
+        </w:rPr>
+      </w:pPr>
+      <w:r>
+        <w:rPr>
+          <w:rFonts w:ascii="Calibri" w:hAnsi="Calibri" w:cs="Arial"/>
+          <w:b/>
+          <w:bCs/>
+        </w:rPr>
+        <w:t>Notes (and things to remember)</w:t>
+      </w:r>
+      <w:r>
+        <w:rPr>
+          <w:rFonts w:ascii="Calibri" w:hAnsi="Calibri" w:cs="Arial"/>
+        </w:rPr>
+        <w:t>:</w:t>
+      </w:r>
+    </w:p>
+    <w:p>
+      <w:pPr>
+        <w:ind w:left="-709" w:right="-568"/>
+        <w:rPr>
+          <w:rFonts w:ascii="Calibri" w:hAnsi="Calibri" w:cs="Arial"/>
+        </w:rPr>
+      </w:pPr>
+    </w:p>
+    <w:p>
+      <w:pPr>
+        <w:spacing w:line="480" w:lineRule="auto"/>
+        <w:ind w:left="-709" w:right="-568"/>
+        <w:rPr>
+          <w:rFonts w:ascii="Calibri" w:hAnsi="Calibri" w:cs="Arial"/>
+        </w:rPr>
+      </w:pPr>
+      <w:r>
+        <w:rPr>
+          <w:rFonts w:ascii="Calibri" w:hAnsi="Calibri" w:cs="Arial"/>
+        </w:rPr>
         <w:t>________________________________________________________________________________</w:t>
       </w:r>
     </w:p>
@@ -6502,91 +6573,28 @@
     </w:p>
     <w:p>
       <w:pPr>
-        <w:spacing w:line="480" w:lineRule="auto"/>
-        <w:ind w:left="-709" w:right="-568"/>
-        <w:rPr>
-          <w:rFonts w:ascii="Calibri" w:hAnsi="Calibri" w:cs="Arial"/>
-        </w:rPr>
-      </w:pPr>
-      <w:r>
-        <w:rPr>
-          <w:rFonts w:ascii="Calibri" w:hAnsi="Calibri" w:cs="Arial"/>
-        </w:rPr>
-        <w:t>________________________________________________________________________________</w:t>
-      </w:r>
-    </w:p>
-    <w:p>
-      <w:pPr>
-        <w:spacing w:line="480" w:lineRule="auto"/>
-        <w:ind w:left="-709" w:right="-568"/>
-        <w:rPr>
-          <w:rFonts w:ascii="Calibri" w:hAnsi="Calibri" w:cs="Arial"/>
-        </w:rPr>
-      </w:pPr>
-      <w:r>
-        <w:rPr>
-          <w:rFonts w:ascii="Calibri" w:hAnsi="Calibri" w:cs="Arial"/>
-        </w:rPr>
-        <w:t>________________________________________________________________________________</w:t>
-      </w:r>
-    </w:p>
-    <w:p>
-      <w:pPr>
-        <w:spacing w:line="480" w:lineRule="auto"/>
-        <w:ind w:left="-709" w:right="-568"/>
-        <w:rPr>
-          <w:rFonts w:ascii="Calibri" w:hAnsi="Calibri" w:cs="Arial"/>
-        </w:rPr>
-      </w:pPr>
-      <w:r>
-        <w:rPr>
-          <w:rFonts w:ascii="Calibri" w:hAnsi="Calibri" w:cs="Arial"/>
-        </w:rPr>
-        <w:t>________________________________________________________________________________</w:t>
-      </w:r>
-    </w:p>
-    <w:p>
-      <w:pPr>
-        <w:ind w:left="-709" w:right="-568"/>
-        <w:rPr>
-          <w:rFonts w:ascii="Calibri" w:hAnsi="Calibri" w:cs="Arial"/>
-        </w:rPr>
-      </w:pPr>
-    </w:p>
-    <w:p>
-      <w:pPr>
-        <w:ind w:left="-709" w:right="-568"/>
-        <w:rPr>
-          <w:rFonts w:ascii="Calibri" w:hAnsi="Calibri" w:cs="Arial"/>
-          <w:b/>
-          <w:bCs/>
-        </w:rPr>
-      </w:pPr>
-    </w:p>
-    <w:p>
-      <w:pPr>
-        <w:ind w:left="-709" w:right="-568"/>
-        <w:rPr>
-          <w:rFonts w:ascii="Calibri" w:hAnsi="Calibri" w:cs="Arial"/>
-          <w:b/>
-          <w:bCs/>
-        </w:rPr>
-      </w:pPr>
-    </w:p>
-    <w:p>
-      <w:pPr>
-        <w:ind w:left="-709" w:right="-568"/>
-        <w:rPr>
-          <w:rFonts w:ascii="Calibri" w:hAnsi="Calibri" w:cs="Arial"/>
-        </w:rPr>
-      </w:pPr>
-      <w:r>
-        <w:rPr>
-          <w:rFonts w:ascii="Calibri" w:hAnsi="Calibri" w:cs="Arial"/>
-          <w:b/>
-          <w:bCs/>
-        </w:rPr>
-        <w:t>Notes (and things to remember)</w:t>
+        <w:ind w:left="-709" w:right="-568"/>
+        <w:rPr>
+          <w:rFonts w:ascii="Calibri" w:hAnsi="Calibri" w:cs="Arial"/>
+          <w:b/>
+          <w:bCs/>
+        </w:rPr>
+      </w:pPr>
+    </w:p>
+    <w:p>
+      <w:pPr>
+        <w:ind w:left="-709" w:right="-568"/>
+        <w:rPr>
+          <w:rFonts w:ascii="Calibri" w:hAnsi="Calibri" w:cs="Arial"/>
+        </w:rPr>
+      </w:pPr>
+      <w:r>
+        <w:rPr>
+          <w:rFonts w:ascii="Calibri" w:hAnsi="Calibri" w:cs="Arial"/>
+          <w:b/>
+          <w:bCs/>
+        </w:rPr>
+        <w:t>Signed (and dated)</w:t>
       </w:r>
       <w:r>
         <w:rPr>
@@ -6605,163 +6613,48 @@
     </w:p>
     <w:p>
       <w:pPr>
-        <w:spacing w:line="480" w:lineRule="auto"/>
-        <w:ind w:left="-709" w:right="-568"/>
-        <w:rPr>
-          <w:rFonts w:ascii="Calibri" w:hAnsi="Calibri" w:cs="Arial"/>
-        </w:rPr>
-      </w:pPr>
-      <w:r>
-        <w:rPr>
-          <w:rFonts w:ascii="Calibri" w:hAnsi="Calibri" w:cs="Arial"/>
-        </w:rPr>
-        <w:t>________________________________________________________________________________</w:t>
-      </w:r>
-    </w:p>
-    <w:p>
-      <w:pPr>
-        <w:spacing w:line="480" w:lineRule="auto"/>
-        <w:ind w:left="-709" w:right="-568"/>
-        <w:rPr>
-          <w:rFonts w:ascii="Calibri" w:hAnsi="Calibri" w:cs="Arial"/>
-        </w:rPr>
-      </w:pPr>
-      <w:r>
-        <w:rPr>
-          <w:rFonts w:ascii="Calibri" w:hAnsi="Calibri" w:cs="Arial"/>
-        </w:rPr>
-        <w:t>________________________________________________________________________________</w:t>
-      </w:r>
-    </w:p>
-    <w:p>
-      <w:pPr>
-        <w:spacing w:line="480" w:lineRule="auto"/>
-        <w:ind w:left="-709" w:right="-568"/>
-        <w:rPr>
-          <w:rFonts w:ascii="Calibri" w:hAnsi="Calibri" w:cs="Arial"/>
-        </w:rPr>
-      </w:pPr>
-      <w:r>
-        <w:rPr>
-          <w:rFonts w:ascii="Calibri" w:hAnsi="Calibri" w:cs="Arial"/>
-        </w:rPr>
-        <w:t>________________________________________________________________________________</w:t>
-      </w:r>
-    </w:p>
-    <w:p>
-      <w:pPr>
-        <w:spacing w:line="480" w:lineRule="auto"/>
-        <w:ind w:left="-709" w:right="-568"/>
-        <w:rPr>
-          <w:rFonts w:ascii="Calibri" w:hAnsi="Calibri" w:cs="Arial"/>
-        </w:rPr>
-      </w:pPr>
-      <w:r>
-        <w:rPr>
-          <w:rFonts w:ascii="Calibri" w:hAnsi="Calibri" w:cs="Arial"/>
-        </w:rPr>
-        <w:t>________________________________________________________________________________</w:t>
-      </w:r>
-    </w:p>
-    <w:p>
-      <w:pPr>
-        <w:spacing w:line="480" w:lineRule="auto"/>
-        <w:ind w:left="-709" w:right="-568"/>
-        <w:rPr>
-          <w:rFonts w:ascii="Calibri" w:hAnsi="Calibri" w:cs="Arial"/>
-        </w:rPr>
-      </w:pPr>
-      <w:r>
-        <w:rPr>
-          <w:rFonts w:ascii="Calibri" w:hAnsi="Calibri" w:cs="Arial"/>
-        </w:rPr>
-        <w:t>________________________________________________________________________________</w:t>
-      </w:r>
-    </w:p>
-    <w:p>
-      <w:pPr>
-        <w:spacing w:line="480" w:lineRule="auto"/>
-        <w:ind w:left="-709" w:right="-568"/>
-        <w:rPr>
-          <w:rFonts w:ascii="Calibri" w:hAnsi="Calibri" w:cs="Arial"/>
-        </w:rPr>
-      </w:pPr>
-      <w:r>
-        <w:rPr>
-          <w:rFonts w:ascii="Calibri" w:hAnsi="Calibri" w:cs="Arial"/>
-        </w:rPr>
-        <w:t>________________________________________________________________________________</w:t>
-      </w:r>
-    </w:p>
-    <w:p>
-      <w:pPr>
-        <w:spacing w:line="480" w:lineRule="auto"/>
-        <w:ind w:left="-709" w:right="-568"/>
-        <w:rPr>
-          <w:rFonts w:ascii="Calibri" w:hAnsi="Calibri" w:cs="Arial"/>
-        </w:rPr>
-      </w:pPr>
-      <w:r>
-        <w:rPr>
-          <w:rFonts w:ascii="Calibri" w:hAnsi="Calibri" w:cs="Arial"/>
-        </w:rPr>
-        <w:t>________________________________________________________________________________</w:t>
-      </w:r>
-    </w:p>
-    <w:p>
-      <w:pPr>
-        <w:ind w:left="-709" w:right="-568"/>
-        <w:rPr>
-          <w:rFonts w:ascii="Calibri" w:hAnsi="Calibri" w:cs="Arial"/>
-          <w:b/>
-          <w:bCs/>
-        </w:rPr>
-      </w:pPr>
-    </w:p>
-    <w:p>
-      <w:pPr>
-        <w:ind w:left="-709" w:right="-568"/>
-        <w:rPr>
-          <w:rFonts w:ascii="Calibri" w:hAnsi="Calibri" w:cs="Arial"/>
-        </w:rPr>
-      </w:pPr>
-      <w:r>
-        <w:rPr>
-          <w:rFonts w:ascii="Calibri" w:hAnsi="Calibri" w:cs="Arial"/>
-          <w:b/>
-          <w:bCs/>
-        </w:rPr>
-        <w:t>Signed (and dated)</w:t>
-      </w:r>
-      <w:r>
-        <w:rPr>
-          <w:rFonts w:ascii="Calibri" w:hAnsi="Calibri" w:cs="Arial"/>
-        </w:rPr>
-        <w:t>:</w:t>
-      </w:r>
-    </w:p>
-    <w:p>
-      <w:pPr>
-        <w:ind w:left="-709" w:right="-568"/>
-        <w:rPr>
-          <w:rFonts w:ascii="Calibri" w:hAnsi="Calibri" w:cs="Arial"/>
-        </w:rPr>
-      </w:pPr>
-    </w:p>
-    <w:p>
-      <w:pPr>
-        <w:ind w:left="-709" w:right="-568"/>
-        <w:rPr>
-          <w:rFonts w:ascii="Calibri" w:hAnsi="Calibri" w:cs="Arial"/>
-          <w:b/>
-          <w:bCs/>
-        </w:rPr>
-      </w:pPr>
-      <w:r>
-        <w:rPr>
-          <w:rFonts w:ascii="Calibri" w:hAnsi="Calibri" w:cs="Arial"/>
-        </w:rPr>
-        <w:t>_______________________________________    _______________________________________</w:t>
+        <w:ind w:left="-709" w:right="-568"/>
+        <w:rPr>
+          <w:rFonts w:ascii="Calibri" w:hAnsi="Calibri" w:cs="Arial"/>
+          <w:b/>
+          <w:bCs/>
+        </w:rPr>
+      </w:pPr>
+      <w:r>
+        <w:rPr>
+          <w:rFonts w:ascii="Calibri" w:hAnsi="Calibri" w:cs="Arial"/>
+        </w:rPr>
+        <w:t>Aleksandra Skarzycka 23/04/26</w:t>
+      </w:r>
+      <w:r>
+        <w:rPr>
+          <w:rFonts w:ascii="Calibri" w:hAnsi="Calibri" w:cs="Arial"/>
+        </w:rPr>
+        <w:t xml:space="preserve">    </w:t>
+      </w:r>
+      <w:r>
+        <w:rPr>
+          <w:rFonts w:ascii="Calibri" w:hAnsi="Calibri" w:cs="Arial"/>
+        </w:rPr>
+        <w:tab/>
+      </w:r>
+      <w:r>
+        <w:rPr>
+          <w:rFonts w:ascii="Calibri" w:hAnsi="Calibri" w:cs="Arial"/>
+        </w:rPr>
+        <w:tab/>
+      </w:r>
+      <w:r>
+        <w:rPr>
+          <w:rFonts w:ascii="Calibri" w:hAnsi="Calibri" w:cs="Arial"/>
+        </w:rPr>
+        <w:tab/>
+      </w:r>
+      <w:r>
+        <w:rPr>
+          <w:rFonts w:ascii="Calibri" w:hAnsi="Calibri" w:cs="Arial"/>
+        </w:rPr>
+        <w:tab/>
       </w:r>
     </w:p>
     <w:p>
@@ -6893,7 +6786,15 @@
           <w:sz w:val="28"/>
           <w:szCs w:val="28"/>
         </w:rPr>
-        <w:t>: ______________________________</w:t>
+        <w:t xml:space="preserve">: </w:t>
+      </w:r>
+      <w:r>
+        <w:rPr>
+          <w:rFonts w:ascii="Calibri" w:hAnsi="Calibri" w:cs="Arial"/>
+          <w:sz w:val="28"/>
+          <w:szCs w:val="28"/>
+        </w:rPr>
+        <w:t>16/03/26</w:t>
       </w:r>
     </w:p>
     <w:p>
@@ -6951,6 +6852,63 @@
     </w:p>
     <w:p>
       <w:pPr>
+        <w:ind w:left="-709" w:right="-568"/>
+        <w:rPr>
+          <w:rFonts w:ascii="Calibri" w:hAnsi="Calibri" w:cs="Arial"/>
+          <w:b/>
+          <w:bCs/>
+        </w:rPr>
+      </w:pPr>
+      <w:r>
+        <w:rPr>
+          <w:rFonts w:ascii="Calibri" w:hAnsi="Calibri" w:cs="Arial"/>
+        </w:rPr>
+        <w:t>Added in the ability to login through an email magic link and needed to test.</w:t>
+      </w:r>
+    </w:p>
+    <w:p>
+      <w:pPr>
+        <w:ind w:left="-709" w:right="-568"/>
+        <w:rPr>
+          <w:rFonts w:ascii="Calibri" w:hAnsi="Calibri" w:cs="Arial"/>
+          <w:b/>
+          <w:bCs/>
+        </w:rPr>
+      </w:pPr>
+    </w:p>
+    <w:p>
+      <w:pPr>
+        <w:ind w:left="-709" w:right="-568"/>
+        <w:rPr>
+          <w:rFonts w:ascii="Calibri" w:hAnsi="Calibri" w:cs="Arial"/>
+        </w:rPr>
+      </w:pPr>
+      <w:r>
+        <w:rPr>
+          <w:rFonts w:ascii="Calibri" w:hAnsi="Calibri" w:cs="Arial"/>
+          <w:b/>
+          <w:bCs/>
+        </w:rPr>
+        <w:lastRenderedPageBreak/>
+        <w:t>Notes (and things to remember)</w:t>
+      </w:r>
+      <w:r>
+        <w:rPr>
+          <w:rFonts w:ascii="Calibri" w:hAnsi="Calibri" w:cs="Arial"/>
+        </w:rPr>
+        <w:t>:</w:t>
+      </w:r>
+    </w:p>
+    <w:p>
+      <w:pPr>
+        <w:ind w:left="-709" w:right="-568"/>
+        <w:rPr>
+          <w:rFonts w:ascii="Calibri" w:hAnsi="Calibri" w:cs="Arial"/>
+        </w:rPr>
+      </w:pPr>
+    </w:p>
+    <w:p>
+      <w:pPr>
         <w:spacing w:line="480" w:lineRule="auto"/>
         <w:ind w:left="-709" w:right="-568"/>
         <w:rPr>
@@ -7056,91 +7014,28 @@
     </w:p>
     <w:p>
       <w:pPr>
-        <w:spacing w:line="480" w:lineRule="auto"/>
-        <w:ind w:left="-709" w:right="-568"/>
-        <w:rPr>
-          <w:rFonts w:ascii="Calibri" w:hAnsi="Calibri" w:cs="Arial"/>
-        </w:rPr>
-      </w:pPr>
-      <w:r>
-        <w:rPr>
-          <w:rFonts w:ascii="Calibri" w:hAnsi="Calibri" w:cs="Arial"/>
-        </w:rPr>
-        <w:t>________________________________________________________________________________</w:t>
-      </w:r>
-    </w:p>
-    <w:p>
-      <w:pPr>
-        <w:spacing w:line="480" w:lineRule="auto"/>
-        <w:ind w:left="-709" w:right="-568"/>
-        <w:rPr>
-          <w:rFonts w:ascii="Calibri" w:hAnsi="Calibri" w:cs="Arial"/>
-        </w:rPr>
-      </w:pPr>
-      <w:r>
-        <w:rPr>
-          <w:rFonts w:ascii="Calibri" w:hAnsi="Calibri" w:cs="Arial"/>
-        </w:rPr>
-        <w:t>________________________________________________________________________________</w:t>
-      </w:r>
-    </w:p>
-    <w:p>
-      <w:pPr>
-        <w:spacing w:line="480" w:lineRule="auto"/>
-        <w:ind w:left="-709" w:right="-568"/>
-        <w:rPr>
-          <w:rFonts w:ascii="Calibri" w:hAnsi="Calibri" w:cs="Arial"/>
-        </w:rPr>
-      </w:pPr>
-      <w:r>
-        <w:rPr>
-          <w:rFonts w:ascii="Calibri" w:hAnsi="Calibri" w:cs="Arial"/>
-        </w:rPr>
-        <w:t>________________________________________________________________________________</w:t>
-      </w:r>
-    </w:p>
-    <w:p>
-      <w:pPr>
-        <w:ind w:left="-709" w:right="-568"/>
-        <w:rPr>
-          <w:rFonts w:ascii="Calibri" w:hAnsi="Calibri" w:cs="Arial"/>
-        </w:rPr>
-      </w:pPr>
-    </w:p>
-    <w:p>
-      <w:pPr>
-        <w:ind w:left="-709" w:right="-568"/>
-        <w:rPr>
-          <w:rFonts w:ascii="Calibri" w:hAnsi="Calibri" w:cs="Arial"/>
-          <w:b/>
-          <w:bCs/>
-        </w:rPr>
-      </w:pPr>
-    </w:p>
-    <w:p>
-      <w:pPr>
-        <w:ind w:left="-709" w:right="-568"/>
-        <w:rPr>
-          <w:rFonts w:ascii="Calibri" w:hAnsi="Calibri" w:cs="Arial"/>
-          <w:b/>
-          <w:bCs/>
-        </w:rPr>
-      </w:pPr>
-    </w:p>
-    <w:p>
-      <w:pPr>
-        <w:ind w:left="-709" w:right="-568"/>
-        <w:rPr>
-          <w:rFonts w:ascii="Calibri" w:hAnsi="Calibri" w:cs="Arial"/>
-        </w:rPr>
-      </w:pPr>
-      <w:r>
-        <w:rPr>
-          <w:rFonts w:ascii="Calibri" w:hAnsi="Calibri" w:cs="Arial"/>
-          <w:b/>
-          <w:bCs/>
-        </w:rPr>
-        <w:t>Notes (and things to remember)</w:t>
+        <w:ind w:left="-709" w:right="-568"/>
+        <w:rPr>
+          <w:rFonts w:ascii="Calibri" w:hAnsi="Calibri" w:cs="Arial"/>
+          <w:b/>
+          <w:bCs/>
+        </w:rPr>
+      </w:pPr>
+    </w:p>
+    <w:p>
+      <w:pPr>
+        <w:ind w:left="-709" w:right="-568"/>
+        <w:rPr>
+          <w:rFonts w:ascii="Calibri" w:hAnsi="Calibri" w:cs="Arial"/>
+        </w:rPr>
+      </w:pPr>
+      <w:r>
+        <w:rPr>
+          <w:rFonts w:ascii="Calibri" w:hAnsi="Calibri" w:cs="Arial"/>
+          <w:b/>
+          <w:bCs/>
+        </w:rPr>
+        <w:t>Signed (and dated)</w:t>
       </w:r>
       <w:r>
         <w:rPr>
@@ -7159,163 +7054,48 @@
     </w:p>
     <w:p>
       <w:pPr>
-        <w:spacing w:line="480" w:lineRule="auto"/>
-        <w:ind w:left="-709" w:right="-568"/>
-        <w:rPr>
-          <w:rFonts w:ascii="Calibri" w:hAnsi="Calibri" w:cs="Arial"/>
-        </w:rPr>
-      </w:pPr>
-      <w:r>
-        <w:rPr>
-          <w:rFonts w:ascii="Calibri" w:hAnsi="Calibri" w:cs="Arial"/>
-        </w:rPr>
-        <w:t>________________________________________________________________________________</w:t>
-      </w:r>
-    </w:p>
-    <w:p>
-      <w:pPr>
-        <w:spacing w:line="480" w:lineRule="auto"/>
-        <w:ind w:left="-709" w:right="-568"/>
-        <w:rPr>
-          <w:rFonts w:ascii="Calibri" w:hAnsi="Calibri" w:cs="Arial"/>
-        </w:rPr>
-      </w:pPr>
-      <w:r>
-        <w:rPr>
-          <w:rFonts w:ascii="Calibri" w:hAnsi="Calibri" w:cs="Arial"/>
-        </w:rPr>
-        <w:t>________________________________________________________________________________</w:t>
-      </w:r>
-    </w:p>
-    <w:p>
-      <w:pPr>
-        <w:spacing w:line="480" w:lineRule="auto"/>
-        <w:ind w:left="-709" w:right="-568"/>
-        <w:rPr>
-          <w:rFonts w:ascii="Calibri" w:hAnsi="Calibri" w:cs="Arial"/>
-        </w:rPr>
-      </w:pPr>
-      <w:r>
-        <w:rPr>
-          <w:rFonts w:ascii="Calibri" w:hAnsi="Calibri" w:cs="Arial"/>
-        </w:rPr>
-        <w:t>________________________________________________________________________________</w:t>
-      </w:r>
-    </w:p>
-    <w:p>
-      <w:pPr>
-        <w:spacing w:line="480" w:lineRule="auto"/>
-        <w:ind w:left="-709" w:right="-568"/>
-        <w:rPr>
-          <w:rFonts w:ascii="Calibri" w:hAnsi="Calibri" w:cs="Arial"/>
-        </w:rPr>
-      </w:pPr>
-      <w:r>
-        <w:rPr>
-          <w:rFonts w:ascii="Calibri" w:hAnsi="Calibri" w:cs="Arial"/>
-        </w:rPr>
-        <w:t>________________________________________________________________________________</w:t>
-      </w:r>
-    </w:p>
-    <w:p>
-      <w:pPr>
-        <w:spacing w:line="480" w:lineRule="auto"/>
-        <w:ind w:left="-709" w:right="-568"/>
-        <w:rPr>
-          <w:rFonts w:ascii="Calibri" w:hAnsi="Calibri" w:cs="Arial"/>
-        </w:rPr>
-      </w:pPr>
-      <w:r>
-        <w:rPr>
-          <w:rFonts w:ascii="Calibri" w:hAnsi="Calibri" w:cs="Arial"/>
-        </w:rPr>
-        <w:t>________________________________________________________________________________</w:t>
-      </w:r>
-    </w:p>
-    <w:p>
-      <w:pPr>
-        <w:spacing w:line="480" w:lineRule="auto"/>
-        <w:ind w:left="-709" w:right="-568"/>
-        <w:rPr>
-          <w:rFonts w:ascii="Calibri" w:hAnsi="Calibri" w:cs="Arial"/>
-        </w:rPr>
-      </w:pPr>
-      <w:r>
-        <w:rPr>
-          <w:rFonts w:ascii="Calibri" w:hAnsi="Calibri" w:cs="Arial"/>
-        </w:rPr>
-        <w:t>________________________________________________________________________________</w:t>
-      </w:r>
-    </w:p>
-    <w:p>
-      <w:pPr>
-        <w:spacing w:line="480" w:lineRule="auto"/>
-        <w:ind w:left="-709" w:right="-568"/>
-        <w:rPr>
-          <w:rFonts w:ascii="Calibri" w:hAnsi="Calibri" w:cs="Arial"/>
-        </w:rPr>
-      </w:pPr>
-      <w:r>
-        <w:rPr>
-          <w:rFonts w:ascii="Calibri" w:hAnsi="Calibri" w:cs="Arial"/>
-        </w:rPr>
-        <w:t>________________________________________________________________________________</w:t>
-      </w:r>
-    </w:p>
-    <w:p>
-      <w:pPr>
-        <w:ind w:left="-709" w:right="-568"/>
-        <w:rPr>
-          <w:rFonts w:ascii="Calibri" w:hAnsi="Calibri" w:cs="Arial"/>
-          <w:b/>
-          <w:bCs/>
-        </w:rPr>
-      </w:pPr>
-    </w:p>
-    <w:p>
-      <w:pPr>
-        <w:ind w:left="-709" w:right="-568"/>
-        <w:rPr>
-          <w:rFonts w:ascii="Calibri" w:hAnsi="Calibri" w:cs="Arial"/>
-        </w:rPr>
-      </w:pPr>
-      <w:r>
-        <w:rPr>
-          <w:rFonts w:ascii="Calibri" w:hAnsi="Calibri" w:cs="Arial"/>
-          <w:b/>
-          <w:bCs/>
-        </w:rPr>
-        <w:t>Signed (and dated)</w:t>
-      </w:r>
-      <w:r>
-        <w:rPr>
-          <w:rFonts w:ascii="Calibri" w:hAnsi="Calibri" w:cs="Arial"/>
-        </w:rPr>
-        <w:t>:</w:t>
-      </w:r>
-    </w:p>
-    <w:p>
-      <w:pPr>
-        <w:ind w:left="-709" w:right="-568"/>
-        <w:rPr>
-          <w:rFonts w:ascii="Calibri" w:hAnsi="Calibri" w:cs="Arial"/>
-        </w:rPr>
-      </w:pPr>
-    </w:p>
-    <w:p>
-      <w:pPr>
-        <w:ind w:left="-709" w:right="-568"/>
-        <w:rPr>
-          <w:rFonts w:ascii="Calibri" w:hAnsi="Calibri" w:cs="Arial"/>
-          <w:b/>
-          <w:bCs/>
-        </w:rPr>
-      </w:pPr>
-      <w:r>
-        <w:rPr>
-          <w:rFonts w:ascii="Calibri" w:hAnsi="Calibri" w:cs="Arial"/>
-        </w:rPr>
-        <w:t>_______________________________________    _______________________________________</w:t>
+        <w:ind w:left="-709" w:right="-568"/>
+        <w:rPr>
+          <w:rFonts w:ascii="Calibri" w:hAnsi="Calibri" w:cs="Arial"/>
+          <w:b/>
+          <w:bCs/>
+        </w:rPr>
+      </w:pPr>
+      <w:r>
+        <w:rPr>
+          <w:rFonts w:ascii="Calibri" w:hAnsi="Calibri" w:cs="Arial"/>
+        </w:rPr>
+        <w:t>Aleksandra Skarzycka 23/04/26</w:t>
+      </w:r>
+      <w:r>
+        <w:rPr>
+          <w:rFonts w:ascii="Calibri" w:hAnsi="Calibri" w:cs="Arial"/>
+        </w:rPr>
+        <w:t xml:space="preserve">    </w:t>
+      </w:r>
+      <w:r>
+        <w:rPr>
+          <w:rFonts w:ascii="Calibri" w:hAnsi="Calibri" w:cs="Arial"/>
+        </w:rPr>
+        <w:tab/>
+      </w:r>
+      <w:r>
+        <w:rPr>
+          <w:rFonts w:ascii="Calibri" w:hAnsi="Calibri" w:cs="Arial"/>
+        </w:rPr>
+        <w:tab/>
+      </w:r>
+      <w:r>
+        <w:rPr>
+          <w:rFonts w:ascii="Calibri" w:hAnsi="Calibri" w:cs="Arial"/>
+        </w:rPr>
+        <w:tab/>
+      </w:r>
+      <w:r>
+        <w:rPr>
+          <w:rFonts w:ascii="Calibri" w:hAnsi="Calibri" w:cs="Arial"/>
+        </w:rPr>
+        <w:tab/>
       </w:r>
     </w:p>
     <w:p>
@@ -7459,7 +7239,15 @@
           <w:sz w:val="28"/>
           <w:szCs w:val="28"/>
         </w:rPr>
-        <w:t>: ______________________________</w:t>
+        <w:t xml:space="preserve">: </w:t>
+      </w:r>
+      <w:r>
+        <w:rPr>
+          <w:rFonts w:ascii="Calibri" w:hAnsi="Calibri" w:cs="Arial"/>
+          <w:sz w:val="28"/>
+          <w:szCs w:val="28"/>
+        </w:rPr>
+        <w:t>23/03/26</w:t>
       </w:r>
     </w:p>
     <w:p>
@@ -7527,6 +7315,71 @@
         <w:rPr>
           <w:rFonts w:ascii="Calibri" w:hAnsi="Calibri" w:cs="Arial"/>
         </w:rPr>
+        <w:t>No work done this week.</w:t>
+      </w:r>
+    </w:p>
+    <w:p>
+      <w:pPr>
+        <w:ind w:left="-709" w:right="-568"/>
+        <w:rPr>
+          <w:rFonts w:ascii="Calibri" w:hAnsi="Calibri" w:cs="Arial"/>
+          <w:b/>
+          <w:bCs/>
+        </w:rPr>
+      </w:pPr>
+    </w:p>
+    <w:p>
+      <w:pPr>
+        <w:ind w:left="-709" w:right="-568"/>
+        <w:rPr>
+          <w:rFonts w:ascii="Calibri" w:hAnsi="Calibri" w:cs="Arial"/>
+          <w:b/>
+          <w:bCs/>
+        </w:rPr>
+      </w:pPr>
+    </w:p>
+    <w:p>
+      <w:pPr>
+        <w:ind w:left="-709" w:right="-568"/>
+        <w:rPr>
+          <w:rFonts w:ascii="Calibri" w:hAnsi="Calibri" w:cs="Arial"/>
+        </w:rPr>
+      </w:pPr>
+      <w:r>
+        <w:rPr>
+          <w:rFonts w:ascii="Calibri" w:hAnsi="Calibri" w:cs="Arial"/>
+          <w:b/>
+          <w:bCs/>
+        </w:rPr>
+        <w:t>Notes (and things to remember)</w:t>
+      </w:r>
+      <w:r>
+        <w:rPr>
+          <w:rFonts w:ascii="Calibri" w:hAnsi="Calibri" w:cs="Arial"/>
+        </w:rPr>
+        <w:t>:</w:t>
+      </w:r>
+    </w:p>
+    <w:p>
+      <w:pPr>
+        <w:ind w:left="-709" w:right="-568"/>
+        <w:rPr>
+          <w:rFonts w:ascii="Calibri" w:hAnsi="Calibri" w:cs="Arial"/>
+        </w:rPr>
+      </w:pPr>
+    </w:p>
+    <w:p>
+      <w:pPr>
+        <w:spacing w:line="480" w:lineRule="auto"/>
+        <w:ind w:left="-709" w:right="-568"/>
+        <w:rPr>
+          <w:rFonts w:ascii="Calibri" w:hAnsi="Calibri" w:cs="Arial"/>
+        </w:rPr>
+      </w:pPr>
+      <w:r>
+        <w:rPr>
+          <w:rFonts w:ascii="Calibri" w:hAnsi="Calibri" w:cs="Arial"/>
+        </w:rPr>
         <w:t>________________________________________________________________________________</w:t>
       </w:r>
     </w:p>
@@ -7622,6 +7475,390 @@
     </w:p>
     <w:p>
       <w:pPr>
+        <w:ind w:left="-709" w:right="-568"/>
+        <w:rPr>
+          <w:rFonts w:ascii="Calibri" w:hAnsi="Calibri" w:cs="Arial"/>
+          <w:b/>
+          <w:bCs/>
+        </w:rPr>
+      </w:pPr>
+    </w:p>
+    <w:p>
+      <w:pPr>
+        <w:ind w:left="-709" w:right="-568"/>
+        <w:rPr>
+          <w:rFonts w:ascii="Calibri" w:hAnsi="Calibri" w:cs="Arial"/>
+        </w:rPr>
+      </w:pPr>
+      <w:r>
+        <w:rPr>
+          <w:rFonts w:ascii="Calibri" w:hAnsi="Calibri" w:cs="Arial"/>
+          <w:b/>
+          <w:bCs/>
+        </w:rPr>
+        <w:t>Signed (and dated)</w:t>
+      </w:r>
+      <w:r>
+        <w:rPr>
+          <w:rFonts w:ascii="Calibri" w:hAnsi="Calibri" w:cs="Arial"/>
+        </w:rPr>
+        <w:t>:</w:t>
+      </w:r>
+    </w:p>
+    <w:p>
+      <w:pPr>
+        <w:ind w:left="-709" w:right="-568"/>
+        <w:rPr>
+          <w:rFonts w:ascii="Calibri" w:hAnsi="Calibri" w:cs="Arial"/>
+        </w:rPr>
+      </w:pPr>
+    </w:p>
+    <w:p>
+      <w:pPr>
+        <w:ind w:left="-709" w:right="-568"/>
+        <w:rPr>
+          <w:rFonts w:ascii="Calibri" w:hAnsi="Calibri" w:cs="Arial"/>
+          <w:b/>
+          <w:bCs/>
+        </w:rPr>
+      </w:pPr>
+      <w:r>
+        <w:rPr>
+          <w:rFonts w:ascii="Calibri" w:hAnsi="Calibri" w:cs="Arial"/>
+        </w:rPr>
+        <w:t>Aleksandra Skarzycka 23/04/26</w:t>
+      </w:r>
+      <w:r>
+        <w:rPr>
+          <w:rFonts w:ascii="Calibri" w:hAnsi="Calibri" w:cs="Arial"/>
+        </w:rPr>
+        <w:t xml:space="preserve">    </w:t>
+      </w:r>
+      <w:r>
+        <w:rPr>
+          <w:rFonts w:ascii="Calibri" w:hAnsi="Calibri" w:cs="Arial"/>
+        </w:rPr>
+        <w:tab/>
+      </w:r>
+      <w:r>
+        <w:rPr>
+          <w:rFonts w:ascii="Calibri" w:hAnsi="Calibri" w:cs="Arial"/>
+        </w:rPr>
+        <w:tab/>
+      </w:r>
+      <w:r>
+        <w:rPr>
+          <w:rFonts w:ascii="Calibri" w:hAnsi="Calibri" w:cs="Arial"/>
+        </w:rPr>
+        <w:tab/>
+      </w:r>
+      <w:r>
+        <w:rPr>
+          <w:rFonts w:ascii="Calibri" w:hAnsi="Calibri" w:cs="Arial"/>
+        </w:rPr>
+        <w:tab/>
+      </w:r>
+    </w:p>
+    <w:p>
+      <w:pPr>
+        <w:ind w:left="-709" w:right="-568"/>
+        <w:rPr>
+          <w:rFonts w:ascii="Calibri" w:hAnsi="Calibri" w:cs="Arial"/>
+          <w:b/>
+        </w:rPr>
+      </w:pPr>
+      <w:r>
+        <w:rPr>
+          <w:rFonts w:ascii="Calibri" w:hAnsi="Calibri" w:cs="Arial"/>
+          <w:b/>
+          <w:bCs/>
+        </w:rPr>
+        <w:t>Student</w:t>
+      </w:r>
+      <w:r>
+        <w:rPr>
+          <w:rFonts w:ascii="Calibri" w:hAnsi="Calibri" w:cs="Arial"/>
+          <w:b/>
+          <w:bCs/>
+        </w:rPr>
+        <w:tab/>
+      </w:r>
+      <w:r>
+        <w:rPr>
+          <w:rFonts w:ascii="Calibri" w:hAnsi="Calibri" w:cs="Arial"/>
+          <w:b/>
+          <w:bCs/>
+        </w:rPr>
+        <w:tab/>
+      </w:r>
+      <w:r>
+        <w:rPr>
+          <w:rFonts w:ascii="Calibri" w:hAnsi="Calibri" w:cs="Arial"/>
+          <w:b/>
+          <w:bCs/>
+        </w:rPr>
+        <w:tab/>
+      </w:r>
+      <w:r>
+        <w:rPr>
+          <w:rFonts w:ascii="Calibri" w:hAnsi="Calibri" w:cs="Arial"/>
+          <w:b/>
+          <w:bCs/>
+        </w:rPr>
+        <w:tab/>
+      </w:r>
+      <w:r>
+        <w:rPr>
+          <w:rFonts w:ascii="Calibri" w:hAnsi="Calibri" w:cs="Arial"/>
+          <w:b/>
+          <w:bCs/>
+        </w:rPr>
+        <w:tab/>
+      </w:r>
+      <w:r>
+        <w:rPr>
+          <w:rFonts w:ascii="Calibri" w:hAnsi="Calibri" w:cs="Arial"/>
+          <w:b/>
+          <w:bCs/>
+        </w:rPr>
+        <w:tab/>
+      </w:r>
+      <w:r>
+        <w:rPr>
+          <w:rFonts w:ascii="Calibri" w:hAnsi="Calibri" w:cs="Arial"/>
+          <w:b/>
+          <w:bCs/>
+          <w:lang w:val="ga-IE"/>
+        </w:rPr>
+        <w:tab/>
+      </w:r>
+      <w:r>
+        <w:rPr>
+          <w:rFonts w:ascii="Calibri" w:hAnsi="Calibri" w:cs="Arial"/>
+          <w:b/>
+          <w:bCs/>
+        </w:rPr>
+        <w:t>Supervisor</w:t>
+      </w:r>
+    </w:p>
+    <w:p>
+      <w:pPr>
+        <w:ind w:left="-709" w:right="-568"/>
+        <w:rPr>
+          <w:rFonts w:ascii="Calibri" w:hAnsi="Calibri" w:cs="Arial"/>
+          <w:b/>
+          <w:bCs/>
+          <w:sz w:val="28"/>
+          <w:szCs w:val="28"/>
+        </w:rPr>
+      </w:pPr>
+    </w:p>
+    <w:p>
+      <w:pPr>
+        <w:ind w:left="-709" w:right="-568"/>
+        <w:rPr>
+          <w:rFonts w:ascii="Calibri" w:hAnsi="Calibri" w:cs="Arial"/>
+          <w:sz w:val="28"/>
+          <w:szCs w:val="28"/>
+          <w:lang w:val="ga-IE"/>
+        </w:rPr>
+      </w:pPr>
+      <w:r>
+        <w:rPr>
+          <w:rFonts w:ascii="Calibri" w:hAnsi="Calibri" w:cs="Arial"/>
+          <w:b/>
+          <w:bCs/>
+          <w:sz w:val="28"/>
+          <w:szCs w:val="28"/>
+        </w:rPr>
+        <w:t>Week 1</w:t>
+      </w:r>
+      <w:r>
+        <w:rPr>
+          <w:rFonts w:ascii="Calibri" w:hAnsi="Calibri" w:cs="Arial"/>
+          <w:b/>
+          <w:bCs/>
+          <w:sz w:val="28"/>
+          <w:szCs w:val="28"/>
+        </w:rPr>
+        <w:t>1</w:t>
+      </w:r>
+      <w:r>
+        <w:rPr>
+          <w:rFonts w:ascii="Calibri" w:hAnsi="Calibri" w:cs="Arial"/>
+          <w:b/>
+          <w:bCs/>
+          <w:sz w:val="28"/>
+          <w:szCs w:val="28"/>
+        </w:rPr>
+        <w:t xml:space="preserve"> Beginning</w:t>
+      </w:r>
+      <w:r>
+        <w:rPr>
+          <w:rFonts w:ascii="Calibri" w:hAnsi="Calibri" w:cs="Arial"/>
+          <w:sz w:val="28"/>
+          <w:szCs w:val="28"/>
+        </w:rPr>
+        <w:t xml:space="preserve">: </w:t>
+      </w:r>
+      <w:r>
+        <w:rPr>
+          <w:rFonts w:ascii="Calibri" w:hAnsi="Calibri" w:cs="Arial"/>
+          <w:sz w:val="28"/>
+          <w:szCs w:val="28"/>
+        </w:rPr>
+        <w:t>13/04/26</w:t>
+      </w:r>
+    </w:p>
+    <w:p>
+      <w:pPr>
+        <w:ind w:left="-709" w:right="-568"/>
+        <w:rPr>
+          <w:rFonts w:ascii="Calibri" w:hAnsi="Calibri" w:cs="Arial"/>
+          <w:b/>
+          <w:bCs/>
+          <w:lang w:val="ga-IE"/>
+        </w:rPr>
+      </w:pPr>
+    </w:p>
+    <w:p>
+      <w:pPr>
+        <w:ind w:left="-709" w:right="-568"/>
+        <w:rPr>
+          <w:rFonts w:ascii="Calibri" w:hAnsi="Calibri" w:cs="Arial"/>
+          <w:b/>
+          <w:bCs/>
+        </w:rPr>
+      </w:pPr>
+    </w:p>
+    <w:p>
+      <w:pPr>
+        <w:ind w:left="-709" w:right="-568"/>
+        <w:rPr>
+          <w:rFonts w:ascii="Calibri" w:hAnsi="Calibri" w:cs="Arial"/>
+          <w:lang w:val="ga-IE"/>
+        </w:rPr>
+      </w:pPr>
+      <w:r>
+        <w:rPr>
+          <w:rFonts w:ascii="Calibri" w:hAnsi="Calibri" w:cs="Arial"/>
+          <w:b/>
+          <w:bCs/>
+        </w:rPr>
+        <w:t>Description of Work Completed</w:t>
+      </w:r>
+      <w:r>
+        <w:rPr>
+          <w:rFonts w:ascii="Calibri" w:hAnsi="Calibri" w:cs="Arial"/>
+        </w:rPr>
+        <w:t xml:space="preserve">: </w:t>
+      </w:r>
+    </w:p>
+    <w:p>
+      <w:pPr>
+        <w:ind w:left="-709" w:right="-568"/>
+        <w:rPr>
+          <w:rFonts w:ascii="Calibri" w:hAnsi="Calibri" w:cs="Arial"/>
+          <w:lang w:val="ga-IE"/>
+        </w:rPr>
+      </w:pPr>
+    </w:p>
+    <w:p>
+      <w:pPr>
+        <w:ind w:left="-709" w:right="-568"/>
+        <w:rPr>
+          <w:rFonts w:ascii="Calibri" w:hAnsi="Calibri" w:cs="Arial"/>
+        </w:rPr>
+      </w:pPr>
+      <w:r>
+        <w:rPr>
+          <w:rFonts w:ascii="Calibri" w:hAnsi="Calibri" w:cs="Arial"/>
+        </w:rPr>
+        <w:t>Started working in the wish</w:t>
+      </w:r>
+      <w:r>
+        <w:rPr>
+          <w:rFonts w:ascii="Calibri" w:hAnsi="Calibri" w:cs="Arial"/>
+        </w:rPr>
+        <w:t xml:space="preserve"> </w:t>
+      </w:r>
+      <w:r>
+        <w:rPr>
+          <w:rFonts w:ascii="Calibri" w:hAnsi="Calibri" w:cs="Arial"/>
+        </w:rPr>
+        <w:t xml:space="preserve">list and added the vinyl I want in. Gave each vinyl a </w:t>
+      </w:r>
+      <w:r>
+        <w:rPr>
+          <w:rFonts w:ascii="Calibri" w:hAnsi="Calibri" w:cs="Arial"/>
+        </w:rPr>
+        <w:t>Spotify</w:t>
+      </w:r>
+      <w:r>
+        <w:rPr>
+          <w:rFonts w:ascii="Calibri" w:hAnsi="Calibri" w:cs="Arial"/>
+        </w:rPr>
+        <w:t xml:space="preserve"> embed inside, but no thoughts section in them. Removed unused fonts and images. Made small changes and prepared to build and deploy on Netlify to test login.</w:t>
+      </w:r>
+    </w:p>
+    <w:p>
+      <w:pPr>
+        <w:ind w:left="-709" w:right="-568"/>
+        <w:rPr>
+          <w:rFonts w:ascii="Calibri" w:hAnsi="Calibri" w:cs="Arial"/>
+          <w:b/>
+          <w:bCs/>
+        </w:rPr>
+      </w:pPr>
+      <w:r>
+        <w:rPr>
+          <w:rFonts w:ascii="Calibri" w:hAnsi="Calibri" w:cs="Arial"/>
+        </w:rPr>
+        <w:t>Added a favicon to the website.</w:t>
+      </w:r>
+    </w:p>
+    <w:p>
+      <w:pPr>
+        <w:ind w:left="-709" w:right="-568"/>
+        <w:rPr>
+          <w:rFonts w:ascii="Calibri" w:hAnsi="Calibri" w:cs="Arial"/>
+          <w:b/>
+          <w:bCs/>
+        </w:rPr>
+      </w:pPr>
+    </w:p>
+    <w:p>
+      <w:pPr>
+        <w:ind w:left="-709" w:right="-568"/>
+        <w:rPr>
+          <w:rFonts w:ascii="Calibri" w:hAnsi="Calibri" w:cs="Arial"/>
+        </w:rPr>
+      </w:pPr>
+      <w:r>
+        <w:rPr>
+          <w:rFonts w:ascii="Calibri" w:hAnsi="Calibri" w:cs="Arial"/>
+          <w:b/>
+          <w:bCs/>
+        </w:rPr>
+        <w:t>Notes (and things to remember)</w:t>
+      </w:r>
+      <w:r>
+        <w:rPr>
+          <w:rFonts w:ascii="Calibri" w:hAnsi="Calibri" w:cs="Arial"/>
+        </w:rPr>
+        <w:t>:</w:t>
+      </w:r>
+    </w:p>
+    <w:p>
+      <w:pPr>
+        <w:ind w:left="-709" w:right="-568"/>
+        <w:rPr>
+          <w:rFonts w:ascii="Calibri" w:hAnsi="Calibri" w:cs="Arial"/>
+        </w:rPr>
+      </w:pPr>
+    </w:p>
+    <w:p>
+      <w:pPr>
         <w:spacing w:line="480" w:lineRule="auto"/>
         <w:ind w:left="-709" w:right="-568"/>
         <w:rPr>
@@ -7667,38 +7904,88 @@
     </w:p>
     <w:p>
       <w:pPr>
-        <w:ind w:left="-709" w:right="-568"/>
-        <w:rPr>
-          <w:rFonts w:ascii="Calibri" w:hAnsi="Calibri" w:cs="Arial"/>
-          <w:b/>
-          <w:bCs/>
-        </w:rPr>
-      </w:pPr>
-    </w:p>
-    <w:p>
-      <w:pPr>
-        <w:ind w:left="-709" w:right="-568"/>
-        <w:rPr>
-          <w:rFonts w:ascii="Calibri" w:hAnsi="Calibri" w:cs="Arial"/>
-          <w:b/>
-          <w:bCs/>
-        </w:rPr>
-      </w:pPr>
-    </w:p>
-    <w:p>
-      <w:pPr>
-        <w:ind w:left="-709" w:right="-568"/>
-        <w:rPr>
-          <w:rFonts w:ascii="Calibri" w:hAnsi="Calibri" w:cs="Arial"/>
-        </w:rPr>
-      </w:pPr>
-      <w:r>
-        <w:rPr>
-          <w:rFonts w:ascii="Calibri" w:hAnsi="Calibri" w:cs="Arial"/>
-          <w:b/>
-          <w:bCs/>
-        </w:rPr>
-        <w:t>Notes (and things to remember)</w:t>
+        <w:spacing w:line="480" w:lineRule="auto"/>
+        <w:ind w:left="-709" w:right="-568"/>
+        <w:rPr>
+          <w:rFonts w:ascii="Calibri" w:hAnsi="Calibri" w:cs="Arial"/>
+        </w:rPr>
+      </w:pPr>
+      <w:r>
+        <w:rPr>
+          <w:rFonts w:ascii="Calibri" w:hAnsi="Calibri" w:cs="Arial"/>
+        </w:rPr>
+        <w:t>________________________________________________________________________________</w:t>
+      </w:r>
+    </w:p>
+    <w:p>
+      <w:pPr>
+        <w:spacing w:line="480" w:lineRule="auto"/>
+        <w:ind w:left="-709" w:right="-568"/>
+        <w:rPr>
+          <w:rFonts w:ascii="Calibri" w:hAnsi="Calibri" w:cs="Arial"/>
+        </w:rPr>
+      </w:pPr>
+      <w:r>
+        <w:rPr>
+          <w:rFonts w:ascii="Calibri" w:hAnsi="Calibri" w:cs="Arial"/>
+        </w:rPr>
+        <w:t>________________________________________________________________________________</w:t>
+      </w:r>
+    </w:p>
+    <w:p>
+      <w:pPr>
+        <w:spacing w:line="480" w:lineRule="auto"/>
+        <w:ind w:left="-709" w:right="-568"/>
+        <w:rPr>
+          <w:rFonts w:ascii="Calibri" w:hAnsi="Calibri" w:cs="Arial"/>
+        </w:rPr>
+      </w:pPr>
+      <w:r>
+        <w:rPr>
+          <w:rFonts w:ascii="Calibri" w:hAnsi="Calibri" w:cs="Arial"/>
+        </w:rPr>
+        <w:t>________________________________________________________________________________</w:t>
+      </w:r>
+    </w:p>
+    <w:p>
+      <w:pPr>
+        <w:spacing w:line="480" w:lineRule="auto"/>
+        <w:ind w:left="-709" w:right="-568"/>
+        <w:rPr>
+          <w:rFonts w:ascii="Calibri" w:hAnsi="Calibri" w:cs="Arial"/>
+        </w:rPr>
+      </w:pPr>
+      <w:r>
+        <w:rPr>
+          <w:rFonts w:ascii="Calibri" w:hAnsi="Calibri" w:cs="Arial"/>
+        </w:rPr>
+        <w:t>________________________________________________________________________________</w:t>
+      </w:r>
+    </w:p>
+    <w:p>
+      <w:pPr>
+        <w:ind w:left="-709" w:right="-568"/>
+        <w:rPr>
+          <w:rFonts w:ascii="Calibri" w:hAnsi="Calibri" w:cs="Arial"/>
+          <w:b/>
+          <w:bCs/>
+        </w:rPr>
+      </w:pPr>
+    </w:p>
+    <w:p>
+      <w:pPr>
+        <w:ind w:left="-709" w:right="-568"/>
+        <w:rPr>
+          <w:rFonts w:ascii="Calibri" w:hAnsi="Calibri" w:cs="Arial"/>
+        </w:rPr>
+      </w:pPr>
+      <w:r>
+        <w:rPr>
+          <w:rFonts w:ascii="Calibri" w:hAnsi="Calibri" w:cs="Arial"/>
+          <w:b/>
+          <w:bCs/>
+        </w:rPr>
+        <w:t>Signed (and dated)</w:t>
       </w:r>
       <w:r>
         <w:rPr>
@@ -7717,720 +8004,48 @@
     </w:p>
     <w:p>
       <w:pPr>
-        <w:spacing w:line="480" w:lineRule="auto"/>
-        <w:ind w:left="-709" w:right="-568"/>
-        <w:rPr>
-          <w:rFonts w:ascii="Calibri" w:hAnsi="Calibri" w:cs="Arial"/>
-        </w:rPr>
-      </w:pPr>
-      <w:r>
-        <w:rPr>
-          <w:rFonts w:ascii="Calibri" w:hAnsi="Calibri" w:cs="Arial"/>
-        </w:rPr>
-        <w:t>________________________________________________________________________________</w:t>
-      </w:r>
-    </w:p>
-    <w:p>
-      <w:pPr>
-        <w:spacing w:line="480" w:lineRule="auto"/>
-        <w:ind w:left="-709" w:right="-568"/>
-        <w:rPr>
-          <w:rFonts w:ascii="Calibri" w:hAnsi="Calibri" w:cs="Arial"/>
-        </w:rPr>
-      </w:pPr>
-      <w:r>
-        <w:rPr>
-          <w:rFonts w:ascii="Calibri" w:hAnsi="Calibri" w:cs="Arial"/>
-        </w:rPr>
-        <w:t>________________________________________________________________________________</w:t>
-      </w:r>
-    </w:p>
-    <w:p>
-      <w:pPr>
-        <w:spacing w:line="480" w:lineRule="auto"/>
-        <w:ind w:left="-709" w:right="-568"/>
-        <w:rPr>
-          <w:rFonts w:ascii="Calibri" w:hAnsi="Calibri" w:cs="Arial"/>
-        </w:rPr>
-      </w:pPr>
-      <w:r>
-        <w:rPr>
-          <w:rFonts w:ascii="Calibri" w:hAnsi="Calibri" w:cs="Arial"/>
-        </w:rPr>
-        <w:t>________________________________________________________________________________</w:t>
-      </w:r>
-    </w:p>
-    <w:p>
-      <w:pPr>
-        <w:spacing w:line="480" w:lineRule="auto"/>
-        <w:ind w:left="-709" w:right="-568"/>
-        <w:rPr>
-          <w:rFonts w:ascii="Calibri" w:hAnsi="Calibri" w:cs="Arial"/>
-        </w:rPr>
-      </w:pPr>
-      <w:r>
-        <w:rPr>
-          <w:rFonts w:ascii="Calibri" w:hAnsi="Calibri" w:cs="Arial"/>
-        </w:rPr>
-        <w:t>________________________________________________________________________________</w:t>
-      </w:r>
-    </w:p>
-    <w:p>
-      <w:pPr>
-        <w:spacing w:line="480" w:lineRule="auto"/>
-        <w:ind w:left="-709" w:right="-568"/>
-        <w:rPr>
-          <w:rFonts w:ascii="Calibri" w:hAnsi="Calibri" w:cs="Arial"/>
-        </w:rPr>
-      </w:pPr>
-      <w:r>
-        <w:rPr>
-          <w:rFonts w:ascii="Calibri" w:hAnsi="Calibri" w:cs="Arial"/>
-        </w:rPr>
-        <w:t>________________________________________________________________________________</w:t>
-      </w:r>
-    </w:p>
-    <w:p>
-      <w:pPr>
-        <w:spacing w:line="480" w:lineRule="auto"/>
-        <w:ind w:left="-709" w:right="-568"/>
-        <w:rPr>
-          <w:rFonts w:ascii="Calibri" w:hAnsi="Calibri" w:cs="Arial"/>
-        </w:rPr>
-      </w:pPr>
-      <w:r>
-        <w:rPr>
-          <w:rFonts w:ascii="Calibri" w:hAnsi="Calibri" w:cs="Arial"/>
-        </w:rPr>
-        <w:t>________________________________________________________________________________</w:t>
-      </w:r>
-    </w:p>
-    <w:p>
-      <w:pPr>
-        <w:spacing w:line="480" w:lineRule="auto"/>
-        <w:ind w:left="-709" w:right="-568"/>
-        <w:rPr>
-          <w:rFonts w:ascii="Calibri" w:hAnsi="Calibri" w:cs="Arial"/>
-        </w:rPr>
-      </w:pPr>
-      <w:r>
-        <w:rPr>
-          <w:rFonts w:ascii="Calibri" w:hAnsi="Calibri" w:cs="Arial"/>
-        </w:rPr>
-        <w:t>________________________________________________________________________________</w:t>
-      </w:r>
-    </w:p>
-    <w:p>
-      <w:pPr>
-        <w:ind w:left="-709" w:right="-568"/>
-        <w:rPr>
-          <w:rFonts w:ascii="Calibri" w:hAnsi="Calibri" w:cs="Arial"/>
-          <w:b/>
-          <w:bCs/>
-        </w:rPr>
-      </w:pPr>
-    </w:p>
-    <w:p>
-      <w:pPr>
-        <w:ind w:left="-709" w:right="-568"/>
-        <w:rPr>
-          <w:rFonts w:ascii="Calibri" w:hAnsi="Calibri" w:cs="Arial"/>
-        </w:rPr>
-      </w:pPr>
-      <w:r>
-        <w:rPr>
-          <w:rFonts w:ascii="Calibri" w:hAnsi="Calibri" w:cs="Arial"/>
-          <w:b/>
-          <w:bCs/>
-        </w:rPr>
-        <w:t>Signed (and dated)</w:t>
-      </w:r>
-      <w:r>
-        <w:rPr>
-          <w:rFonts w:ascii="Calibri" w:hAnsi="Calibri" w:cs="Arial"/>
-        </w:rPr>
-        <w:t>:</w:t>
-      </w:r>
-    </w:p>
-    <w:p>
-      <w:pPr>
-        <w:ind w:left="-709" w:right="-568"/>
-        <w:rPr>
-          <w:rFonts w:ascii="Calibri" w:hAnsi="Calibri" w:cs="Arial"/>
-        </w:rPr>
-      </w:pPr>
-    </w:p>
-    <w:p>
-      <w:pPr>
-        <w:ind w:left="-709" w:right="-568"/>
-        <w:rPr>
-          <w:rFonts w:ascii="Calibri" w:hAnsi="Calibri" w:cs="Arial"/>
-          <w:b/>
-          <w:bCs/>
-        </w:rPr>
-      </w:pPr>
-      <w:r>
-        <w:rPr>
-          <w:rFonts w:ascii="Calibri" w:hAnsi="Calibri" w:cs="Arial"/>
-        </w:rPr>
-        <w:t>_______________________________________    _______________________________________</w:t>
-      </w:r>
-    </w:p>
-    <w:p>
-      <w:pPr>
-        <w:ind w:left="-709" w:right="-568"/>
-        <w:rPr>
-          <w:rFonts w:ascii="Calibri" w:hAnsi="Calibri" w:cs="Arial"/>
-          <w:b/>
-        </w:rPr>
-      </w:pPr>
-      <w:r>
-        <w:rPr>
-          <w:rFonts w:ascii="Calibri" w:hAnsi="Calibri" w:cs="Arial"/>
-          <w:b/>
-          <w:bCs/>
-        </w:rPr>
-        <w:t>Student</w:t>
-      </w:r>
-      <w:r>
-        <w:rPr>
-          <w:rFonts w:ascii="Calibri" w:hAnsi="Calibri" w:cs="Arial"/>
-          <w:b/>
-          <w:bCs/>
-        </w:rPr>
-        <w:tab/>
-      </w:r>
-      <w:r>
-        <w:rPr>
-          <w:rFonts w:ascii="Calibri" w:hAnsi="Calibri" w:cs="Arial"/>
-          <w:b/>
-          <w:bCs/>
-        </w:rPr>
-        <w:tab/>
-      </w:r>
-      <w:r>
-        <w:rPr>
-          <w:rFonts w:ascii="Calibri" w:hAnsi="Calibri" w:cs="Arial"/>
-          <w:b/>
-          <w:bCs/>
-        </w:rPr>
-        <w:tab/>
-      </w:r>
-      <w:r>
-        <w:rPr>
-          <w:rFonts w:ascii="Calibri" w:hAnsi="Calibri" w:cs="Arial"/>
-          <w:b/>
-          <w:bCs/>
-        </w:rPr>
-        <w:tab/>
-      </w:r>
-      <w:r>
-        <w:rPr>
-          <w:rFonts w:ascii="Calibri" w:hAnsi="Calibri" w:cs="Arial"/>
-          <w:b/>
-          <w:bCs/>
-        </w:rPr>
-        <w:tab/>
-      </w:r>
-      <w:r>
-        <w:rPr>
-          <w:rFonts w:ascii="Calibri" w:hAnsi="Calibri" w:cs="Arial"/>
-          <w:b/>
-          <w:bCs/>
-        </w:rPr>
-        <w:tab/>
-      </w:r>
-      <w:r>
-        <w:rPr>
-          <w:rFonts w:ascii="Calibri" w:hAnsi="Calibri" w:cs="Arial"/>
-          <w:b/>
-          <w:bCs/>
-          <w:lang w:val="ga-IE"/>
-        </w:rPr>
-        <w:tab/>
-      </w:r>
-      <w:r>
-        <w:rPr>
-          <w:rFonts w:ascii="Calibri" w:hAnsi="Calibri" w:cs="Arial"/>
-          <w:b/>
-          <w:bCs/>
-        </w:rPr>
-        <w:t>Supervisor</w:t>
-      </w:r>
-    </w:p>
-    <w:p>
-      <w:pPr>
-        <w:ind w:left="-709" w:right="-568"/>
-        <w:rPr>
-          <w:rFonts w:ascii="Calibri" w:hAnsi="Calibri" w:cs="Arial"/>
-          <w:b/>
-          <w:bCs/>
-          <w:sz w:val="28"/>
-          <w:szCs w:val="28"/>
-        </w:rPr>
-      </w:pPr>
-    </w:p>
-    <w:p>
-      <w:pPr>
-        <w:ind w:left="-709" w:right="-568"/>
-        <w:rPr>
-          <w:rFonts w:ascii="Calibri" w:hAnsi="Calibri" w:cs="Arial"/>
-          <w:sz w:val="28"/>
-          <w:szCs w:val="28"/>
-          <w:lang w:val="ga-IE"/>
-        </w:rPr>
-      </w:pPr>
-      <w:r>
-        <w:rPr>
-          <w:rFonts w:ascii="Calibri" w:hAnsi="Calibri" w:cs="Arial"/>
-          <w:b/>
-          <w:bCs/>
-          <w:sz w:val="28"/>
-          <w:szCs w:val="28"/>
-        </w:rPr>
-        <w:t>Week 1</w:t>
-      </w:r>
-      <w:r>
-        <w:rPr>
-          <w:rFonts w:ascii="Calibri" w:hAnsi="Calibri" w:cs="Arial"/>
-          <w:b/>
-          <w:bCs/>
-          <w:sz w:val="28"/>
-          <w:szCs w:val="28"/>
-        </w:rPr>
-        <w:t>1</w:t>
-      </w:r>
-      <w:r>
-        <w:rPr>
-          <w:rFonts w:ascii="Calibri" w:hAnsi="Calibri" w:cs="Arial"/>
-          <w:b/>
-          <w:bCs/>
-          <w:sz w:val="28"/>
-          <w:szCs w:val="28"/>
-        </w:rPr>
-        <w:t xml:space="preserve"> Beginning</w:t>
-      </w:r>
-      <w:r>
-        <w:rPr>
-          <w:rFonts w:ascii="Calibri" w:hAnsi="Calibri" w:cs="Arial"/>
-          <w:sz w:val="28"/>
-          <w:szCs w:val="28"/>
-        </w:rPr>
-        <w:t>: ______________________________</w:t>
-      </w:r>
-    </w:p>
-    <w:p>
-      <w:pPr>
-        <w:ind w:left="-709" w:right="-568"/>
-        <w:rPr>
-          <w:rFonts w:ascii="Calibri" w:hAnsi="Calibri" w:cs="Arial"/>
-          <w:b/>
-          <w:bCs/>
-          <w:lang w:val="ga-IE"/>
-        </w:rPr>
-      </w:pPr>
-    </w:p>
-    <w:p>
-      <w:pPr>
-        <w:ind w:left="-709" w:right="-568"/>
-        <w:rPr>
-          <w:rFonts w:ascii="Calibri" w:hAnsi="Calibri" w:cs="Arial"/>
-          <w:b/>
-          <w:bCs/>
-        </w:rPr>
-      </w:pPr>
-    </w:p>
-    <w:p>
-      <w:pPr>
-        <w:ind w:left="-709" w:right="-568"/>
-        <w:rPr>
-          <w:rFonts w:ascii="Calibri" w:hAnsi="Calibri" w:cs="Arial"/>
-          <w:lang w:val="ga-IE"/>
-        </w:rPr>
-      </w:pPr>
-      <w:r>
-        <w:rPr>
-          <w:rFonts w:ascii="Calibri" w:hAnsi="Calibri" w:cs="Arial"/>
-          <w:b/>
-          <w:bCs/>
-        </w:rPr>
-        <w:t>Description of Work Completed</w:t>
-      </w:r>
-      <w:r>
-        <w:rPr>
-          <w:rFonts w:ascii="Calibri" w:hAnsi="Calibri" w:cs="Arial"/>
-        </w:rPr>
-        <w:t xml:space="preserve">: </w:t>
-      </w:r>
-    </w:p>
-    <w:p>
-      <w:pPr>
-        <w:ind w:left="-709" w:right="-568"/>
-        <w:rPr>
-          <w:rFonts w:ascii="Calibri" w:hAnsi="Calibri" w:cs="Arial"/>
-          <w:lang w:val="ga-IE"/>
-        </w:rPr>
-      </w:pPr>
-    </w:p>
-    <w:p>
-      <w:pPr>
-        <w:spacing w:line="480" w:lineRule="auto"/>
-        <w:ind w:left="-709" w:right="-568"/>
-        <w:rPr>
-          <w:rFonts w:ascii="Calibri" w:hAnsi="Calibri" w:cs="Arial"/>
-        </w:rPr>
-      </w:pPr>
-      <w:r>
-        <w:rPr>
-          <w:rFonts w:ascii="Calibri" w:hAnsi="Calibri" w:cs="Arial"/>
-        </w:rPr>
-        <w:t>________________________________________________________________________________</w:t>
-      </w:r>
-    </w:p>
-    <w:p>
-      <w:pPr>
-        <w:spacing w:line="480" w:lineRule="auto"/>
-        <w:ind w:left="-709" w:right="-568"/>
-        <w:rPr>
-          <w:rFonts w:ascii="Calibri" w:hAnsi="Calibri" w:cs="Arial"/>
-        </w:rPr>
-      </w:pPr>
-      <w:r>
-        <w:rPr>
-          <w:rFonts w:ascii="Calibri" w:hAnsi="Calibri" w:cs="Arial"/>
-        </w:rPr>
-        <w:t>________________________________________________________________________________</w:t>
-      </w:r>
-    </w:p>
-    <w:p>
-      <w:pPr>
-        <w:spacing w:line="480" w:lineRule="auto"/>
-        <w:ind w:left="-709" w:right="-568"/>
-        <w:rPr>
-          <w:rFonts w:ascii="Calibri" w:hAnsi="Calibri" w:cs="Arial"/>
-        </w:rPr>
-      </w:pPr>
-      <w:r>
-        <w:rPr>
-          <w:rFonts w:ascii="Calibri" w:hAnsi="Calibri" w:cs="Arial"/>
-        </w:rPr>
-        <w:t>________________________________________________________________________________</w:t>
-      </w:r>
-    </w:p>
-    <w:p>
-      <w:pPr>
-        <w:spacing w:line="480" w:lineRule="auto"/>
-        <w:ind w:left="-709" w:right="-568"/>
-        <w:rPr>
-          <w:rFonts w:ascii="Calibri" w:hAnsi="Calibri" w:cs="Arial"/>
-        </w:rPr>
-      </w:pPr>
-      <w:r>
-        <w:rPr>
-          <w:rFonts w:ascii="Calibri" w:hAnsi="Calibri" w:cs="Arial"/>
-        </w:rPr>
-        <w:t>________________________________________________________________________________</w:t>
-      </w:r>
-    </w:p>
-    <w:p>
-      <w:pPr>
-        <w:spacing w:line="480" w:lineRule="auto"/>
-        <w:ind w:left="-709" w:right="-568"/>
-        <w:rPr>
-          <w:rFonts w:ascii="Calibri" w:hAnsi="Calibri" w:cs="Arial"/>
-        </w:rPr>
-      </w:pPr>
-      <w:r>
-        <w:rPr>
-          <w:rFonts w:ascii="Calibri" w:hAnsi="Calibri" w:cs="Arial"/>
-        </w:rPr>
-        <w:t>________________________________________________________________________________</w:t>
-      </w:r>
-    </w:p>
-    <w:p>
-      <w:pPr>
-        <w:spacing w:line="480" w:lineRule="auto"/>
-        <w:ind w:left="-709" w:right="-568"/>
-        <w:rPr>
-          <w:rFonts w:ascii="Calibri" w:hAnsi="Calibri" w:cs="Arial"/>
-        </w:rPr>
-      </w:pPr>
-      <w:r>
-        <w:rPr>
-          <w:rFonts w:ascii="Calibri" w:hAnsi="Calibri" w:cs="Arial"/>
-        </w:rPr>
-        <w:t>________________________________________________________________________________</w:t>
-      </w:r>
-    </w:p>
-    <w:p>
-      <w:pPr>
-        <w:spacing w:line="480" w:lineRule="auto"/>
-        <w:ind w:left="-709" w:right="-568"/>
-        <w:rPr>
-          <w:rFonts w:ascii="Calibri" w:hAnsi="Calibri" w:cs="Arial"/>
-        </w:rPr>
-      </w:pPr>
-      <w:r>
-        <w:rPr>
-          <w:rFonts w:ascii="Calibri" w:hAnsi="Calibri" w:cs="Arial"/>
-        </w:rPr>
-        <w:t>________________________________________________________________________________</w:t>
-      </w:r>
-    </w:p>
-    <w:p>
-      <w:pPr>
-        <w:spacing w:line="480" w:lineRule="auto"/>
-        <w:ind w:left="-709" w:right="-568"/>
-        <w:rPr>
-          <w:rFonts w:ascii="Calibri" w:hAnsi="Calibri" w:cs="Arial"/>
-        </w:rPr>
-      </w:pPr>
-      <w:r>
-        <w:rPr>
-          <w:rFonts w:ascii="Calibri" w:hAnsi="Calibri" w:cs="Arial"/>
-        </w:rPr>
-        <w:t>________________________________________________________________________________</w:t>
-      </w:r>
-    </w:p>
-    <w:p>
-      <w:pPr>
-        <w:spacing w:line="480" w:lineRule="auto"/>
-        <w:ind w:left="-709" w:right="-568"/>
-        <w:rPr>
-          <w:rFonts w:ascii="Calibri" w:hAnsi="Calibri" w:cs="Arial"/>
-        </w:rPr>
-      </w:pPr>
-      <w:r>
-        <w:rPr>
-          <w:rFonts w:ascii="Calibri" w:hAnsi="Calibri" w:cs="Arial"/>
-        </w:rPr>
-        <w:t>________________________________________________________________________________</w:t>
-      </w:r>
-    </w:p>
-    <w:p>
-      <w:pPr>
-        <w:spacing w:line="480" w:lineRule="auto"/>
-        <w:ind w:left="-709" w:right="-568"/>
-        <w:rPr>
-          <w:rFonts w:ascii="Calibri" w:hAnsi="Calibri" w:cs="Arial"/>
-        </w:rPr>
-      </w:pPr>
-      <w:r>
-        <w:rPr>
-          <w:rFonts w:ascii="Calibri" w:hAnsi="Calibri" w:cs="Arial"/>
-        </w:rPr>
-        <w:t>________________________________________________________________________________</w:t>
-      </w:r>
-    </w:p>
-    <w:p>
-      <w:pPr>
-        <w:ind w:left="-709" w:right="-568"/>
-        <w:rPr>
-          <w:rFonts w:ascii="Calibri" w:hAnsi="Calibri" w:cs="Arial"/>
-          <w:b/>
-          <w:bCs/>
-        </w:rPr>
-      </w:pPr>
-    </w:p>
-    <w:p>
-      <w:pPr>
-        <w:ind w:left="-709" w:right="-568"/>
-        <w:rPr>
-          <w:rFonts w:ascii="Calibri" w:hAnsi="Calibri" w:cs="Arial"/>
-          <w:b/>
-          <w:bCs/>
-        </w:rPr>
-      </w:pPr>
-    </w:p>
-    <w:p>
-      <w:pPr>
-        <w:ind w:left="-709" w:right="-568"/>
-        <w:rPr>
-          <w:rFonts w:ascii="Calibri" w:hAnsi="Calibri" w:cs="Arial"/>
-        </w:rPr>
-      </w:pPr>
-      <w:r>
-        <w:rPr>
-          <w:rFonts w:ascii="Calibri" w:hAnsi="Calibri" w:cs="Arial"/>
-          <w:b/>
-          <w:bCs/>
-        </w:rPr>
-        <w:t>Notes (and things to remember)</w:t>
-      </w:r>
-      <w:r>
-        <w:rPr>
-          <w:rFonts w:ascii="Calibri" w:hAnsi="Calibri" w:cs="Arial"/>
-        </w:rPr>
-        <w:t>:</w:t>
-      </w:r>
-    </w:p>
-    <w:p>
-      <w:pPr>
-        <w:ind w:left="-709" w:right="-568"/>
-        <w:rPr>
-          <w:rFonts w:ascii="Calibri" w:hAnsi="Calibri" w:cs="Arial"/>
-        </w:rPr>
-      </w:pPr>
-    </w:p>
-    <w:p>
-      <w:pPr>
-        <w:spacing w:line="480" w:lineRule="auto"/>
-        <w:ind w:left="-709" w:right="-568"/>
-        <w:rPr>
-          <w:rFonts w:ascii="Calibri" w:hAnsi="Calibri" w:cs="Arial"/>
-        </w:rPr>
-      </w:pPr>
-      <w:r>
-        <w:rPr>
-          <w:rFonts w:ascii="Calibri" w:hAnsi="Calibri" w:cs="Arial"/>
-        </w:rPr>
-        <w:t>________________________________________________________________________________</w:t>
-      </w:r>
-    </w:p>
-    <w:p>
-      <w:pPr>
-        <w:spacing w:line="480" w:lineRule="auto"/>
-        <w:ind w:left="-709" w:right="-568"/>
-        <w:rPr>
-          <w:rFonts w:ascii="Calibri" w:hAnsi="Calibri" w:cs="Arial"/>
-        </w:rPr>
-      </w:pPr>
-      <w:r>
-        <w:rPr>
-          <w:rFonts w:ascii="Calibri" w:hAnsi="Calibri" w:cs="Arial"/>
-        </w:rPr>
-        <w:t>________________________________________________________________________________</w:t>
-      </w:r>
-    </w:p>
-    <w:p>
-      <w:pPr>
-        <w:spacing w:line="480" w:lineRule="auto"/>
-        <w:ind w:left="-709" w:right="-568"/>
-        <w:rPr>
-          <w:rFonts w:ascii="Calibri" w:hAnsi="Calibri" w:cs="Arial"/>
-        </w:rPr>
-      </w:pPr>
-      <w:r>
-        <w:rPr>
-          <w:rFonts w:ascii="Calibri" w:hAnsi="Calibri" w:cs="Arial"/>
-        </w:rPr>
-        <w:t>________________________________________________________________________________</w:t>
-      </w:r>
-    </w:p>
-    <w:p>
-      <w:pPr>
-        <w:spacing w:line="480" w:lineRule="auto"/>
-        <w:ind w:left="-709" w:right="-568"/>
-        <w:rPr>
-          <w:rFonts w:ascii="Calibri" w:hAnsi="Calibri" w:cs="Arial"/>
-        </w:rPr>
-      </w:pPr>
-      <w:r>
-        <w:rPr>
-          <w:rFonts w:ascii="Calibri" w:hAnsi="Calibri" w:cs="Arial"/>
-        </w:rPr>
-        <w:t>________________________________________________________________________________</w:t>
-      </w:r>
-    </w:p>
-    <w:p>
-      <w:pPr>
-        <w:spacing w:line="480" w:lineRule="auto"/>
-        <w:ind w:left="-709" w:right="-568"/>
-        <w:rPr>
-          <w:rFonts w:ascii="Calibri" w:hAnsi="Calibri" w:cs="Arial"/>
-        </w:rPr>
-      </w:pPr>
-      <w:r>
-        <w:rPr>
-          <w:rFonts w:ascii="Calibri" w:hAnsi="Calibri" w:cs="Arial"/>
-        </w:rPr>
-        <w:t>________________________________________________________________________________</w:t>
-      </w:r>
-    </w:p>
-    <w:p>
-      <w:pPr>
-        <w:spacing w:line="480" w:lineRule="auto"/>
-        <w:ind w:left="-709" w:right="-568"/>
-        <w:rPr>
-          <w:rFonts w:ascii="Calibri" w:hAnsi="Calibri" w:cs="Arial"/>
-        </w:rPr>
-      </w:pPr>
-      <w:r>
-        <w:rPr>
-          <w:rFonts w:ascii="Calibri" w:hAnsi="Calibri" w:cs="Arial"/>
-        </w:rPr>
-        <w:t>________________________________________________________________________________</w:t>
-      </w:r>
-    </w:p>
-    <w:p>
-      <w:pPr>
-        <w:spacing w:line="480" w:lineRule="auto"/>
-        <w:ind w:left="-709" w:right="-568"/>
-        <w:rPr>
-          <w:rFonts w:ascii="Calibri" w:hAnsi="Calibri" w:cs="Arial"/>
-        </w:rPr>
-      </w:pPr>
-      <w:r>
-        <w:rPr>
-          <w:rFonts w:ascii="Calibri" w:hAnsi="Calibri" w:cs="Arial"/>
-        </w:rPr>
-        <w:t>________________________________________________________________________________</w:t>
-      </w:r>
-    </w:p>
-    <w:p>
-      <w:pPr>
-        <w:ind w:left="-709" w:right="-568"/>
-        <w:rPr>
-          <w:rFonts w:ascii="Calibri" w:hAnsi="Calibri" w:cs="Arial"/>
-          <w:b/>
-          <w:bCs/>
-        </w:rPr>
-      </w:pPr>
-    </w:p>
-    <w:p>
-      <w:pPr>
-        <w:ind w:left="-709" w:right="-568"/>
-        <w:rPr>
-          <w:rFonts w:ascii="Calibri" w:hAnsi="Calibri" w:cs="Arial"/>
-        </w:rPr>
-      </w:pPr>
-      <w:r>
-        <w:rPr>
-          <w:rFonts w:ascii="Calibri" w:hAnsi="Calibri" w:cs="Arial"/>
-          <w:b/>
-          <w:bCs/>
-        </w:rPr>
-        <w:t>Signed (and dated)</w:t>
-      </w:r>
-      <w:r>
-        <w:rPr>
-          <w:rFonts w:ascii="Calibri" w:hAnsi="Calibri" w:cs="Arial"/>
-        </w:rPr>
-        <w:t>:</w:t>
-      </w:r>
-    </w:p>
-    <w:p>
-      <w:pPr>
-        <w:ind w:left="-709" w:right="-568"/>
-        <w:rPr>
-          <w:rFonts w:ascii="Calibri" w:hAnsi="Calibri" w:cs="Arial"/>
-        </w:rPr>
-      </w:pPr>
-    </w:p>
-    <w:p>
-      <w:pPr>
-        <w:ind w:left="-709" w:right="-568"/>
-        <w:rPr>
-          <w:rFonts w:ascii="Calibri" w:hAnsi="Calibri" w:cs="Arial"/>
-          <w:b/>
-          <w:bCs/>
-        </w:rPr>
-      </w:pPr>
-      <w:r>
-        <w:rPr>
-          <w:rFonts w:ascii="Calibri" w:hAnsi="Calibri" w:cs="Arial"/>
-        </w:rPr>
-        <w:t>_______________________________________    _______________________________________</w:t>
+        <w:ind w:left="-709" w:right="-568"/>
+        <w:rPr>
+          <w:rFonts w:ascii="Calibri" w:hAnsi="Calibri" w:cs="Arial"/>
+          <w:b/>
+          <w:bCs/>
+        </w:rPr>
+      </w:pPr>
+      <w:r>
+        <w:rPr>
+          <w:rFonts w:ascii="Calibri" w:hAnsi="Calibri" w:cs="Arial"/>
+        </w:rPr>
+        <w:t>Aleksandra Skarzycka 23/04/26</w:t>
+      </w:r>
+      <w:r>
+        <w:rPr>
+          <w:rFonts w:ascii="Calibri" w:hAnsi="Calibri" w:cs="Arial"/>
+        </w:rPr>
+        <w:t xml:space="preserve">    </w:t>
+      </w:r>
+      <w:r>
+        <w:rPr>
+          <w:rFonts w:ascii="Calibri" w:hAnsi="Calibri" w:cs="Arial"/>
+        </w:rPr>
+        <w:tab/>
+      </w:r>
+      <w:r>
+        <w:rPr>
+          <w:rFonts w:ascii="Calibri" w:hAnsi="Calibri" w:cs="Arial"/>
+        </w:rPr>
+        <w:tab/>
+      </w:r>
+      <w:r>
+        <w:rPr>
+          <w:rFonts w:ascii="Calibri" w:hAnsi="Calibri" w:cs="Arial"/>
+        </w:rPr>
+        <w:tab/>
+      </w:r>
+      <w:r>
+        <w:rPr>
+          <w:rFonts w:ascii="Calibri" w:hAnsi="Calibri" w:cs="Arial"/>
+        </w:rPr>
+        <w:tab/>
       </w:r>
     </w:p>
     <w:p>
@@ -8574,7 +8189,15 @@
           <w:sz w:val="28"/>
           <w:szCs w:val="28"/>
         </w:rPr>
-        <w:t>: ______________________________</w:t>
+        <w:t xml:space="preserve">: </w:t>
+      </w:r>
+      <w:r>
+        <w:rPr>
+          <w:rFonts w:ascii="Calibri" w:hAnsi="Calibri" w:cs="Arial"/>
+          <w:sz w:val="28"/>
+          <w:szCs w:val="28"/>
+        </w:rPr>
+        <w:t>21/04/26</w:t>
       </w:r>
     </w:p>
     <w:p>
@@ -8642,6 +8265,78 @@
         <w:rPr>
           <w:rFonts w:ascii="Calibri" w:hAnsi="Calibri" w:cs="Arial"/>
         </w:rPr>
+        <w:t xml:space="preserve">Attempted to fix login page and account page error redirects, made small changes following a Netlify support guide and it </w:t>
+      </w:r>
+      <w:r>
+        <w:rPr>
+          <w:rFonts w:ascii="Calibri" w:hAnsi="Calibri" w:cs="Arial"/>
+        </w:rPr>
+        <w:t>does not bring me to an error page, it keeps me on the same page without letting me access the login or account page.</w:t>
+      </w:r>
+    </w:p>
+    <w:p>
+      <w:pPr>
+        <w:ind w:left="-709" w:right="-568"/>
+        <w:rPr>
+          <w:rFonts w:ascii="Calibri" w:hAnsi="Calibri" w:cs="Arial"/>
+          <w:b/>
+          <w:bCs/>
+        </w:rPr>
+      </w:pPr>
+    </w:p>
+    <w:p>
+      <w:pPr>
+        <w:ind w:left="-709" w:right="-568"/>
+        <w:rPr>
+          <w:rFonts w:ascii="Calibri" w:hAnsi="Calibri" w:cs="Arial"/>
+          <w:b/>
+          <w:bCs/>
+        </w:rPr>
+      </w:pPr>
+    </w:p>
+    <w:p>
+      <w:pPr>
+        <w:ind w:left="-709" w:right="-568"/>
+        <w:rPr>
+          <w:rFonts w:ascii="Calibri" w:hAnsi="Calibri" w:cs="Arial"/>
+        </w:rPr>
+      </w:pPr>
+      <w:r>
+        <w:rPr>
+          <w:rFonts w:ascii="Calibri" w:hAnsi="Calibri" w:cs="Arial"/>
+          <w:b/>
+          <w:bCs/>
+        </w:rPr>
+        <w:lastRenderedPageBreak/>
+        <w:t>Notes (and things to remember)</w:t>
+      </w:r>
+      <w:r>
+        <w:rPr>
+          <w:rFonts w:ascii="Calibri" w:hAnsi="Calibri" w:cs="Arial"/>
+        </w:rPr>
+        <w:t>:</w:t>
+      </w:r>
+    </w:p>
+    <w:p>
+      <w:pPr>
+        <w:ind w:left="-709" w:right="-568"/>
+        <w:rPr>
+          <w:rFonts w:ascii="Calibri" w:hAnsi="Calibri" w:cs="Arial"/>
+        </w:rPr>
+      </w:pPr>
+    </w:p>
+    <w:p>
+      <w:pPr>
+        <w:spacing w:line="480" w:lineRule="auto"/>
+        <w:ind w:left="-709" w:right="-568"/>
+        <w:rPr>
+          <w:rFonts w:ascii="Calibri" w:hAnsi="Calibri" w:cs="Arial"/>
+        </w:rPr>
+      </w:pPr>
+      <w:r>
+        <w:rPr>
+          <w:rFonts w:ascii="Calibri" w:hAnsi="Calibri" w:cs="Arial"/>
+        </w:rPr>
         <w:t>________________________________________________________________________________</w:t>
       </w:r>
     </w:p>
@@ -8737,83 +8432,28 @@
     </w:p>
     <w:p>
       <w:pPr>
-        <w:spacing w:line="480" w:lineRule="auto"/>
-        <w:ind w:left="-709" w:right="-568"/>
-        <w:rPr>
-          <w:rFonts w:ascii="Calibri" w:hAnsi="Calibri" w:cs="Arial"/>
-        </w:rPr>
-      </w:pPr>
-      <w:r>
-        <w:rPr>
-          <w:rFonts w:ascii="Calibri" w:hAnsi="Calibri" w:cs="Arial"/>
-        </w:rPr>
-        <w:t>________________________________________________________________________________</w:t>
-      </w:r>
-    </w:p>
-    <w:p>
-      <w:pPr>
-        <w:spacing w:line="480" w:lineRule="auto"/>
-        <w:ind w:left="-709" w:right="-568"/>
-        <w:rPr>
-          <w:rFonts w:ascii="Calibri" w:hAnsi="Calibri" w:cs="Arial"/>
-        </w:rPr>
-      </w:pPr>
-      <w:r>
-        <w:rPr>
-          <w:rFonts w:ascii="Calibri" w:hAnsi="Calibri" w:cs="Arial"/>
-        </w:rPr>
-        <w:t>________________________________________________________________________________</w:t>
-      </w:r>
-    </w:p>
-    <w:p>
-      <w:pPr>
-        <w:spacing w:line="480" w:lineRule="auto"/>
-        <w:ind w:left="-709" w:right="-568"/>
-        <w:rPr>
-          <w:rFonts w:ascii="Calibri" w:hAnsi="Calibri" w:cs="Arial"/>
-        </w:rPr>
-      </w:pPr>
-      <w:r>
-        <w:rPr>
-          <w:rFonts w:ascii="Calibri" w:hAnsi="Calibri" w:cs="Arial"/>
-        </w:rPr>
-        <w:t>________________________________________________________________________________</w:t>
-      </w:r>
-    </w:p>
-    <w:p>
-      <w:pPr>
-        <w:ind w:left="-709" w:right="-568"/>
-        <w:rPr>
-          <w:rFonts w:ascii="Calibri" w:hAnsi="Calibri" w:cs="Arial"/>
-          <w:b/>
-          <w:bCs/>
-        </w:rPr>
-      </w:pPr>
-    </w:p>
-    <w:p>
-      <w:pPr>
-        <w:ind w:left="-709" w:right="-568"/>
-        <w:rPr>
-          <w:rFonts w:ascii="Calibri" w:hAnsi="Calibri" w:cs="Arial"/>
-          <w:b/>
-          <w:bCs/>
-        </w:rPr>
-      </w:pPr>
-    </w:p>
-    <w:p>
-      <w:pPr>
-        <w:ind w:left="-709" w:right="-568"/>
-        <w:rPr>
-          <w:rFonts w:ascii="Calibri" w:hAnsi="Calibri" w:cs="Arial"/>
-        </w:rPr>
-      </w:pPr>
-      <w:r>
-        <w:rPr>
-          <w:rFonts w:ascii="Calibri" w:hAnsi="Calibri" w:cs="Arial"/>
-          <w:b/>
-          <w:bCs/>
-        </w:rPr>
-        <w:t>Notes (and things to remember)</w:t>
+        <w:ind w:left="-709" w:right="-568"/>
+        <w:rPr>
+          <w:rFonts w:ascii="Calibri" w:hAnsi="Calibri" w:cs="Arial"/>
+          <w:b/>
+          <w:bCs/>
+        </w:rPr>
+      </w:pPr>
+    </w:p>
+    <w:p>
+      <w:pPr>
+        <w:ind w:left="-709" w:right="-568"/>
+        <w:rPr>
+          <w:rFonts w:ascii="Calibri" w:hAnsi="Calibri" w:cs="Arial"/>
+        </w:rPr>
+      </w:pPr>
+      <w:r>
+        <w:rPr>
+          <w:rFonts w:ascii="Calibri" w:hAnsi="Calibri" w:cs="Arial"/>
+          <w:b/>
+          <w:bCs/>
+        </w:rPr>
+        <w:t>Signed (and dated)</w:t>
       </w:r>
       <w:r>
         <w:rPr>
@@ -8832,163 +8472,48 @@
     </w:p>
     <w:p>
       <w:pPr>
-        <w:spacing w:line="480" w:lineRule="auto"/>
-        <w:ind w:left="-709" w:right="-568"/>
-        <w:rPr>
-          <w:rFonts w:ascii="Calibri" w:hAnsi="Calibri" w:cs="Arial"/>
-        </w:rPr>
-      </w:pPr>
-      <w:r>
-        <w:rPr>
-          <w:rFonts w:ascii="Calibri" w:hAnsi="Calibri" w:cs="Arial"/>
-        </w:rPr>
-        <w:t>________________________________________________________________________________</w:t>
-      </w:r>
-    </w:p>
-    <w:p>
-      <w:pPr>
-        <w:spacing w:line="480" w:lineRule="auto"/>
-        <w:ind w:left="-709" w:right="-568"/>
-        <w:rPr>
-          <w:rFonts w:ascii="Calibri" w:hAnsi="Calibri" w:cs="Arial"/>
-        </w:rPr>
-      </w:pPr>
-      <w:r>
-        <w:rPr>
-          <w:rFonts w:ascii="Calibri" w:hAnsi="Calibri" w:cs="Arial"/>
-        </w:rPr>
-        <w:t>________________________________________________________________________________</w:t>
-      </w:r>
-    </w:p>
-    <w:p>
-      <w:pPr>
-        <w:spacing w:line="480" w:lineRule="auto"/>
-        <w:ind w:left="-709" w:right="-568"/>
-        <w:rPr>
-          <w:rFonts w:ascii="Calibri" w:hAnsi="Calibri" w:cs="Arial"/>
-        </w:rPr>
-      </w:pPr>
-      <w:r>
-        <w:rPr>
-          <w:rFonts w:ascii="Calibri" w:hAnsi="Calibri" w:cs="Arial"/>
-        </w:rPr>
-        <w:t>________________________________________________________________________________</w:t>
-      </w:r>
-    </w:p>
-    <w:p>
-      <w:pPr>
-        <w:spacing w:line="480" w:lineRule="auto"/>
-        <w:ind w:left="-709" w:right="-568"/>
-        <w:rPr>
-          <w:rFonts w:ascii="Calibri" w:hAnsi="Calibri" w:cs="Arial"/>
-        </w:rPr>
-      </w:pPr>
-      <w:r>
-        <w:rPr>
-          <w:rFonts w:ascii="Calibri" w:hAnsi="Calibri" w:cs="Arial"/>
-        </w:rPr>
-        <w:t>________________________________________________________________________________</w:t>
-      </w:r>
-    </w:p>
-    <w:p>
-      <w:pPr>
-        <w:spacing w:line="480" w:lineRule="auto"/>
-        <w:ind w:left="-709" w:right="-568"/>
-        <w:rPr>
-          <w:rFonts w:ascii="Calibri" w:hAnsi="Calibri" w:cs="Arial"/>
-        </w:rPr>
-      </w:pPr>
-      <w:r>
-        <w:rPr>
-          <w:rFonts w:ascii="Calibri" w:hAnsi="Calibri" w:cs="Arial"/>
-        </w:rPr>
-        <w:t>________________________________________________________________________________</w:t>
-      </w:r>
-    </w:p>
-    <w:p>
-      <w:pPr>
-        <w:spacing w:line="480" w:lineRule="auto"/>
-        <w:ind w:left="-709" w:right="-568"/>
-        <w:rPr>
-          <w:rFonts w:ascii="Calibri" w:hAnsi="Calibri" w:cs="Arial"/>
-        </w:rPr>
-      </w:pPr>
-      <w:r>
-        <w:rPr>
-          <w:rFonts w:ascii="Calibri" w:hAnsi="Calibri" w:cs="Arial"/>
-        </w:rPr>
-        <w:t>________________________________________________________________________________</w:t>
-      </w:r>
-    </w:p>
-    <w:p>
-      <w:pPr>
-        <w:spacing w:line="480" w:lineRule="auto"/>
-        <w:ind w:left="-709" w:right="-568"/>
-        <w:rPr>
-          <w:rFonts w:ascii="Calibri" w:hAnsi="Calibri" w:cs="Arial"/>
-        </w:rPr>
-      </w:pPr>
-      <w:r>
-        <w:rPr>
-          <w:rFonts w:ascii="Calibri" w:hAnsi="Calibri" w:cs="Arial"/>
-        </w:rPr>
-        <w:t>________________________________________________________________________________</w:t>
-      </w:r>
-    </w:p>
-    <w:p>
-      <w:pPr>
-        <w:ind w:left="-709" w:right="-568"/>
-        <w:rPr>
-          <w:rFonts w:ascii="Calibri" w:hAnsi="Calibri" w:cs="Arial"/>
-          <w:b/>
-          <w:bCs/>
-        </w:rPr>
-      </w:pPr>
-    </w:p>
-    <w:p>
-      <w:pPr>
-        <w:ind w:left="-709" w:right="-568"/>
-        <w:rPr>
-          <w:rFonts w:ascii="Calibri" w:hAnsi="Calibri" w:cs="Arial"/>
-        </w:rPr>
-      </w:pPr>
-      <w:r>
-        <w:rPr>
-          <w:rFonts w:ascii="Calibri" w:hAnsi="Calibri" w:cs="Arial"/>
-          <w:b/>
-          <w:bCs/>
-        </w:rPr>
-        <w:t>Signed (and dated)</w:t>
-      </w:r>
-      <w:r>
-        <w:rPr>
-          <w:rFonts w:ascii="Calibri" w:hAnsi="Calibri" w:cs="Arial"/>
-        </w:rPr>
-        <w:t>:</w:t>
-      </w:r>
-    </w:p>
-    <w:p>
-      <w:pPr>
-        <w:ind w:left="-709" w:right="-568"/>
-        <w:rPr>
-          <w:rFonts w:ascii="Calibri" w:hAnsi="Calibri" w:cs="Arial"/>
-        </w:rPr>
-      </w:pPr>
-    </w:p>
-    <w:p>
-      <w:pPr>
-        <w:ind w:left="-709" w:right="-568"/>
-        <w:rPr>
-          <w:rFonts w:ascii="Calibri" w:hAnsi="Calibri" w:cs="Arial"/>
-          <w:b/>
-          <w:bCs/>
-        </w:rPr>
-      </w:pPr>
-      <w:r>
-        <w:rPr>
-          <w:rFonts w:ascii="Calibri" w:hAnsi="Calibri" w:cs="Arial"/>
-        </w:rPr>
-        <w:t>_______________________________________    _______________________________________</w:t>
+        <w:ind w:left="-709" w:right="-568"/>
+        <w:rPr>
+          <w:rFonts w:ascii="Calibri" w:hAnsi="Calibri" w:cs="Arial"/>
+          <w:b/>
+          <w:bCs/>
+        </w:rPr>
+      </w:pPr>
+      <w:r>
+        <w:rPr>
+          <w:rFonts w:ascii="Calibri" w:hAnsi="Calibri" w:cs="Arial"/>
+        </w:rPr>
+        <w:t>Aleksandra Skarzycka 23/04/26</w:t>
+      </w:r>
+      <w:r>
+        <w:rPr>
+          <w:rFonts w:ascii="Calibri" w:hAnsi="Calibri" w:cs="Arial"/>
+        </w:rPr>
+        <w:t xml:space="preserve">    </w:t>
+      </w:r>
+      <w:r>
+        <w:rPr>
+          <w:rFonts w:ascii="Calibri" w:hAnsi="Calibri" w:cs="Arial"/>
+        </w:rPr>
+        <w:tab/>
+      </w:r>
+      <w:r>
+        <w:rPr>
+          <w:rFonts w:ascii="Calibri" w:hAnsi="Calibri" w:cs="Arial"/>
+        </w:rPr>
+        <w:tab/>
+      </w:r>
+      <w:r>
+        <w:rPr>
+          <w:rFonts w:ascii="Calibri" w:hAnsi="Calibri" w:cs="Arial"/>
+        </w:rPr>
+        <w:tab/>
+      </w:r>
+      <w:r>
+        <w:rPr>
+          <w:rFonts w:ascii="Calibri" w:hAnsi="Calibri" w:cs="Arial"/>
+        </w:rPr>
+        <w:tab/>
       </w:r>
     </w:p>
     <w:p>
@@ -9330,22 +8855,22 @@
         <w:rPr>
           <w:rFonts w:ascii="Calibri" w:hAnsi="Calibri" w:cs="Arial"/>
         </w:rPr>
+        <w:t>________________________________________________________________________________</w:t>
+      </w:r>
+    </w:p>
+    <w:p>
+      <w:pPr>
+        <w:spacing w:line="480" w:lineRule="auto"/>
+        <w:ind w:left="-709" w:right="-568"/>
+        <w:rPr>
+          <w:rFonts w:ascii="Calibri" w:hAnsi="Calibri" w:cs="Arial"/>
+        </w:rPr>
+      </w:pPr>
+      <w:r>
+        <w:rPr>
+          <w:rFonts w:ascii="Calibri" w:hAnsi="Calibri" w:cs="Arial"/>
+        </w:rPr>
         <w:lastRenderedPageBreak/>
-        <w:t>________________________________________________________________________________</w:t>
-      </w:r>
-    </w:p>
-    <w:p>
-      <w:pPr>
-        <w:spacing w:line="480" w:lineRule="auto"/>
-        <w:ind w:left="-709" w:right="-568"/>
-        <w:rPr>
-          <w:rFonts w:ascii="Calibri" w:hAnsi="Calibri" w:cs="Arial"/>
-        </w:rPr>
-      </w:pPr>
-      <w:r>
-        <w:rPr>
-          <w:rFonts w:ascii="Calibri" w:hAnsi="Calibri" w:cs="Arial"/>
-        </w:rPr>
         <w:t>________________________________________________________________________________</w:t>
       </w:r>
     </w:p>
@@ -9515,7 +9040,7 @@
 </file>
 
 <file path=word/endnotes.xml><?xml version="1.0" encoding="utf-8"?>
-<w:endnotes xmlns:wpc="http://schemas.microsoft.com/office/word/2010/wordprocessingCanvas" xmlns:cx="http://schemas.microsoft.com/office/drawing/2014/chartex" xmlns:cx1="http://schemas.microsoft.com/office/drawing/2015/9/8/chartex" xmlns:cx2="http://schemas.microsoft.com/office/drawing/2015/10/21/chartex" xmlns:cx3="http://schemas.microsoft.com/office/drawing/2016/5/9/chartex" xmlns:cx4="http://schemas.microsoft.com/office/drawing/2016/5/10/chartex" xmlns:cx5="http://schemas.microsoft.com/office/drawing/2016/5/11/chartex" xmlns:cx6="http://schemas.microsoft.com/office/drawing/2016/5/12/chartex" xmlns:cx7="http://schemas.microsoft.com/office/drawing/2016/5/13/chartex" xmlns:cx8="http://schemas.microsoft.com/office/drawing/2016/5/14/chartex" xmlns:mc="http://schemas.openxmlformats.org/markup-compatibility/2006" xmlns:aink="http://schemas.microsoft.com/office/drawing/2016/ink" xmlns:am3d="http://schemas.microsoft.com/office/drawing/2017/model3d" xmlns:o="urn:schemas-microsoft-com:office:office" xmlns:r="http://schemas.openxmlformats.org/officeDocument/2006/relationships" xmlns:m="http://schemas.openxmlformats.org/officeDocument/2006/math" xmlns:v="urn:schemas-microsoft-com:vml" xmlns:wp14="http://schemas.microsoft.com/office/word/2010/wordprocessingDrawing" xmlns:wp="http://schemas.openxmlformats.org/drawingml/2006/wordprocessingDrawing" xmlns:w10="urn:schemas-microsoft-com:office:word" xmlns:w="http://schemas.openxmlformats.org/wordprocessingml/2006/main" xmlns:w14="http://schemas.microsoft.com/office/word/2010/wordml" xmlns:w15="http://schemas.microsoft.com/office/word/2012/wordml" xmlns:w16cex="http://schemas.microsoft.com/office/word/2018/wordml/cex" xmlns:w16cid="http://schemas.microsoft.com/office/word/2016/wordml/cid" xmlns:w16="http://schemas.microsoft.com/office/word/2018/wordml" xmlns:w16sdtdh="http://schemas.microsoft.com/office/word/2020/wordml/sdtdatahash" xmlns:w16se="http://schemas.microsoft.com/office/word/2015/wordml/symex" xmlns:wpg="http://schemas.microsoft.com/office/word/2010/wordprocessingGroup" xmlns:wpi="http://schemas.microsoft.com/office/word/2010/wordprocessingInk" xmlns:wne="http://schemas.microsoft.com/office/word/2006/wordml" xmlns:wps="http://schemas.microsoft.com/office/word/2010/wordprocessingShape" mc:Ignorable="w14 w15 w16se w16cid w16 w16cex w16sdtdh wp14">
+<w:endnotes xmlns:wpc="http://schemas.microsoft.com/office/word/2010/wordprocessingCanvas" xmlns:cx="http://schemas.microsoft.com/office/drawing/2014/chartex" xmlns:cx1="http://schemas.microsoft.com/office/drawing/2015/9/8/chartex" xmlns:cx2="http://schemas.microsoft.com/office/drawing/2015/10/21/chartex" xmlns:cx3="http://schemas.microsoft.com/office/drawing/2016/5/9/chartex" xmlns:cx4="http://schemas.microsoft.com/office/drawing/2016/5/10/chartex" xmlns:cx5="http://schemas.microsoft.com/office/drawing/2016/5/11/chartex" xmlns:cx6="http://schemas.microsoft.com/office/drawing/2016/5/12/chartex" xmlns:cx7="http://schemas.microsoft.com/office/drawing/2016/5/13/chartex" xmlns:cx8="http://schemas.microsoft.com/office/drawing/2016/5/14/chartex" xmlns:mc="http://schemas.openxmlformats.org/markup-compatibility/2006" xmlns:aink="http://schemas.microsoft.com/office/drawing/2016/ink" xmlns:am3d="http://schemas.microsoft.com/office/drawing/2017/model3d" xmlns:o="urn:schemas-microsoft-com:office:office" xmlns:oel="http://schemas.microsoft.com/office/2019/extlst" xmlns:r="http://schemas.openxmlformats.org/officeDocument/2006/relationships" xmlns:m="http://schemas.openxmlformats.org/officeDocument/2006/math" xmlns:v="urn:schemas-microsoft-com:vml" xmlns:wp14="http://schemas.microsoft.com/office/word/2010/wordprocessingDrawing" xmlns:wp="http://schemas.openxmlformats.org/drawingml/2006/wordprocessingDrawing" xmlns:w10="urn:schemas-microsoft-com:office:word" xmlns:w="http://schemas.openxmlformats.org/wordprocessingml/2006/main" xmlns:w14="http://schemas.microsoft.com/office/word/2010/wordml" xmlns:w15="http://schemas.microsoft.com/office/word/2012/wordml" xmlns:w16cex="http://schemas.microsoft.com/office/word/2018/wordml/cex" xmlns:w16cid="http://schemas.microsoft.com/office/word/2016/wordml/cid" xmlns:w16="http://schemas.microsoft.com/office/word/2018/wordml" xmlns:w16du="http://schemas.microsoft.com/office/word/2023/wordml/word16du" xmlns:w16sdtdh="http://schemas.microsoft.com/office/word/2020/wordml/sdtdatahash" xmlns:w16sdtfl="http://schemas.microsoft.com/office/word/2024/wordml/sdtformatlock" xmlns:w16se="http://schemas.microsoft.com/office/word/2015/wordml/symex" xmlns:wpg="http://schemas.microsoft.com/office/word/2010/wordprocessingGroup" xmlns:wpi="http://schemas.microsoft.com/office/word/2010/wordprocessingInk" xmlns:wne="http://schemas.microsoft.com/office/word/2006/wordml" xmlns:wps="http://schemas.microsoft.com/office/word/2010/wordprocessingShape" mc:Ignorable="w14 w15 w16se w16cid w16 w16cex w16sdtdh w16sdtfl w16du wp14">
   <w:endnote w:type="separator" w:id="-1">
     <w:p>
       <w:r>
@@ -9537,7 +9062,7 @@
 </file>
 
 <file path=word/footer1.xml><?xml version="1.0" encoding="utf-8"?>
-<w:ftr xmlns:wpc="http://schemas.microsoft.com/office/word/2010/wordprocessingCanvas" xmlns:cx="http://schemas.microsoft.com/office/drawing/2014/chartex" xmlns:cx1="http://schemas.microsoft.com/office/drawing/2015/9/8/chartex" xmlns:cx2="http://schemas.microsoft.com/office/drawing/2015/10/21/chartex" xmlns:cx3="http://schemas.microsoft.com/office/drawing/2016/5/9/chartex" xmlns:cx4="http://schemas.microsoft.com/office/drawing/2016/5/10/chartex" xmlns:cx5="http://schemas.microsoft.com/office/drawing/2016/5/11/chartex" xmlns:cx6="http://schemas.microsoft.com/office/drawing/2016/5/12/chartex" xmlns:cx7="http://schemas.microsoft.com/office/drawing/2016/5/13/chartex" xmlns:cx8="http://schemas.microsoft.com/office/drawing/2016/5/14/chartex" xmlns:mc="http://schemas.openxmlformats.org/markup-compatibility/2006" xmlns:aink="http://schemas.microsoft.com/office/drawing/2016/ink" xmlns:am3d="http://schemas.microsoft.com/office/drawing/2017/model3d" xmlns:o="urn:schemas-microsoft-com:office:office" xmlns:r="http://schemas.openxmlformats.org/officeDocument/2006/relationships" xmlns:m="http://schemas.openxmlformats.org/officeDocument/2006/math" xmlns:v="urn:schemas-microsoft-com:vml" xmlns:wp14="http://schemas.microsoft.com/office/word/2010/wordprocessingDrawing" xmlns:wp="http://schemas.openxmlformats.org/drawingml/2006/wordprocessingDrawing" xmlns:w10="urn:schemas-microsoft-com:office:word" xmlns:w="http://schemas.openxmlformats.org/wordprocessingml/2006/main" xmlns:w14="http://schemas.microsoft.com/office/word/2010/wordml" xmlns:w15="http://schemas.microsoft.com/office/word/2012/wordml" xmlns:w16cex="http://schemas.microsoft.com/office/word/2018/wordml/cex" xmlns:w16cid="http://schemas.microsoft.com/office/word/2016/wordml/cid" xmlns:w16="http://schemas.microsoft.com/office/word/2018/wordml" xmlns:w16sdtdh="http://schemas.microsoft.com/office/word/2020/wordml/sdtdatahash" xmlns:w16se="http://schemas.microsoft.com/office/word/2015/wordml/symex" xmlns:wpg="http://schemas.microsoft.com/office/word/2010/wordprocessingGroup" xmlns:wpi="http://schemas.microsoft.com/office/word/2010/wordprocessingInk" xmlns:wne="http://schemas.microsoft.com/office/word/2006/wordml" xmlns:wps="http://schemas.microsoft.com/office/word/2010/wordprocessingShape" mc:Ignorable="w14 w15 w16se w16cid w16 w16cex w16sdtdh wp14">
+<w:ftr xmlns:wpc="http://schemas.microsoft.com/office/word/2010/wordprocessingCanvas" xmlns:cx="http://schemas.microsoft.com/office/drawing/2014/chartex" xmlns:cx1="http://schemas.microsoft.com/office/drawing/2015/9/8/chartex" xmlns:cx2="http://schemas.microsoft.com/office/drawing/2015/10/21/chartex" xmlns:cx3="http://schemas.microsoft.com/office/drawing/2016/5/9/chartex" xmlns:cx4="http://schemas.microsoft.com/office/drawing/2016/5/10/chartex" xmlns:cx5="http://schemas.microsoft.com/office/drawing/2016/5/11/chartex" xmlns:cx6="http://schemas.microsoft.com/office/drawing/2016/5/12/chartex" xmlns:cx7="http://schemas.microsoft.com/office/drawing/2016/5/13/chartex" xmlns:cx8="http://schemas.microsoft.com/office/drawing/2016/5/14/chartex" xmlns:mc="http://schemas.openxmlformats.org/markup-compatibility/2006" xmlns:aink="http://schemas.microsoft.com/office/drawing/2016/ink" xmlns:am3d="http://schemas.microsoft.com/office/drawing/2017/model3d" xmlns:o="urn:schemas-microsoft-com:office:office" xmlns:oel="http://schemas.microsoft.com/office/2019/extlst" xmlns:r="http://schemas.openxmlformats.org/officeDocument/2006/relationships" xmlns:m="http://schemas.openxmlformats.org/officeDocument/2006/math" xmlns:v="urn:schemas-microsoft-com:vml" xmlns:wp14="http://schemas.microsoft.com/office/word/2010/wordprocessingDrawing" xmlns:wp="http://schemas.openxmlformats.org/drawingml/2006/wordprocessingDrawing" xmlns:w10="urn:schemas-microsoft-com:office:word" xmlns:w="http://schemas.openxmlformats.org/wordprocessingml/2006/main" xmlns:w14="http://schemas.microsoft.com/office/word/2010/wordml" xmlns:w15="http://schemas.microsoft.com/office/word/2012/wordml" xmlns:w16cex="http://schemas.microsoft.com/office/word/2018/wordml/cex" xmlns:w16cid="http://schemas.microsoft.com/office/word/2016/wordml/cid" xmlns:w16="http://schemas.microsoft.com/office/word/2018/wordml" xmlns:w16du="http://schemas.microsoft.com/office/word/2023/wordml/word16du" xmlns:w16sdtdh="http://schemas.microsoft.com/office/word/2020/wordml/sdtdatahash" xmlns:w16sdtfl="http://schemas.microsoft.com/office/word/2024/wordml/sdtformatlock" xmlns:w16se="http://schemas.microsoft.com/office/word/2015/wordml/symex" xmlns:wpg="http://schemas.microsoft.com/office/word/2010/wordprocessingGroup" xmlns:wpi="http://schemas.microsoft.com/office/word/2010/wordprocessingInk" xmlns:wne="http://schemas.microsoft.com/office/word/2006/wordml" xmlns:wps="http://schemas.microsoft.com/office/word/2010/wordprocessingShape" mc:Ignorable="w14 w15 w16se w16cid w16 w16cex w16sdtdh w16sdtfl w16du wp14">
   <w:p>
     <w:pPr>
       <w:pStyle w:val="Footer"/>
@@ -9547,7 +9072,7 @@
 </file>
 
 <file path=word/footer2.xml><?xml version="1.0" encoding="utf-8"?>
-<w:ftr xmlns:wpc="http://schemas.microsoft.com/office/word/2010/wordprocessingCanvas" xmlns:cx="http://schemas.microsoft.com/office/drawing/2014/chartex" xmlns:cx1="http://schemas.microsoft.com/office/drawing/2015/9/8/chartex" xmlns:cx2="http://schemas.microsoft.com/office/drawing/2015/10/21/chartex" xmlns:cx3="http://schemas.microsoft.com/office/drawing/2016/5/9/chartex" xmlns:cx4="http://schemas.microsoft.com/office/drawing/2016/5/10/chartex" xmlns:cx5="http://schemas.microsoft.com/office/drawing/2016/5/11/chartex" xmlns:cx6="http://schemas.microsoft.com/office/drawing/2016/5/12/chartex" xmlns:cx7="http://schemas.microsoft.com/office/drawing/2016/5/13/chartex" xmlns:cx8="http://schemas.microsoft.com/office/drawing/2016/5/14/chartex" xmlns:mc="http://schemas.openxmlformats.org/markup-compatibility/2006" xmlns:aink="http://schemas.microsoft.com/office/drawing/2016/ink" xmlns:am3d="http://schemas.microsoft.com/office/drawing/2017/model3d" xmlns:o="urn:schemas-microsoft-com:office:office" xmlns:r="http://schemas.openxmlformats.org/officeDocument/2006/relationships" xmlns:m="http://schemas.openxmlformats.org/officeDocument/2006/math" xmlns:v="urn:schemas-microsoft-com:vml" xmlns:wp14="http://schemas.microsoft.com/office/word/2010/wordprocessingDrawing" xmlns:wp="http://schemas.openxmlformats.org/drawingml/2006/wordprocessingDrawing" xmlns:w10="urn:schemas-microsoft-com:office:word" xmlns:w="http://schemas.openxmlformats.org/wordprocessingml/2006/main" xmlns:w14="http://schemas.microsoft.com/office/word/2010/wordml" xmlns:w15="http://schemas.microsoft.com/office/word/2012/wordml" xmlns:w16cex="http://schemas.microsoft.com/office/word/2018/wordml/cex" xmlns:w16cid="http://schemas.microsoft.com/office/word/2016/wordml/cid" xmlns:w16="http://schemas.microsoft.com/office/word/2018/wordml" xmlns:w16sdtdh="http://schemas.microsoft.com/office/word/2020/wordml/sdtdatahash" xmlns:w16se="http://schemas.microsoft.com/office/word/2015/wordml/symex" xmlns:wpg="http://schemas.microsoft.com/office/word/2010/wordprocessingGroup" xmlns:wpi="http://schemas.microsoft.com/office/word/2010/wordprocessingInk" xmlns:wne="http://schemas.microsoft.com/office/word/2006/wordml" xmlns:wps="http://schemas.microsoft.com/office/word/2010/wordprocessingShape" mc:Ignorable="w14 w15 w16se w16cid w16 w16cex w16sdtdh wp14">
+<w:ftr xmlns:wpc="http://schemas.microsoft.com/office/word/2010/wordprocessingCanvas" xmlns:cx="http://schemas.microsoft.com/office/drawing/2014/chartex" xmlns:cx1="http://schemas.microsoft.com/office/drawing/2015/9/8/chartex" xmlns:cx2="http://schemas.microsoft.com/office/drawing/2015/10/21/chartex" xmlns:cx3="http://schemas.microsoft.com/office/drawing/2016/5/9/chartex" xmlns:cx4="http://schemas.microsoft.com/office/drawing/2016/5/10/chartex" xmlns:cx5="http://schemas.microsoft.com/office/drawing/2016/5/11/chartex" xmlns:cx6="http://schemas.microsoft.com/office/drawing/2016/5/12/chartex" xmlns:cx7="http://schemas.microsoft.com/office/drawing/2016/5/13/chartex" xmlns:cx8="http://schemas.microsoft.com/office/drawing/2016/5/14/chartex" xmlns:mc="http://schemas.openxmlformats.org/markup-compatibility/2006" xmlns:aink="http://schemas.microsoft.com/office/drawing/2016/ink" xmlns:am3d="http://schemas.microsoft.com/office/drawing/2017/model3d" xmlns:o="urn:schemas-microsoft-com:office:office" xmlns:oel="http://schemas.microsoft.com/office/2019/extlst" xmlns:r="http://schemas.openxmlformats.org/officeDocument/2006/relationships" xmlns:m="http://schemas.openxmlformats.org/officeDocument/2006/math" xmlns:v="urn:schemas-microsoft-com:vml" xmlns:wp14="http://schemas.microsoft.com/office/word/2010/wordprocessingDrawing" xmlns:wp="http://schemas.openxmlformats.org/drawingml/2006/wordprocessingDrawing" xmlns:w10="urn:schemas-microsoft-com:office:word" xmlns:w="http://schemas.openxmlformats.org/wordprocessingml/2006/main" xmlns:w14="http://schemas.microsoft.com/office/word/2010/wordml" xmlns:w15="http://schemas.microsoft.com/office/word/2012/wordml" xmlns:w16cex="http://schemas.microsoft.com/office/word/2018/wordml/cex" xmlns:w16cid="http://schemas.microsoft.com/office/word/2016/wordml/cid" xmlns:w16="http://schemas.microsoft.com/office/word/2018/wordml" xmlns:w16du="http://schemas.microsoft.com/office/word/2023/wordml/word16du" xmlns:w16sdtdh="http://schemas.microsoft.com/office/word/2020/wordml/sdtdatahash" xmlns:w16sdtfl="http://schemas.microsoft.com/office/word/2024/wordml/sdtformatlock" xmlns:w16se="http://schemas.microsoft.com/office/word/2015/wordml/symex" xmlns:wpg="http://schemas.microsoft.com/office/word/2010/wordprocessingGroup" xmlns:wpi="http://schemas.microsoft.com/office/word/2010/wordprocessingInk" xmlns:wne="http://schemas.microsoft.com/office/word/2006/wordml" xmlns:wps="http://schemas.microsoft.com/office/word/2010/wordprocessingShape" mc:Ignorable="w14 w15 w16se w16cid w16 w16cex w16sdtdh w16sdtfl w16du wp14">
   <w:p>
     <w:pPr>
       <w:pStyle w:val="Footer"/>
@@ -9557,7 +9082,7 @@
 </file>
 
 <file path=word/footer3.xml><?xml version="1.0" encoding="utf-8"?>
-<w:ftr xmlns:wpc="http://schemas.microsoft.com/office/word/2010/wordprocessingCanvas" xmlns:cx="http://schemas.microsoft.com/office/drawing/2014/chartex" xmlns:cx1="http://schemas.microsoft.com/office/drawing/2015/9/8/chartex" xmlns:cx2="http://schemas.microsoft.com/office/drawing/2015/10/21/chartex" xmlns:cx3="http://schemas.microsoft.com/office/drawing/2016/5/9/chartex" xmlns:cx4="http://schemas.microsoft.com/office/drawing/2016/5/10/chartex" xmlns:cx5="http://schemas.microsoft.com/office/drawing/2016/5/11/chartex" xmlns:cx6="http://schemas.microsoft.com/office/drawing/2016/5/12/chartex" xmlns:cx7="http://schemas.microsoft.com/office/drawing/2016/5/13/chartex" xmlns:cx8="http://schemas.microsoft.com/office/drawing/2016/5/14/chartex" xmlns:mc="http://schemas.openxmlformats.org/markup-compatibility/2006" xmlns:aink="http://schemas.microsoft.com/office/drawing/2016/ink" xmlns:am3d="http://schemas.microsoft.com/office/drawing/2017/model3d" xmlns:o="urn:schemas-microsoft-com:office:office" xmlns:r="http://schemas.openxmlformats.org/officeDocument/2006/relationships" xmlns:m="http://schemas.openxmlformats.org/officeDocument/2006/math" xmlns:v="urn:schemas-microsoft-com:vml" xmlns:wp14="http://schemas.microsoft.com/office/word/2010/wordprocessingDrawing" xmlns:wp="http://schemas.openxmlformats.org/drawingml/2006/wordprocessingDrawing" xmlns:w10="urn:schemas-microsoft-com:office:word" xmlns:w="http://schemas.openxmlformats.org/wordprocessingml/2006/main" xmlns:w14="http://schemas.microsoft.com/office/word/2010/wordml" xmlns:w15="http://schemas.microsoft.com/office/word/2012/wordml" xmlns:w16cex="http://schemas.microsoft.com/office/word/2018/wordml/cex" xmlns:w16cid="http://schemas.microsoft.com/office/word/2016/wordml/cid" xmlns:w16="http://schemas.microsoft.com/office/word/2018/wordml" xmlns:w16sdtdh="http://schemas.microsoft.com/office/word/2020/wordml/sdtdatahash" xmlns:w16se="http://schemas.microsoft.com/office/word/2015/wordml/symex" xmlns:wpg="http://schemas.microsoft.com/office/word/2010/wordprocessingGroup" xmlns:wpi="http://schemas.microsoft.com/office/word/2010/wordprocessingInk" xmlns:wne="http://schemas.microsoft.com/office/word/2006/wordml" xmlns:wps="http://schemas.microsoft.com/office/word/2010/wordprocessingShape" mc:Ignorable="w14 w15 w16se w16cid w16 w16cex w16sdtdh wp14">
+<w:ftr xmlns:wpc="http://schemas.microsoft.com/office/word/2010/wordprocessingCanvas" xmlns:cx="http://schemas.microsoft.com/office/drawing/2014/chartex" xmlns:cx1="http://schemas.microsoft.com/office/drawing/2015/9/8/chartex" xmlns:cx2="http://schemas.microsoft.com/office/drawing/2015/10/21/chartex" xmlns:cx3="http://schemas.microsoft.com/office/drawing/2016/5/9/chartex" xmlns:cx4="http://schemas.microsoft.com/office/drawing/2016/5/10/chartex" xmlns:cx5="http://schemas.microsoft.com/office/drawing/2016/5/11/chartex" xmlns:cx6="http://schemas.microsoft.com/office/drawing/2016/5/12/chartex" xmlns:cx7="http://schemas.microsoft.com/office/drawing/2016/5/13/chartex" xmlns:cx8="http://schemas.microsoft.com/office/drawing/2016/5/14/chartex" xmlns:mc="http://schemas.openxmlformats.org/markup-compatibility/2006" xmlns:aink="http://schemas.microsoft.com/office/drawing/2016/ink" xmlns:am3d="http://schemas.microsoft.com/office/drawing/2017/model3d" xmlns:o="urn:schemas-microsoft-com:office:office" xmlns:oel="http://schemas.microsoft.com/office/2019/extlst" xmlns:r="http://schemas.openxmlformats.org/officeDocument/2006/relationships" xmlns:m="http://schemas.openxmlformats.org/officeDocument/2006/math" xmlns:v="urn:schemas-microsoft-com:vml" xmlns:wp14="http://schemas.microsoft.com/office/word/2010/wordprocessingDrawing" xmlns:wp="http://schemas.openxmlformats.org/drawingml/2006/wordprocessingDrawing" xmlns:w10="urn:schemas-microsoft-com:office:word" xmlns:w="http://schemas.openxmlformats.org/wordprocessingml/2006/main" xmlns:w14="http://schemas.microsoft.com/office/word/2010/wordml" xmlns:w15="http://schemas.microsoft.com/office/word/2012/wordml" xmlns:w16cex="http://schemas.microsoft.com/office/word/2018/wordml/cex" xmlns:w16cid="http://schemas.microsoft.com/office/word/2016/wordml/cid" xmlns:w16="http://schemas.microsoft.com/office/word/2018/wordml" xmlns:w16du="http://schemas.microsoft.com/office/word/2023/wordml/word16du" xmlns:w16sdtdh="http://schemas.microsoft.com/office/word/2020/wordml/sdtdatahash" xmlns:w16sdtfl="http://schemas.microsoft.com/office/word/2024/wordml/sdtformatlock" xmlns:w16se="http://schemas.microsoft.com/office/word/2015/wordml/symex" xmlns:wpg="http://schemas.microsoft.com/office/word/2010/wordprocessingGroup" xmlns:wpi="http://schemas.microsoft.com/office/word/2010/wordprocessingInk" xmlns:wne="http://schemas.microsoft.com/office/word/2006/wordml" xmlns:wps="http://schemas.microsoft.com/office/word/2010/wordprocessingShape" mc:Ignorable="w14 w15 w16se w16cid w16 w16cex w16sdtdh w16sdtfl w16du wp14">
   <w:p>
     <w:pPr>
       <w:pStyle w:val="Footer"/>
@@ -9567,7 +9092,7 @@
 </file>
 
 <file path=word/footnotes.xml><?xml version="1.0" encoding="utf-8"?>
-<w:footnotes xmlns:wpc="http://schemas.microsoft.com/office/word/2010/wordprocessingCanvas" xmlns:cx="http://schemas.microsoft.com/office/drawing/2014/chartex" xmlns:cx1="http://schemas.microsoft.com/office/drawing/2015/9/8/chartex" xmlns:cx2="http://schemas.microsoft.com/office/drawing/2015/10/21/chartex" xmlns:cx3="http://schemas.microsoft.com/office/drawing/2016/5/9/chartex" xmlns:cx4="http://schemas.microsoft.com/office/drawing/2016/5/10/chartex" xmlns:cx5="http://schemas.microsoft.com/office/drawing/2016/5/11/chartex" xmlns:cx6="http://schemas.microsoft.com/office/drawing/2016/5/12/chartex" xmlns:cx7="http://schemas.microsoft.com/office/drawing/2016/5/13/chartex" xmlns:cx8="http://schemas.microsoft.com/office/drawing/2016/5/14/chartex" xmlns:mc="http://schemas.openxmlformats.org/markup-compatibility/2006" xmlns:aink="http://schemas.microsoft.com/office/drawing/2016/ink" xmlns:am3d="http://schemas.microsoft.com/office/drawing/2017/model3d" xmlns:o="urn:schemas-microsoft-com:office:office" xmlns:r="http://schemas.openxmlformats.org/officeDocument/2006/relationships" xmlns:m="http://schemas.openxmlformats.org/officeDocument/2006/math" xmlns:v="urn:schemas-microsoft-com:vml" xmlns:wp14="http://schemas.microsoft.com/office/word/2010/wordprocessingDrawing" xmlns:wp="http://schemas.openxmlformats.org/drawingml/2006/wordprocessingDrawing" xmlns:w10="urn:schemas-microsoft-com:office:word" xmlns:w="http://schemas.openxmlformats.org/wordprocessingml/2006/main" xmlns:w14="http://schemas.microsoft.com/office/word/2010/wordml" xmlns:w15="http://schemas.microsoft.com/office/word/2012/wordml" xmlns:w16cex="http://schemas.microsoft.com/office/word/2018/wordml/cex" xmlns:w16cid="http://schemas.microsoft.com/office/word/2016/wordml/cid" xmlns:w16="http://schemas.microsoft.com/office/word/2018/wordml" xmlns:w16sdtdh="http://schemas.microsoft.com/office/word/2020/wordml/sdtdatahash" xmlns:w16se="http://schemas.microsoft.com/office/word/2015/wordml/symex" xmlns:wpg="http://schemas.microsoft.com/office/word/2010/wordprocessingGroup" xmlns:wpi="http://schemas.microsoft.com/office/word/2010/wordprocessingInk" xmlns:wne="http://schemas.microsoft.com/office/word/2006/wordml" xmlns:wps="http://schemas.microsoft.com/office/word/2010/wordprocessingShape" mc:Ignorable="w14 w15 w16se w16cid w16 w16cex w16sdtdh wp14">
+<w:footnotes xmlns:wpc="http://schemas.microsoft.com/office/word/2010/wordprocessingCanvas" xmlns:cx="http://schemas.microsoft.com/office/drawing/2014/chartex" xmlns:cx1="http://schemas.microsoft.com/office/drawing/2015/9/8/chartex" xmlns:cx2="http://schemas.microsoft.com/office/drawing/2015/10/21/chartex" xmlns:cx3="http://schemas.microsoft.com/office/drawing/2016/5/9/chartex" xmlns:cx4="http://schemas.microsoft.com/office/drawing/2016/5/10/chartex" xmlns:cx5="http://schemas.microsoft.com/office/drawing/2016/5/11/chartex" xmlns:cx6="http://schemas.microsoft.com/office/drawing/2016/5/12/chartex" xmlns:cx7="http://schemas.microsoft.com/office/drawing/2016/5/13/chartex" xmlns:cx8="http://schemas.microsoft.com/office/drawing/2016/5/14/chartex" xmlns:mc="http://schemas.openxmlformats.org/markup-compatibility/2006" xmlns:aink="http://schemas.microsoft.com/office/drawing/2016/ink" xmlns:am3d="http://schemas.microsoft.com/office/drawing/2017/model3d" xmlns:o="urn:schemas-microsoft-com:office:office" xmlns:oel="http://schemas.microsoft.com/office/2019/extlst" xmlns:r="http://schemas.openxmlformats.org/officeDocument/2006/relationships" xmlns:m="http://schemas.openxmlformats.org/officeDocument/2006/math" xmlns:v="urn:schemas-microsoft-com:vml" xmlns:wp14="http://schemas.microsoft.com/office/word/2010/wordprocessingDrawing" xmlns:wp="http://schemas.openxmlformats.org/drawingml/2006/wordprocessingDrawing" xmlns:w10="urn:schemas-microsoft-com:office:word" xmlns:w="http://schemas.openxmlformats.org/wordprocessingml/2006/main" xmlns:w14="http://schemas.microsoft.com/office/word/2010/wordml" xmlns:w15="http://schemas.microsoft.com/office/word/2012/wordml" xmlns:w16cex="http://schemas.microsoft.com/office/word/2018/wordml/cex" xmlns:w16cid="http://schemas.microsoft.com/office/word/2016/wordml/cid" xmlns:w16="http://schemas.microsoft.com/office/word/2018/wordml" xmlns:w16du="http://schemas.microsoft.com/office/word/2023/wordml/word16du" xmlns:w16sdtdh="http://schemas.microsoft.com/office/word/2020/wordml/sdtdatahash" xmlns:w16sdtfl="http://schemas.microsoft.com/office/word/2024/wordml/sdtformatlock" xmlns:w16se="http://schemas.microsoft.com/office/word/2015/wordml/symex" xmlns:wpg="http://schemas.microsoft.com/office/word/2010/wordprocessingGroup" xmlns:wpi="http://schemas.microsoft.com/office/word/2010/wordprocessingInk" xmlns:wne="http://schemas.microsoft.com/office/word/2006/wordml" xmlns:wps="http://schemas.microsoft.com/office/word/2010/wordprocessingShape" mc:Ignorable="w14 w15 w16se w16cid w16 w16cex w16sdtdh w16sdtfl w16du wp14">
   <w:footnote w:type="separator" w:id="-1">
     <w:p>
       <w:r>
@@ -9589,7 +9114,7 @@
 </file>
 
 <file path=word/header1.xml><?xml version="1.0" encoding="utf-8"?>
-<w:hdr xmlns:wpc="http://schemas.microsoft.com/office/word/2010/wordprocessingCanvas" xmlns:cx="http://schemas.microsoft.com/office/drawing/2014/chartex" xmlns:cx1="http://schemas.microsoft.com/office/drawing/2015/9/8/chartex" xmlns:cx2="http://schemas.microsoft.com/office/drawing/2015/10/21/chartex" xmlns:cx3="http://schemas.microsoft.com/office/drawing/2016/5/9/chartex" xmlns:cx4="http://schemas.microsoft.com/office/drawing/2016/5/10/chartex" xmlns:cx5="http://schemas.microsoft.com/office/drawing/2016/5/11/chartex" xmlns:cx6="http://schemas.microsoft.com/office/drawing/2016/5/12/chartex" xmlns:cx7="http://schemas.microsoft.com/office/drawing/2016/5/13/chartex" xmlns:cx8="http://schemas.microsoft.com/office/drawing/2016/5/14/chartex" xmlns:mc="http://schemas.openxmlformats.org/markup-compatibility/2006" xmlns:aink="http://schemas.microsoft.com/office/drawing/2016/ink" xmlns:am3d="http://schemas.microsoft.com/office/drawing/2017/model3d" xmlns:o="urn:schemas-microsoft-com:office:office" xmlns:r="http://schemas.openxmlformats.org/officeDocument/2006/relationships" xmlns:m="http://schemas.openxmlformats.org/officeDocument/2006/math" xmlns:v="urn:schemas-microsoft-com:vml" xmlns:wp14="http://schemas.microsoft.com/office/word/2010/wordprocessingDrawing" xmlns:wp="http://schemas.openxmlformats.org/drawingml/2006/wordprocessingDrawing" xmlns:w10="urn:schemas-microsoft-com:office:word" xmlns:w="http://schemas.openxmlformats.org/wordprocessingml/2006/main" xmlns:w14="http://schemas.microsoft.com/office/word/2010/wordml" xmlns:w15="http://schemas.microsoft.com/office/word/2012/wordml" xmlns:w16cex="http://schemas.microsoft.com/office/word/2018/wordml/cex" xmlns:w16cid="http://schemas.microsoft.com/office/word/2016/wordml/cid" xmlns:w16="http://schemas.microsoft.com/office/word/2018/wordml" xmlns:w16sdtdh="http://schemas.microsoft.com/office/word/2020/wordml/sdtdatahash" xmlns:w16se="http://schemas.microsoft.com/office/word/2015/wordml/symex" xmlns:wpg="http://schemas.microsoft.com/office/word/2010/wordprocessingGroup" xmlns:wpi="http://schemas.microsoft.com/office/word/2010/wordprocessingInk" xmlns:wne="http://schemas.microsoft.com/office/word/2006/wordml" xmlns:wps="http://schemas.microsoft.com/office/word/2010/wordprocessingShape" mc:Ignorable="w14 w15 w16se w16cid w16 w16cex w16sdtdh wp14">
+<w:hdr xmlns:wpc="http://schemas.microsoft.com/office/word/2010/wordprocessingCanvas" xmlns:cx="http://schemas.microsoft.com/office/drawing/2014/chartex" xmlns:cx1="http://schemas.microsoft.com/office/drawing/2015/9/8/chartex" xmlns:cx2="http://schemas.microsoft.com/office/drawing/2015/10/21/chartex" xmlns:cx3="http://schemas.microsoft.com/office/drawing/2016/5/9/chartex" xmlns:cx4="http://schemas.microsoft.com/office/drawing/2016/5/10/chartex" xmlns:cx5="http://schemas.microsoft.com/office/drawing/2016/5/11/chartex" xmlns:cx6="http://schemas.microsoft.com/office/drawing/2016/5/12/chartex" xmlns:cx7="http://schemas.microsoft.com/office/drawing/2016/5/13/chartex" xmlns:cx8="http://schemas.microsoft.com/office/drawing/2016/5/14/chartex" xmlns:mc="http://schemas.openxmlformats.org/markup-compatibility/2006" xmlns:aink="http://schemas.microsoft.com/office/drawing/2016/ink" xmlns:am3d="http://schemas.microsoft.com/office/drawing/2017/model3d" xmlns:o="urn:schemas-microsoft-com:office:office" xmlns:oel="http://schemas.microsoft.com/office/2019/extlst" xmlns:r="http://schemas.openxmlformats.org/officeDocument/2006/relationships" xmlns:m="http://schemas.openxmlformats.org/officeDocument/2006/math" xmlns:v="urn:schemas-microsoft-com:vml" xmlns:wp14="http://schemas.microsoft.com/office/word/2010/wordprocessingDrawing" xmlns:wp="http://schemas.openxmlformats.org/drawingml/2006/wordprocessingDrawing" xmlns:w10="urn:schemas-microsoft-com:office:word" xmlns:w="http://schemas.openxmlformats.org/wordprocessingml/2006/main" xmlns:w14="http://schemas.microsoft.com/office/word/2010/wordml" xmlns:w15="http://schemas.microsoft.com/office/word/2012/wordml" xmlns:w16cex="http://schemas.microsoft.com/office/word/2018/wordml/cex" xmlns:w16cid="http://schemas.microsoft.com/office/word/2016/wordml/cid" xmlns:w16="http://schemas.microsoft.com/office/word/2018/wordml" xmlns:w16du="http://schemas.microsoft.com/office/word/2023/wordml/word16du" xmlns:w16sdtdh="http://schemas.microsoft.com/office/word/2020/wordml/sdtdatahash" xmlns:w16sdtfl="http://schemas.microsoft.com/office/word/2024/wordml/sdtformatlock" xmlns:w16se="http://schemas.microsoft.com/office/word/2015/wordml/symex" xmlns:wpg="http://schemas.microsoft.com/office/word/2010/wordprocessingGroup" xmlns:wpi="http://schemas.microsoft.com/office/word/2010/wordprocessingInk" xmlns:wne="http://schemas.microsoft.com/office/word/2006/wordml" xmlns:wps="http://schemas.microsoft.com/office/word/2010/wordprocessingShape" mc:Ignorable="w14 w15 w16se w16cid w16 w16cex w16sdtdh w16sdtfl w16du wp14">
   <w:p>
     <w:pPr>
       <w:pStyle w:val="Header"/>
@@ -9599,7 +9124,7 @@
 </file>
 
 <file path=word/header2.xml><?xml version="1.0" encoding="utf-8"?>
-<w:hdr xmlns:wpc="http://schemas.microsoft.com/office/word/2010/wordprocessingCanvas" xmlns:cx="http://schemas.microsoft.com/office/drawing/2014/chartex" xmlns:cx1="http://schemas.microsoft.com/office/drawing/2015/9/8/chartex" xmlns:cx2="http://schemas.microsoft.com/office/drawing/2015/10/21/chartex" xmlns:cx3="http://schemas.microsoft.com/office/drawing/2016/5/9/chartex" xmlns:cx4="http://schemas.microsoft.com/office/drawing/2016/5/10/chartex" xmlns:cx5="http://schemas.microsoft.com/office/drawing/2016/5/11/chartex" xmlns:cx6="http://schemas.microsoft.com/office/drawing/2016/5/12/chartex" xmlns:cx7="http://schemas.microsoft.com/office/drawing/2016/5/13/chartex" xmlns:cx8="http://schemas.microsoft.com/office/drawing/2016/5/14/chartex" xmlns:mc="http://schemas.openxmlformats.org/markup-compatibility/2006" xmlns:aink="http://schemas.microsoft.com/office/drawing/2016/ink" xmlns:am3d="http://schemas.microsoft.com/office/drawing/2017/model3d" xmlns:o="urn:schemas-microsoft-com:office:office" xmlns:r="http://schemas.openxmlformats.org/officeDocument/2006/relationships" xmlns:m="http://schemas.openxmlformats.org/officeDocument/2006/math" xmlns:v="urn:schemas-microsoft-com:vml" xmlns:wp14="http://schemas.microsoft.com/office/word/2010/wordprocessingDrawing" xmlns:wp="http://schemas.openxmlformats.org/drawingml/2006/wordprocessingDrawing" xmlns:w10="urn:schemas-microsoft-com:office:word" xmlns:w="http://schemas.openxmlformats.org/wordprocessingml/2006/main" xmlns:w14="http://schemas.microsoft.com/office/word/2010/wordml" xmlns:w15="http://schemas.microsoft.com/office/word/2012/wordml" xmlns:w16cex="http://schemas.microsoft.com/office/word/2018/wordml/cex" xmlns:w16cid="http://schemas.microsoft.com/office/word/2016/wordml/cid" xmlns:w16="http://schemas.microsoft.com/office/word/2018/wordml" xmlns:w16sdtdh="http://schemas.microsoft.com/office/word/2020/wordml/sdtdatahash" xmlns:w16se="http://schemas.microsoft.com/office/word/2015/wordml/symex" xmlns:wpg="http://schemas.microsoft.com/office/word/2010/wordprocessingGroup" xmlns:wpi="http://schemas.microsoft.com/office/word/2010/wordprocessingInk" xmlns:wne="http://schemas.microsoft.com/office/word/2006/wordml" xmlns:wps="http://schemas.microsoft.com/office/word/2010/wordprocessingShape" mc:Ignorable="w14 w15 w16se w16cid w16 w16cex w16sdtdh wp14">
+<w:hdr xmlns:wpc="http://schemas.microsoft.com/office/word/2010/wordprocessingCanvas" xmlns:cx="http://schemas.microsoft.com/office/drawing/2014/chartex" xmlns:cx1="http://schemas.microsoft.com/office/drawing/2015/9/8/chartex" xmlns:cx2="http://schemas.microsoft.com/office/drawing/2015/10/21/chartex" xmlns:cx3="http://schemas.microsoft.com/office/drawing/2016/5/9/chartex" xmlns:cx4="http://schemas.microsoft.com/office/drawing/2016/5/10/chartex" xmlns:cx5="http://schemas.microsoft.com/office/drawing/2016/5/11/chartex" xmlns:cx6="http://schemas.microsoft.com/office/drawing/2016/5/12/chartex" xmlns:cx7="http://schemas.microsoft.com/office/drawing/2016/5/13/chartex" xmlns:cx8="http://schemas.microsoft.com/office/drawing/2016/5/14/chartex" xmlns:mc="http://schemas.openxmlformats.org/markup-compatibility/2006" xmlns:aink="http://schemas.microsoft.com/office/drawing/2016/ink" xmlns:am3d="http://schemas.microsoft.com/office/drawing/2017/model3d" xmlns:o="urn:schemas-microsoft-com:office:office" xmlns:oel="http://schemas.microsoft.com/office/2019/extlst" xmlns:r="http://schemas.openxmlformats.org/officeDocument/2006/relationships" xmlns:m="http://schemas.openxmlformats.org/officeDocument/2006/math" xmlns:v="urn:schemas-microsoft-com:vml" xmlns:wp14="http://schemas.microsoft.com/office/word/2010/wordprocessingDrawing" xmlns:wp="http://schemas.openxmlformats.org/drawingml/2006/wordprocessingDrawing" xmlns:w10="urn:schemas-microsoft-com:office:word" xmlns:w="http://schemas.openxmlformats.org/wordprocessingml/2006/main" xmlns:w14="http://schemas.microsoft.com/office/word/2010/wordml" xmlns:w15="http://schemas.microsoft.com/office/word/2012/wordml" xmlns:w16cex="http://schemas.microsoft.com/office/word/2018/wordml/cex" xmlns:w16cid="http://schemas.microsoft.com/office/word/2016/wordml/cid" xmlns:w16="http://schemas.microsoft.com/office/word/2018/wordml" xmlns:w16du="http://schemas.microsoft.com/office/word/2023/wordml/word16du" xmlns:w16sdtdh="http://schemas.microsoft.com/office/word/2020/wordml/sdtdatahash" xmlns:w16sdtfl="http://schemas.microsoft.com/office/word/2024/wordml/sdtformatlock" xmlns:w16se="http://schemas.microsoft.com/office/word/2015/wordml/symex" xmlns:wpg="http://schemas.microsoft.com/office/word/2010/wordprocessingGroup" xmlns:wpi="http://schemas.microsoft.com/office/word/2010/wordprocessingInk" xmlns:wne="http://schemas.microsoft.com/office/word/2006/wordml" xmlns:wps="http://schemas.microsoft.com/office/word/2010/wordprocessingShape" mc:Ignorable="w14 w15 w16se w16cid w16 w16cex w16sdtdh w16sdtfl w16du wp14">
   <w:p>
     <w:pPr>
       <w:pStyle w:val="Header"/>
@@ -9609,7 +9134,7 @@
 </file>
 
 <file path=word/header3.xml><?xml version="1.0" encoding="utf-8"?>
-<w:hdr xmlns:wpc="http://schemas.microsoft.com/office/word/2010/wordprocessingCanvas" xmlns:cx="http://schemas.microsoft.com/office/drawing/2014/chartex" xmlns:cx1="http://schemas.microsoft.com/office/drawing/2015/9/8/chartex" xmlns:cx2="http://schemas.microsoft.com/office/drawing/2015/10/21/chartex" xmlns:cx3="http://schemas.microsoft.com/office/drawing/2016/5/9/chartex" xmlns:cx4="http://schemas.microsoft.com/office/drawing/2016/5/10/chartex" xmlns:cx5="http://schemas.microsoft.com/office/drawing/2016/5/11/chartex" xmlns:cx6="http://schemas.microsoft.com/office/drawing/2016/5/12/chartex" xmlns:cx7="http://schemas.microsoft.com/office/drawing/2016/5/13/chartex" xmlns:cx8="http://schemas.microsoft.com/office/drawing/2016/5/14/chartex" xmlns:mc="http://schemas.openxmlformats.org/markup-compatibility/2006" xmlns:aink="http://schemas.microsoft.com/office/drawing/2016/ink" xmlns:am3d="http://schemas.microsoft.com/office/drawing/2017/model3d" xmlns:o="urn:schemas-microsoft-com:office:office" xmlns:r="http://schemas.openxmlformats.org/officeDocument/2006/relationships" xmlns:m="http://schemas.openxmlformats.org/officeDocument/2006/math" xmlns:v="urn:schemas-microsoft-com:vml" xmlns:wp14="http://schemas.microsoft.com/office/word/2010/wordprocessingDrawing" xmlns:wp="http://schemas.openxmlformats.org/drawingml/2006/wordprocessingDrawing" xmlns:w10="urn:schemas-microsoft-com:office:word" xmlns:w="http://schemas.openxmlformats.org/wordprocessingml/2006/main" xmlns:w14="http://schemas.microsoft.com/office/word/2010/wordml" xmlns:w15="http://schemas.microsoft.com/office/word/2012/wordml" xmlns:w16cex="http://schemas.microsoft.com/office/word/2018/wordml/cex" xmlns:w16cid="http://schemas.microsoft.com/office/word/2016/wordml/cid" xmlns:w16="http://schemas.microsoft.com/office/word/2018/wordml" xmlns:w16sdtdh="http://schemas.microsoft.com/office/word/2020/wordml/sdtdatahash" xmlns:w16se="http://schemas.microsoft.com/office/word/2015/wordml/symex" xmlns:wpg="http://schemas.microsoft.com/office/word/2010/wordprocessingGroup" xmlns:wpi="http://schemas.microsoft.com/office/word/2010/wordprocessingInk" xmlns:wne="http://schemas.microsoft.com/office/word/2006/wordml" xmlns:wps="http://schemas.microsoft.com/office/word/2010/wordprocessingShape" mc:Ignorable="w14 w15 w16se w16cid w16 w16cex w16sdtdh wp14">
+<w:hdr xmlns:wpc="http://schemas.microsoft.com/office/word/2010/wordprocessingCanvas" xmlns:cx="http://schemas.microsoft.com/office/drawing/2014/chartex" xmlns:cx1="http://schemas.microsoft.com/office/drawing/2015/9/8/chartex" xmlns:cx2="http://schemas.microsoft.com/office/drawing/2015/10/21/chartex" xmlns:cx3="http://schemas.microsoft.com/office/drawing/2016/5/9/chartex" xmlns:cx4="http://schemas.microsoft.com/office/drawing/2016/5/10/chartex" xmlns:cx5="http://schemas.microsoft.com/office/drawing/2016/5/11/chartex" xmlns:cx6="http://schemas.microsoft.com/office/drawing/2016/5/12/chartex" xmlns:cx7="http://schemas.microsoft.com/office/drawing/2016/5/13/chartex" xmlns:cx8="http://schemas.microsoft.com/office/drawing/2016/5/14/chartex" xmlns:mc="http://schemas.openxmlformats.org/markup-compatibility/2006" xmlns:aink="http://schemas.microsoft.com/office/drawing/2016/ink" xmlns:am3d="http://schemas.microsoft.com/office/drawing/2017/model3d" xmlns:o="urn:schemas-microsoft-com:office:office" xmlns:oel="http://schemas.microsoft.com/office/2019/extlst" xmlns:r="http://schemas.openxmlformats.org/officeDocument/2006/relationships" xmlns:m="http://schemas.openxmlformats.org/officeDocument/2006/math" xmlns:v="urn:schemas-microsoft-com:vml" xmlns:wp14="http://schemas.microsoft.com/office/word/2010/wordprocessingDrawing" xmlns:wp="http://schemas.openxmlformats.org/drawingml/2006/wordprocessingDrawing" xmlns:w10="urn:schemas-microsoft-com:office:word" xmlns:w="http://schemas.openxmlformats.org/wordprocessingml/2006/main" xmlns:w14="http://schemas.microsoft.com/office/word/2010/wordml" xmlns:w15="http://schemas.microsoft.com/office/word/2012/wordml" xmlns:w16cex="http://schemas.microsoft.com/office/word/2018/wordml/cex" xmlns:w16cid="http://schemas.microsoft.com/office/word/2016/wordml/cid" xmlns:w16="http://schemas.microsoft.com/office/word/2018/wordml" xmlns:w16du="http://schemas.microsoft.com/office/word/2023/wordml/word16du" xmlns:w16sdtdh="http://schemas.microsoft.com/office/word/2020/wordml/sdtdatahash" xmlns:w16sdtfl="http://schemas.microsoft.com/office/word/2024/wordml/sdtformatlock" xmlns:w16se="http://schemas.microsoft.com/office/word/2015/wordml/symex" xmlns:wpg="http://schemas.microsoft.com/office/word/2010/wordprocessingGroup" xmlns:wpi="http://schemas.microsoft.com/office/word/2010/wordprocessingInk" xmlns:wne="http://schemas.microsoft.com/office/word/2006/wordml" xmlns:wps="http://schemas.microsoft.com/office/word/2010/wordprocessingShape" mc:Ignorable="w14 w15 w16se w16cid w16 w16cex w16sdtdh w16sdtfl w16du wp14">
   <w:p>
     <w:pPr>
       <w:pStyle w:val="Header"/>
@@ -9619,7 +9144,7 @@
 </file>
 
 <file path=word/numbering.xml><?xml version="1.0" encoding="utf-8"?>
-<w:numbering xmlns:wpc="http://schemas.microsoft.com/office/word/2010/wordprocessingCanvas" xmlns:cx="http://schemas.microsoft.com/office/drawing/2014/chartex" xmlns:cx1="http://schemas.microsoft.com/office/drawing/2015/9/8/chartex" xmlns:cx2="http://schemas.microsoft.com/office/drawing/2015/10/21/chartex" xmlns:cx3="http://schemas.microsoft.com/office/drawing/2016/5/9/chartex" xmlns:cx4="http://schemas.microsoft.com/office/drawing/2016/5/10/chartex" xmlns:cx5="http://schemas.microsoft.com/office/drawing/2016/5/11/chartex" xmlns:cx6="http://schemas.microsoft.com/office/drawing/2016/5/12/chartex" xmlns:cx7="http://schemas.microsoft.com/office/drawing/2016/5/13/chartex" xmlns:cx8="http://schemas.microsoft.com/office/drawing/2016/5/14/chartex" xmlns:mc="http://schemas.openxmlformats.org/markup-compatibility/2006" xmlns:aink="http://schemas.microsoft.com/office/drawing/2016/ink" xmlns:am3d="http://schemas.microsoft.com/office/drawing/2017/model3d" xmlns:o="urn:schemas-microsoft-com:office:office" xmlns:r="http://schemas.openxmlformats.org/officeDocument/2006/relationships" xmlns:m="http://schemas.openxmlformats.org/officeDocument/2006/math" xmlns:v="urn:schemas-microsoft-com:vml" xmlns:wp14="http://schemas.microsoft.com/office/word/2010/wordprocessingDrawing" xmlns:wp="http://schemas.openxmlformats.org/drawingml/2006/wordprocessingDrawing" xmlns:w10="urn:schemas-microsoft-com:office:word" xmlns:w="http://schemas.openxmlformats.org/wordprocessingml/2006/main" xmlns:w14="http://schemas.microsoft.com/office/word/2010/wordml" xmlns:w15="http://schemas.microsoft.com/office/word/2012/wordml" xmlns:w16cex="http://schemas.microsoft.com/office/word/2018/wordml/cex" xmlns:w16cid="http://schemas.microsoft.com/office/word/2016/wordml/cid" xmlns:w16="http://schemas.microsoft.com/office/word/2018/wordml" xmlns:w16sdtdh="http://schemas.microsoft.com/office/word/2020/wordml/sdtdatahash" xmlns:w16se="http://schemas.microsoft.com/office/word/2015/wordml/symex" xmlns:wpg="http://schemas.microsoft.com/office/word/2010/wordprocessingGroup" xmlns:wpi="http://schemas.microsoft.com/office/word/2010/wordprocessingInk" xmlns:wne="http://schemas.microsoft.com/office/word/2006/wordml" xmlns:wps="http://schemas.microsoft.com/office/word/2010/wordprocessingShape" mc:Ignorable="w14 w15 w16se w16cid w16 w16cex w16sdtdh wp14">
+<w:numbering xmlns:wpc="http://schemas.microsoft.com/office/word/2010/wordprocessingCanvas" xmlns:cx="http://schemas.microsoft.com/office/drawing/2014/chartex" xmlns:cx1="http://schemas.microsoft.com/office/drawing/2015/9/8/chartex" xmlns:cx2="http://schemas.microsoft.com/office/drawing/2015/10/21/chartex" xmlns:cx3="http://schemas.microsoft.com/office/drawing/2016/5/9/chartex" xmlns:cx4="http://schemas.microsoft.com/office/drawing/2016/5/10/chartex" xmlns:cx5="http://schemas.microsoft.com/office/drawing/2016/5/11/chartex" xmlns:cx6="http://schemas.microsoft.com/office/drawing/2016/5/12/chartex" xmlns:cx7="http://schemas.microsoft.com/office/drawing/2016/5/13/chartex" xmlns:cx8="http://schemas.microsoft.com/office/drawing/2016/5/14/chartex" xmlns:mc="http://schemas.openxmlformats.org/markup-compatibility/2006" xmlns:aink="http://schemas.microsoft.com/office/drawing/2016/ink" xmlns:am3d="http://schemas.microsoft.com/office/drawing/2017/model3d" xmlns:o="urn:schemas-microsoft-com:office:office" xmlns:oel="http://schemas.microsoft.com/office/2019/extlst" xmlns:r="http://schemas.openxmlformats.org/officeDocument/2006/relationships" xmlns:m="http://schemas.openxmlformats.org/officeDocument/2006/math" xmlns:v="urn:schemas-microsoft-com:vml" xmlns:wp14="http://schemas.microsoft.com/office/word/2010/wordprocessingDrawing" xmlns:wp="http://schemas.openxmlformats.org/drawingml/2006/wordprocessingDrawing" xmlns:w10="urn:schemas-microsoft-com:office:word" xmlns:w="http://schemas.openxmlformats.org/wordprocessingml/2006/main" xmlns:w14="http://schemas.microsoft.com/office/word/2010/wordml" xmlns:w15="http://schemas.microsoft.com/office/word/2012/wordml" xmlns:w16cex="http://schemas.microsoft.com/office/word/2018/wordml/cex" xmlns:w16cid="http://schemas.microsoft.com/office/word/2016/wordml/cid" xmlns:w16="http://schemas.microsoft.com/office/word/2018/wordml" xmlns:w16du="http://schemas.microsoft.com/office/word/2023/wordml/word16du" xmlns:w16sdtdh="http://schemas.microsoft.com/office/word/2020/wordml/sdtdatahash" xmlns:w16sdtfl="http://schemas.microsoft.com/office/word/2024/wordml/sdtformatlock" xmlns:w16se="http://schemas.microsoft.com/office/word/2015/wordml/symex" xmlns:wpg="http://schemas.microsoft.com/office/word/2010/wordprocessingGroup" xmlns:wpi="http://schemas.microsoft.com/office/word/2010/wordprocessingInk" xmlns:wne="http://schemas.microsoft.com/office/word/2006/wordml" xmlns:wps="http://schemas.microsoft.com/office/word/2010/wordprocessingShape" mc:Ignorable="w14 w15 w16se w16cid w16 w16cex w16sdtdh w16sdtfl w16du wp14">
   <w:abstractNum w:abstractNumId="0" w15:restartNumberingAfterBreak="0">
     <w:nsid w:val="00000001"/>
     <w:multiLevelType w:val="multilevel"/>
@@ -10077,23 +9602,23 @@
       </w:rPr>
     </w:lvl>
   </w:abstractNum>
-  <w:num w:numId="1">
+  <w:num w:numId="1" w16cid:durableId="1954901458">
     <w:abstractNumId w:val="0"/>
   </w:num>
-  <w:num w:numId="2">
+  <w:num w:numId="2" w16cid:durableId="1256326789">
     <w:abstractNumId w:val="1"/>
   </w:num>
-  <w:num w:numId="3">
+  <w:num w:numId="3" w16cid:durableId="1423523265">
     <w:abstractNumId w:val="2"/>
   </w:num>
-  <w:num w:numId="4">
+  <w:num w:numId="4" w16cid:durableId="1572621907">
     <w:abstractNumId w:val="3"/>
   </w:num>
 </w:numbering>
 </file>
 
 <file path=word/styles.xml><?xml version="1.0" encoding="utf-8"?>
-<w:styles xmlns:mc="http://schemas.openxmlformats.org/markup-compatibility/2006" xmlns:r="http://schemas.openxmlformats.org/officeDocument/2006/relationships" xmlns:w="http://schemas.openxmlformats.org/wordprocessingml/2006/main" xmlns:w14="http://schemas.microsoft.com/office/word/2010/wordml" xmlns:w15="http://schemas.microsoft.com/office/word/2012/wordml" xmlns:w16cex="http://schemas.microsoft.com/office/word/2018/wordml/cex" xmlns:w16cid="http://schemas.microsoft.com/office/word/2016/wordml/cid" xmlns:w16="http://schemas.microsoft.com/office/word/2018/wordml" xmlns:w16sdtdh="http://schemas.microsoft.com/office/word/2020/wordml/sdtdatahash" xmlns:w16se="http://schemas.microsoft.com/office/word/2015/wordml/symex" mc:Ignorable="w14 w15 w16se w16cid w16 w16cex w16sdtdh">
+<w:styles xmlns:mc="http://schemas.openxmlformats.org/markup-compatibility/2006" xmlns:r="http://schemas.openxmlformats.org/officeDocument/2006/relationships" xmlns:w="http://schemas.openxmlformats.org/wordprocessingml/2006/main" xmlns:w14="http://schemas.microsoft.com/office/word/2010/wordml" xmlns:w15="http://schemas.microsoft.com/office/word/2012/wordml" xmlns:w16cex="http://schemas.microsoft.com/office/word/2018/wordml/cex" xmlns:w16cid="http://schemas.microsoft.com/office/word/2016/wordml/cid" xmlns:w16="http://schemas.microsoft.com/office/word/2018/wordml" xmlns:w16du="http://schemas.microsoft.com/office/word/2023/wordml/word16du" xmlns:w16sdtdh="http://schemas.microsoft.com/office/word/2020/wordml/sdtdatahash" xmlns:w16sdtfl="http://schemas.microsoft.com/office/word/2024/wordml/sdtformatlock" xmlns:w16se="http://schemas.microsoft.com/office/word/2015/wordml/symex" mc:Ignorable="w14 w15 w16se w16cid w16 w16cex w16sdtdh w16sdtfl w16du">
   <w:docDefaults>
     <w:rPrDefault>
       <w:rPr>

</xml_diff>

<commit_message>
Added more project files
</commit_message>
<xml_diff>
--- a/1-Diary2026.docx
+++ b/1-Diary2026.docx
@@ -1260,7 +1260,6 @@
         </w:rPr>
         <w:t xml:space="preserve">work done so far, work you still </w:t>
       </w:r>
-      <w:proofErr w:type="gramStart"/>
       <w:r>
         <w:rPr>
           <w:rFonts w:ascii="Calibri" w:hAnsi="Calibri" w:cs="Calibri"/>
@@ -1272,14 +1271,7 @@
         <w:rPr>
           <w:rFonts w:ascii="Calibri" w:hAnsi="Calibri" w:cs="Calibri"/>
         </w:rPr>
-        <w:t>to</w:t>
-      </w:r>
-      <w:proofErr w:type="gramEnd"/>
-      <w:r>
-        <w:rPr>
-          <w:rFonts w:ascii="Calibri" w:hAnsi="Calibri" w:cs="Calibri"/>
-        </w:rPr>
-        <w:t xml:space="preserve"> do, </w:t>
+        <w:t xml:space="preserve">to do, </w:t>
       </w:r>
       <w:r>
         <w:rPr>
@@ -2582,10 +2574,43 @@
       </w:r>
       <w:r>
         <w:rPr>
-          <w:rFonts w:ascii="Arial" w:hAnsi="Arial" w:cs="Arial"/>
-          <w:lang w:val="en-IE"/>
-        </w:rPr>
-        <w:t>Aleksandra Skarzycka</w:t>
+          <w:noProof/>
+        </w:rPr>
+        <w:drawing>
+          <wp:inline distT="0" distB="0" distL="0" distR="0" wp14:anchorId="2ABE98D2" wp14:editId="6CF98A0D">
+            <wp:extent cx="1400000" cy="552381"/>
+            <wp:effectExtent l="0" t="0" r="0" b="635"/>
+            <wp:docPr id="458644697" name="Picture 1"/>
+            <wp:cNvGraphicFramePr>
+              <a:graphicFrameLocks xmlns:a="http://schemas.openxmlformats.org/drawingml/2006/main" noChangeAspect="1"/>
+            </wp:cNvGraphicFramePr>
+            <a:graphic xmlns:a="http://schemas.openxmlformats.org/drawingml/2006/main">
+              <a:graphicData uri="http://schemas.openxmlformats.org/drawingml/2006/picture">
+                <pic:pic xmlns:pic="http://schemas.openxmlformats.org/drawingml/2006/picture">
+                  <pic:nvPicPr>
+                    <pic:cNvPr id="458644697" name=""/>
+                    <pic:cNvPicPr/>
+                  </pic:nvPicPr>
+                  <pic:blipFill>
+                    <a:blip r:embed="rId11"/>
+                    <a:stretch>
+                      <a:fillRect/>
+                    </a:stretch>
+                  </pic:blipFill>
+                  <pic:spPr>
+                    <a:xfrm>
+                      <a:off x="0" y="0"/>
+                      <a:ext cx="1400000" cy="552381"/>
+                    </a:xfrm>
+                    <a:prstGeom prst="rect">
+                      <a:avLst/>
+                    </a:prstGeom>
+                  </pic:spPr>
+                </pic:pic>
+              </a:graphicData>
+            </a:graphic>
+          </wp:inline>
+        </w:drawing>
       </w:r>
       <w:r>
         <w:tab/>
@@ -2699,6 +2724,7 @@
           <w:szCs w:val="26"/>
           <w:lang w:val="en-IE"/>
         </w:rPr>
+        <w:lastRenderedPageBreak/>
         <w:t xml:space="preserve">The Institute regulations on </w:t>
       </w:r>
       <w:r>
@@ -2765,7 +2791,6 @@
           <w:szCs w:val="26"/>
           <w:lang w:val="en-IE"/>
         </w:rPr>
-        <w:lastRenderedPageBreak/>
         <w:br w:type="page"/>
       </w:r>
     </w:p>
@@ -2882,21 +2907,7 @@
         <w:rPr>
           <w:rFonts w:ascii="Calibri" w:hAnsi="Calibri" w:cs="Arial"/>
         </w:rPr>
-        <w:t xml:space="preserve">Created my project proposal and submit it. Supervisors </w:t>
-      </w:r>
-      <w:proofErr w:type="gramStart"/>
-      <w:r>
-        <w:rPr>
-          <w:rFonts w:ascii="Calibri" w:hAnsi="Calibri" w:cs="Arial"/>
-        </w:rPr>
-        <w:t>assigned</w:t>
-      </w:r>
-      <w:proofErr w:type="gramEnd"/>
-      <w:r>
-        <w:rPr>
-          <w:rFonts w:ascii="Calibri" w:hAnsi="Calibri" w:cs="Arial"/>
-        </w:rPr>
-        <w:t xml:space="preserve"> next week.</w:t>
+        <w:t>Created my project proposal and submit it. Supervisors assigned next week.</w:t>
       </w:r>
     </w:p>
     <w:p>
@@ -3119,9 +3130,55 @@
       </w:pPr>
       <w:r>
         <w:rPr>
-          <w:rFonts w:ascii="Calibri" w:hAnsi="Calibri" w:cs="Arial"/>
-        </w:rPr>
-        <w:t>Aleksandra Skarzycka 20/01/26</w:t>
+          <w:noProof/>
+        </w:rPr>
+        <w:drawing>
+          <wp:inline distT="0" distB="0" distL="0" distR="0" wp14:anchorId="1BE2F16A" wp14:editId="6C542155">
+            <wp:extent cx="1400000" cy="552381"/>
+            <wp:effectExtent l="0" t="0" r="0" b="635"/>
+            <wp:docPr id="175654683" name="Picture 1"/>
+            <wp:cNvGraphicFramePr>
+              <a:graphicFrameLocks xmlns:a="http://schemas.openxmlformats.org/drawingml/2006/main" noChangeAspect="1"/>
+            </wp:cNvGraphicFramePr>
+            <a:graphic xmlns:a="http://schemas.openxmlformats.org/drawingml/2006/main">
+              <a:graphicData uri="http://schemas.openxmlformats.org/drawingml/2006/picture">
+                <pic:pic xmlns:pic="http://schemas.openxmlformats.org/drawingml/2006/picture">
+                  <pic:nvPicPr>
+                    <pic:cNvPr id="175654683" name=""/>
+                    <pic:cNvPicPr/>
+                  </pic:nvPicPr>
+                  <pic:blipFill>
+                    <a:blip r:embed="rId11"/>
+                    <a:stretch>
+                      <a:fillRect/>
+                    </a:stretch>
+                  </pic:blipFill>
+                  <pic:spPr>
+                    <a:xfrm>
+                      <a:off x="0" y="0"/>
+                      <a:ext cx="1400000" cy="552381"/>
+                    </a:xfrm>
+                    <a:prstGeom prst="rect">
+                      <a:avLst/>
+                    </a:prstGeom>
+                  </pic:spPr>
+                </pic:pic>
+              </a:graphicData>
+            </a:graphic>
+          </wp:inline>
+        </w:drawing>
+      </w:r>
+      <w:r>
+        <w:rPr>
+          <w:rFonts w:ascii="Calibri" w:hAnsi="Calibri" w:cs="Arial"/>
+        </w:rPr>
+        <w:t xml:space="preserve"> </w:t>
+      </w:r>
+      <w:r>
+        <w:rPr>
+          <w:rFonts w:ascii="Calibri" w:hAnsi="Calibri" w:cs="Arial"/>
+        </w:rPr>
+        <w:t>20/01/26</w:t>
       </w:r>
       <w:r>
         <w:rPr>
@@ -3396,6 +3453,7 @@
         <w:rPr>
           <w:rFonts w:ascii="Calibri" w:hAnsi="Calibri" w:cs="Arial"/>
         </w:rPr>
+        <w:lastRenderedPageBreak/>
         <w:t xml:space="preserve">Created a concept </w:t>
       </w:r>
       <w:r>
@@ -3593,9 +3651,55 @@
       </w:pPr>
       <w:r>
         <w:rPr>
-          <w:rFonts w:ascii="Calibri" w:hAnsi="Calibri" w:cs="Arial"/>
-        </w:rPr>
-        <w:t xml:space="preserve">Aleksandra Skarzycka 26/01/2026 </w:t>
+          <w:noProof/>
+        </w:rPr>
+        <w:drawing>
+          <wp:inline distT="0" distB="0" distL="0" distR="0" wp14:anchorId="464C7101" wp14:editId="7D97FC31">
+            <wp:extent cx="1400000" cy="552381"/>
+            <wp:effectExtent l="0" t="0" r="0" b="635"/>
+            <wp:docPr id="270764559" name="Picture 1"/>
+            <wp:cNvGraphicFramePr>
+              <a:graphicFrameLocks xmlns:a="http://schemas.openxmlformats.org/drawingml/2006/main" noChangeAspect="1"/>
+            </wp:cNvGraphicFramePr>
+            <a:graphic xmlns:a="http://schemas.openxmlformats.org/drawingml/2006/main">
+              <a:graphicData uri="http://schemas.openxmlformats.org/drawingml/2006/picture">
+                <pic:pic xmlns:pic="http://schemas.openxmlformats.org/drawingml/2006/picture">
+                  <pic:nvPicPr>
+                    <pic:cNvPr id="270764559" name=""/>
+                    <pic:cNvPicPr/>
+                  </pic:nvPicPr>
+                  <pic:blipFill>
+                    <a:blip r:embed="rId11"/>
+                    <a:stretch>
+                      <a:fillRect/>
+                    </a:stretch>
+                  </pic:blipFill>
+                  <pic:spPr>
+                    <a:xfrm>
+                      <a:off x="0" y="0"/>
+                      <a:ext cx="1400000" cy="552381"/>
+                    </a:xfrm>
+                    <a:prstGeom prst="rect">
+                      <a:avLst/>
+                    </a:prstGeom>
+                  </pic:spPr>
+                </pic:pic>
+              </a:graphicData>
+            </a:graphic>
+          </wp:inline>
+        </w:drawing>
+      </w:r>
+      <w:r>
+        <w:rPr>
+          <w:rFonts w:ascii="Calibri" w:hAnsi="Calibri" w:cs="Arial"/>
+        </w:rPr>
+        <w:t xml:space="preserve"> </w:t>
+      </w:r>
+      <w:r>
+        <w:rPr>
+          <w:rFonts w:ascii="Calibri" w:hAnsi="Calibri" w:cs="Arial"/>
+        </w:rPr>
+        <w:t xml:space="preserve">26/01/2026 </w:t>
       </w:r>
       <w:r>
         <w:tab/>
@@ -3972,57 +4076,57 @@
         <w:rPr>
           <w:rFonts w:ascii="Calibri" w:hAnsi="Calibri" w:cs="Arial"/>
         </w:rPr>
-        <w:t>________________________________________________________________________________</w:t>
-      </w:r>
-    </w:p>
-    <w:p>
-      <w:pPr>
-        <w:spacing w:line="480" w:lineRule="auto"/>
-        <w:ind w:left="-709" w:right="-568"/>
-        <w:rPr>
-          <w:rFonts w:ascii="Calibri" w:hAnsi="Calibri" w:cs="Arial"/>
-        </w:rPr>
-      </w:pPr>
-      <w:r>
-        <w:rPr>
-          <w:rFonts w:ascii="Calibri" w:hAnsi="Calibri" w:cs="Arial"/>
-        </w:rPr>
-        <w:t>________________________________________________________________________________</w:t>
-      </w:r>
-    </w:p>
-    <w:p>
-      <w:pPr>
-        <w:spacing w:line="480" w:lineRule="auto"/>
-        <w:ind w:left="-709" w:right="-568"/>
-        <w:rPr>
-          <w:rFonts w:ascii="Calibri" w:hAnsi="Calibri" w:cs="Arial"/>
-        </w:rPr>
-      </w:pPr>
-      <w:r>
-        <w:rPr>
-          <w:rFonts w:ascii="Calibri" w:hAnsi="Calibri" w:cs="Arial"/>
-        </w:rPr>
-        <w:t>________________________________________________________________________________</w:t>
-      </w:r>
-    </w:p>
-    <w:p>
-      <w:pPr>
-        <w:spacing w:line="480" w:lineRule="auto"/>
-        <w:ind w:left="-709" w:right="-568"/>
-        <w:rPr>
-          <w:rFonts w:ascii="Calibri" w:hAnsi="Calibri" w:cs="Arial"/>
-        </w:rPr>
-      </w:pPr>
-      <w:r>
-        <w:rPr>
-          <w:rFonts w:ascii="Calibri" w:hAnsi="Calibri" w:cs="Arial"/>
-        </w:rPr>
         <w:lastRenderedPageBreak/>
         <w:t>________________________________________________________________________________</w:t>
       </w:r>
     </w:p>
     <w:p>
       <w:pPr>
+        <w:spacing w:line="480" w:lineRule="auto"/>
+        <w:ind w:left="-709" w:right="-568"/>
+        <w:rPr>
+          <w:rFonts w:ascii="Calibri" w:hAnsi="Calibri" w:cs="Arial"/>
+        </w:rPr>
+      </w:pPr>
+      <w:r>
+        <w:rPr>
+          <w:rFonts w:ascii="Calibri" w:hAnsi="Calibri" w:cs="Arial"/>
+        </w:rPr>
+        <w:t>________________________________________________________________________________</w:t>
+      </w:r>
+    </w:p>
+    <w:p>
+      <w:pPr>
+        <w:spacing w:line="480" w:lineRule="auto"/>
+        <w:ind w:left="-709" w:right="-568"/>
+        <w:rPr>
+          <w:rFonts w:ascii="Calibri" w:hAnsi="Calibri" w:cs="Arial"/>
+        </w:rPr>
+      </w:pPr>
+      <w:r>
+        <w:rPr>
+          <w:rFonts w:ascii="Calibri" w:hAnsi="Calibri" w:cs="Arial"/>
+        </w:rPr>
+        <w:t>________________________________________________________________________________</w:t>
+      </w:r>
+    </w:p>
+    <w:p>
+      <w:pPr>
+        <w:spacing w:line="480" w:lineRule="auto"/>
+        <w:ind w:left="-709" w:right="-568"/>
+        <w:rPr>
+          <w:rFonts w:ascii="Calibri" w:hAnsi="Calibri" w:cs="Arial"/>
+        </w:rPr>
+      </w:pPr>
+      <w:r>
+        <w:rPr>
+          <w:rFonts w:ascii="Calibri" w:hAnsi="Calibri" w:cs="Arial"/>
+        </w:rPr>
+        <w:t>________________________________________________________________________________</w:t>
+      </w:r>
+    </w:p>
+    <w:p>
+      <w:pPr>
         <w:ind w:left="-709" w:right="-568"/>
         <w:rPr>
           <w:rFonts w:ascii="Calibri" w:hAnsi="Calibri" w:cs="Arial"/>
@@ -4072,9 +4176,55 @@
       </w:pPr>
       <w:r>
         <w:rPr>
-          <w:rFonts w:ascii="Calibri" w:hAnsi="Calibri" w:cs="Arial"/>
-        </w:rPr>
-        <w:t>Aleksandra Skarzycka 0</w:t>
+          <w:noProof/>
+        </w:rPr>
+        <w:drawing>
+          <wp:inline distT="0" distB="0" distL="0" distR="0" wp14:anchorId="625906C5" wp14:editId="0C65986C">
+            <wp:extent cx="1400000" cy="552381"/>
+            <wp:effectExtent l="0" t="0" r="0" b="635"/>
+            <wp:docPr id="174278177" name="Picture 1"/>
+            <wp:cNvGraphicFramePr>
+              <a:graphicFrameLocks xmlns:a="http://schemas.openxmlformats.org/drawingml/2006/main" noChangeAspect="1"/>
+            </wp:cNvGraphicFramePr>
+            <a:graphic xmlns:a="http://schemas.openxmlformats.org/drawingml/2006/main">
+              <a:graphicData uri="http://schemas.openxmlformats.org/drawingml/2006/picture">
+                <pic:pic xmlns:pic="http://schemas.openxmlformats.org/drawingml/2006/picture">
+                  <pic:nvPicPr>
+                    <pic:cNvPr id="174278177" name=""/>
+                    <pic:cNvPicPr/>
+                  </pic:nvPicPr>
+                  <pic:blipFill>
+                    <a:blip r:embed="rId11"/>
+                    <a:stretch>
+                      <a:fillRect/>
+                    </a:stretch>
+                  </pic:blipFill>
+                  <pic:spPr>
+                    <a:xfrm>
+                      <a:off x="0" y="0"/>
+                      <a:ext cx="1400000" cy="552381"/>
+                    </a:xfrm>
+                    <a:prstGeom prst="rect">
+                      <a:avLst/>
+                    </a:prstGeom>
+                  </pic:spPr>
+                </pic:pic>
+              </a:graphicData>
+            </a:graphic>
+          </wp:inline>
+        </w:drawing>
+      </w:r>
+      <w:r>
+        <w:rPr>
+          <w:rFonts w:ascii="Calibri" w:hAnsi="Calibri" w:cs="Arial"/>
+        </w:rPr>
+        <w:t xml:space="preserve"> </w:t>
+      </w:r>
+      <w:r>
+        <w:rPr>
+          <w:rFonts w:ascii="Calibri" w:hAnsi="Calibri" w:cs="Arial"/>
+        </w:rPr>
+        <w:t>0</w:t>
       </w:r>
       <w:r>
         <w:rPr>
@@ -4356,19 +4506,11 @@
           <w:rFonts w:ascii="Calibri" w:hAnsi="Calibri" w:cs="Arial"/>
         </w:rPr>
       </w:pPr>
-      <w:proofErr w:type="gramStart"/>
-      <w:r>
-        <w:rPr>
-          <w:rFonts w:ascii="Calibri" w:hAnsi="Calibri" w:cs="Arial"/>
-        </w:rPr>
-        <w:t>Also</w:t>
-      </w:r>
-      <w:proofErr w:type="gramEnd"/>
-      <w:r>
-        <w:rPr>
-          <w:rFonts w:ascii="Calibri" w:hAnsi="Calibri" w:cs="Arial"/>
-        </w:rPr>
-        <w:t xml:space="preserve"> very terrible at remembering to fill this diary out, apologies.</w:t>
+      <w:r>
+        <w:rPr>
+          <w:rFonts w:ascii="Calibri" w:hAnsi="Calibri" w:cs="Arial"/>
+        </w:rPr>
+        <w:t>Also very terrible at remembering to fill this diary out, apologies.</w:t>
       </w:r>
     </w:p>
     <w:p>
@@ -4587,9 +4729,50 @@
       </w:pPr>
       <w:r>
         <w:rPr>
-          <w:rFonts w:ascii="Calibri" w:hAnsi="Calibri" w:cs="Arial"/>
-        </w:rPr>
-        <w:t xml:space="preserve">Aleksandra Skarzycka </w:t>
+          <w:noProof/>
+        </w:rPr>
+        <w:lastRenderedPageBreak/>
+        <w:drawing>
+          <wp:inline distT="0" distB="0" distL="0" distR="0" wp14:anchorId="56411CE6" wp14:editId="1AFE9692">
+            <wp:extent cx="1400000" cy="552381"/>
+            <wp:effectExtent l="0" t="0" r="0" b="635"/>
+            <wp:docPr id="995315127" name="Picture 1"/>
+            <wp:cNvGraphicFramePr>
+              <a:graphicFrameLocks xmlns:a="http://schemas.openxmlformats.org/drawingml/2006/main" noChangeAspect="1"/>
+            </wp:cNvGraphicFramePr>
+            <a:graphic xmlns:a="http://schemas.openxmlformats.org/drawingml/2006/main">
+              <a:graphicData uri="http://schemas.openxmlformats.org/drawingml/2006/picture">
+                <pic:pic xmlns:pic="http://schemas.openxmlformats.org/drawingml/2006/picture">
+                  <pic:nvPicPr>
+                    <pic:cNvPr id="995315127" name=""/>
+                    <pic:cNvPicPr/>
+                  </pic:nvPicPr>
+                  <pic:blipFill>
+                    <a:blip r:embed="rId11"/>
+                    <a:stretch>
+                      <a:fillRect/>
+                    </a:stretch>
+                  </pic:blipFill>
+                  <pic:spPr>
+                    <a:xfrm>
+                      <a:off x="0" y="0"/>
+                      <a:ext cx="1400000" cy="552381"/>
+                    </a:xfrm>
+                    <a:prstGeom prst="rect">
+                      <a:avLst/>
+                    </a:prstGeom>
+                  </pic:spPr>
+                </pic:pic>
+              </a:graphicData>
+            </a:graphic>
+          </wp:inline>
+        </w:drawing>
+      </w:r>
+      <w:r>
+        <w:rPr>
+          <w:rFonts w:ascii="Calibri" w:hAnsi="Calibri" w:cs="Arial"/>
+        </w:rPr>
+        <w:t xml:space="preserve"> </w:t>
       </w:r>
       <w:r>
         <w:rPr>
@@ -4833,338 +5016,364 @@
         <w:rPr>
           <w:rFonts w:ascii="Calibri" w:hAnsi="Calibri" w:cs="Arial"/>
         </w:rPr>
-        <w:t xml:space="preserve">Worked on getting modal pop ups to work for each vinyl so when you click on them it </w:t>
-      </w:r>
-      <w:proofErr w:type="gramStart"/>
-      <w:r>
-        <w:rPr>
-          <w:rFonts w:ascii="Calibri" w:hAnsi="Calibri" w:cs="Arial"/>
-        </w:rPr>
-        <w:t>opens up</w:t>
-      </w:r>
-      <w:proofErr w:type="gramEnd"/>
-      <w:r>
-        <w:rPr>
-          <w:rFonts w:ascii="Calibri" w:hAnsi="Calibri" w:cs="Arial"/>
-        </w:rPr>
-        <w:t xml:space="preserve"> to my personal </w:t>
-      </w:r>
-      <w:r>
-        <w:rPr>
-          <w:rFonts w:ascii="Calibri" w:hAnsi="Calibri" w:cs="Arial"/>
+        <w:t xml:space="preserve">Worked on getting modal pop ups to work for each vinyl so when you click on them it opens up to my personal thoughts on each, with a vinyl picture and </w:t>
+      </w:r>
+      <w:r>
+        <w:rPr>
+          <w:rFonts w:ascii="Calibri" w:hAnsi="Calibri" w:cs="Arial"/>
+        </w:rPr>
+        <w:t>Spotify</w:t>
+      </w:r>
+      <w:r>
+        <w:rPr>
+          <w:rFonts w:ascii="Calibri" w:hAnsi="Calibri" w:cs="Arial"/>
+        </w:rPr>
+        <w:t xml:space="preserve"> album embed so people can listen to snippets</w:t>
+      </w:r>
+      <w:r>
+        <w:rPr>
+          <w:rFonts w:ascii="Calibri" w:hAnsi="Calibri" w:cs="Arial"/>
+        </w:rPr>
+        <w:t xml:space="preserve"> (only for first 2 I believe)</w:t>
+      </w:r>
+      <w:r>
+        <w:rPr>
+          <w:rFonts w:ascii="Calibri" w:hAnsi="Calibri" w:cs="Arial"/>
+        </w:rPr>
+        <w:t>.</w:t>
+      </w:r>
+    </w:p>
+    <w:p>
+      <w:pPr>
+        <w:spacing w:line="480" w:lineRule="auto"/>
+        <w:ind w:left="-709" w:right="-568"/>
+        <w:rPr>
+          <w:rFonts w:ascii="Calibri" w:hAnsi="Calibri" w:cs="Arial"/>
+        </w:rPr>
+      </w:pPr>
+      <w:r>
+        <w:rPr>
+          <w:rFonts w:ascii="Calibri" w:hAnsi="Calibri" w:cs="Arial"/>
+        </w:rPr>
+        <w:t>Once I got that working, I placed in placeholder images and text so I can work out the layout inside the modals.</w:t>
+      </w:r>
+    </w:p>
+    <w:p>
+      <w:pPr>
+        <w:spacing w:line="480" w:lineRule="auto"/>
+        <w:ind w:left="-709" w:right="-568"/>
+        <w:rPr>
+          <w:rFonts w:ascii="Calibri" w:hAnsi="Calibri" w:cs="Arial"/>
+        </w:rPr>
+      </w:pPr>
+      <w:r>
+        <w:rPr>
+          <w:rFonts w:ascii="Calibri" w:hAnsi="Calibri" w:cs="Arial"/>
+        </w:rPr>
+        <w:t>During reading week</w:t>
+      </w:r>
+      <w:r>
+        <w:rPr>
+          <w:rFonts w:ascii="Calibri" w:hAnsi="Calibri" w:cs="Arial"/>
+        </w:rPr>
+        <w:t xml:space="preserve"> on the 19</w:t>
+      </w:r>
+      <w:r>
+        <w:rPr>
+          <w:rFonts w:ascii="Calibri" w:hAnsi="Calibri" w:cs="Arial"/>
+          <w:vertAlign w:val="superscript"/>
+        </w:rPr>
+        <w:t>th</w:t>
+      </w:r>
+      <w:r>
+        <w:rPr>
+          <w:rFonts w:ascii="Calibri" w:hAnsi="Calibri" w:cs="Arial"/>
+        </w:rPr>
+        <w:t xml:space="preserve"> I believe, I reworked the code after the meeting with my supervisor as I was told there was an easier way with the database after I </w:t>
+      </w:r>
+      <w:r>
+        <w:rPr>
+          <w:rFonts w:ascii="Calibri" w:hAnsi="Calibri" w:cs="Arial"/>
+        </w:rPr>
+        <w:t>worked it out, so there is much less code and it’s so much neater and understandable.</w:t>
+      </w:r>
+      <w:r>
+        <w:rPr>
+          <w:rFonts w:ascii="Calibri" w:hAnsi="Calibri" w:cs="Arial"/>
+        </w:rPr>
+        <w:t xml:space="preserve"> I then also just made colour changes, font changes</w:t>
+      </w:r>
+      <w:r>
+        <w:rPr>
+          <w:rFonts w:ascii="Calibri" w:hAnsi="Calibri" w:cs="Arial"/>
+        </w:rPr>
+        <w:t>, and had to rework the modals so it could work through the database too.</w:t>
+      </w:r>
+    </w:p>
+    <w:p>
+      <w:pPr>
+        <w:ind w:left="-709" w:right="-568"/>
+        <w:rPr>
+          <w:rFonts w:ascii="Calibri" w:hAnsi="Calibri" w:cs="Arial"/>
+        </w:rPr>
+      </w:pPr>
+    </w:p>
+    <w:p>
+      <w:pPr>
+        <w:ind w:left="-709" w:right="-568"/>
+        <w:rPr>
+          <w:rFonts w:ascii="Calibri" w:hAnsi="Calibri" w:cs="Arial"/>
+          <w:b/>
+          <w:bCs/>
+        </w:rPr>
+      </w:pPr>
+    </w:p>
+    <w:p>
+      <w:pPr>
+        <w:ind w:left="-709" w:right="-568"/>
+        <w:rPr>
+          <w:rFonts w:ascii="Calibri" w:hAnsi="Calibri" w:cs="Arial"/>
+          <w:b/>
+          <w:bCs/>
+        </w:rPr>
+      </w:pPr>
+    </w:p>
+    <w:p>
+      <w:pPr>
+        <w:ind w:left="-709" w:right="-568"/>
+        <w:rPr>
+          <w:rFonts w:ascii="Calibri" w:hAnsi="Calibri" w:cs="Arial"/>
+        </w:rPr>
+      </w:pPr>
+      <w:r>
+        <w:rPr>
+          <w:rFonts w:ascii="Calibri" w:hAnsi="Calibri" w:cs="Arial"/>
+          <w:b/>
+          <w:bCs/>
+        </w:rPr>
+        <w:t>Notes (and things to remember)</w:t>
+      </w:r>
+      <w:r>
+        <w:rPr>
+          <w:rFonts w:ascii="Calibri" w:hAnsi="Calibri" w:cs="Arial"/>
+        </w:rPr>
+        <w:t>:</w:t>
+      </w:r>
+    </w:p>
+    <w:p>
+      <w:pPr>
+        <w:ind w:left="-709" w:right="-568"/>
+        <w:rPr>
+          <w:rFonts w:ascii="Calibri" w:hAnsi="Calibri" w:cs="Arial"/>
+        </w:rPr>
+      </w:pPr>
+    </w:p>
+    <w:p>
+      <w:pPr>
+        <w:spacing w:line="480" w:lineRule="auto"/>
+        <w:ind w:left="-709" w:right="-568"/>
+        <w:rPr>
+          <w:rFonts w:ascii="Calibri" w:hAnsi="Calibri" w:cs="Arial"/>
+        </w:rPr>
+      </w:pPr>
+      <w:r>
+        <w:rPr>
+          <w:rFonts w:ascii="Calibri" w:hAnsi="Calibri" w:cs="Arial"/>
+        </w:rPr>
+        <w:t>Get registration done after all thoughts are filled out on each vinyl</w:t>
+      </w:r>
+    </w:p>
+    <w:p>
+      <w:pPr>
+        <w:spacing w:line="480" w:lineRule="auto"/>
+        <w:ind w:left="-709" w:right="-568"/>
+        <w:rPr>
+          <w:rFonts w:ascii="Calibri" w:hAnsi="Calibri" w:cs="Arial"/>
+        </w:rPr>
+      </w:pPr>
+      <w:r>
+        <w:rPr>
+          <w:rFonts w:ascii="Calibri" w:hAnsi="Calibri" w:cs="Arial"/>
+        </w:rPr>
+        <w:t>________________________________________________________________________________</w:t>
+      </w:r>
+    </w:p>
+    <w:p>
+      <w:pPr>
+        <w:spacing w:line="480" w:lineRule="auto"/>
+        <w:ind w:left="-709" w:right="-568"/>
+        <w:rPr>
+          <w:rFonts w:ascii="Calibri" w:hAnsi="Calibri" w:cs="Arial"/>
+        </w:rPr>
+      </w:pPr>
+      <w:r>
+        <w:rPr>
+          <w:rFonts w:ascii="Calibri" w:hAnsi="Calibri" w:cs="Arial"/>
+        </w:rPr>
+        <w:t>________________________________________________________________________________</w:t>
+      </w:r>
+    </w:p>
+    <w:p>
+      <w:pPr>
+        <w:spacing w:line="480" w:lineRule="auto"/>
+        <w:ind w:left="-709" w:right="-568"/>
+        <w:rPr>
+          <w:rFonts w:ascii="Calibri" w:hAnsi="Calibri" w:cs="Arial"/>
+        </w:rPr>
+      </w:pPr>
+      <w:r>
+        <w:rPr>
+          <w:rFonts w:ascii="Calibri" w:hAnsi="Calibri" w:cs="Arial"/>
+        </w:rPr>
+        <w:t>________________________________________________________________________________</w:t>
+      </w:r>
+    </w:p>
+    <w:p>
+      <w:pPr>
+        <w:spacing w:line="480" w:lineRule="auto"/>
+        <w:ind w:left="-709" w:right="-568"/>
+        <w:rPr>
+          <w:rFonts w:ascii="Calibri" w:hAnsi="Calibri" w:cs="Arial"/>
+        </w:rPr>
+      </w:pPr>
+      <w:r>
+        <w:rPr>
+          <w:rFonts w:ascii="Calibri" w:hAnsi="Calibri" w:cs="Arial"/>
+        </w:rPr>
+        <w:t>________________________________________________________________________________</w:t>
+      </w:r>
+    </w:p>
+    <w:p>
+      <w:pPr>
+        <w:spacing w:line="480" w:lineRule="auto"/>
+        <w:ind w:left="-709" w:right="-568"/>
+        <w:rPr>
+          <w:rFonts w:ascii="Calibri" w:hAnsi="Calibri" w:cs="Arial"/>
+        </w:rPr>
+      </w:pPr>
+      <w:r>
+        <w:rPr>
+          <w:rFonts w:ascii="Calibri" w:hAnsi="Calibri" w:cs="Arial"/>
+        </w:rPr>
+        <w:t>________________________________________________________________________________</w:t>
+      </w:r>
+    </w:p>
+    <w:p>
+      <w:pPr>
+        <w:spacing w:line="480" w:lineRule="auto"/>
+        <w:ind w:left="-709" w:right="-568"/>
+        <w:rPr>
+          <w:rFonts w:ascii="Calibri" w:hAnsi="Calibri" w:cs="Arial"/>
+        </w:rPr>
+      </w:pPr>
+      <w:r>
+        <w:rPr>
+          <w:rFonts w:ascii="Calibri" w:hAnsi="Calibri" w:cs="Arial"/>
+        </w:rPr>
+        <w:t>________________________________________________________________________________</w:t>
+      </w:r>
+    </w:p>
+    <w:p>
+      <w:pPr>
+        <w:ind w:left="-709" w:right="-568"/>
+        <w:rPr>
+          <w:rFonts w:ascii="Calibri" w:hAnsi="Calibri" w:cs="Arial"/>
+          <w:b/>
+          <w:bCs/>
+        </w:rPr>
+      </w:pPr>
+    </w:p>
+    <w:p>
+      <w:pPr>
+        <w:ind w:left="-709" w:right="-568"/>
+        <w:rPr>
+          <w:rFonts w:ascii="Calibri" w:hAnsi="Calibri" w:cs="Arial"/>
+        </w:rPr>
+      </w:pPr>
+      <w:r>
+        <w:rPr>
+          <w:rFonts w:ascii="Calibri" w:hAnsi="Calibri" w:cs="Arial"/>
+          <w:b/>
+          <w:bCs/>
+        </w:rPr>
+        <w:t>Signed (and dated)</w:t>
+      </w:r>
+      <w:r>
+        <w:rPr>
+          <w:rFonts w:ascii="Calibri" w:hAnsi="Calibri" w:cs="Arial"/>
+        </w:rPr>
+        <w:t>:</w:t>
+      </w:r>
+    </w:p>
+    <w:p>
+      <w:pPr>
+        <w:ind w:left="-709" w:right="-568"/>
+        <w:rPr>
+          <w:rFonts w:ascii="Calibri" w:hAnsi="Calibri" w:cs="Arial"/>
+        </w:rPr>
+      </w:pPr>
+    </w:p>
+    <w:p>
+      <w:pPr>
+        <w:ind w:left="-709" w:right="-568"/>
+        <w:rPr>
+          <w:rFonts w:ascii="Calibri" w:hAnsi="Calibri" w:cs="Arial"/>
+          <w:b/>
+          <w:bCs/>
+        </w:rPr>
+      </w:pPr>
+      <w:r>
+        <w:rPr>
+          <w:noProof/>
         </w:rPr>
         <w:lastRenderedPageBreak/>
-        <w:t xml:space="preserve">thoughts on each, with a vinyl picture and </w:t>
-      </w:r>
-      <w:r>
-        <w:rPr>
-          <w:rFonts w:ascii="Calibri" w:hAnsi="Calibri" w:cs="Arial"/>
-        </w:rPr>
-        <w:t>Spotify</w:t>
-      </w:r>
-      <w:r>
-        <w:rPr>
-          <w:rFonts w:ascii="Calibri" w:hAnsi="Calibri" w:cs="Arial"/>
-        </w:rPr>
-        <w:t xml:space="preserve"> album embed so people can listen to snippets</w:t>
-      </w:r>
-      <w:r>
-        <w:rPr>
-          <w:rFonts w:ascii="Calibri" w:hAnsi="Calibri" w:cs="Arial"/>
-        </w:rPr>
-        <w:t xml:space="preserve"> (only for first 2 I believe)</w:t>
-      </w:r>
-      <w:r>
-        <w:rPr>
-          <w:rFonts w:ascii="Calibri" w:hAnsi="Calibri" w:cs="Arial"/>
-        </w:rPr>
-        <w:t>.</w:t>
-      </w:r>
-    </w:p>
-    <w:p>
-      <w:pPr>
-        <w:spacing w:line="480" w:lineRule="auto"/>
-        <w:ind w:left="-709" w:right="-568"/>
-        <w:rPr>
-          <w:rFonts w:ascii="Calibri" w:hAnsi="Calibri" w:cs="Arial"/>
-        </w:rPr>
-      </w:pPr>
-      <w:r>
-        <w:rPr>
-          <w:rFonts w:ascii="Calibri" w:hAnsi="Calibri" w:cs="Arial"/>
-        </w:rPr>
-        <w:t>Once I got that working, I placed in placeholder images and text so I can work out the layout inside the modals.</w:t>
-      </w:r>
-    </w:p>
-    <w:p>
-      <w:pPr>
-        <w:spacing w:line="480" w:lineRule="auto"/>
-        <w:ind w:left="-709" w:right="-568"/>
-        <w:rPr>
-          <w:rFonts w:ascii="Calibri" w:hAnsi="Calibri" w:cs="Arial"/>
-        </w:rPr>
-      </w:pPr>
-      <w:r>
-        <w:rPr>
-          <w:rFonts w:ascii="Calibri" w:hAnsi="Calibri" w:cs="Arial"/>
-        </w:rPr>
-        <w:t>During reading week</w:t>
-      </w:r>
-      <w:r>
-        <w:rPr>
-          <w:rFonts w:ascii="Calibri" w:hAnsi="Calibri" w:cs="Arial"/>
-        </w:rPr>
-        <w:t xml:space="preserve"> on the 19</w:t>
-      </w:r>
-      <w:r>
-        <w:rPr>
-          <w:rFonts w:ascii="Calibri" w:hAnsi="Calibri" w:cs="Arial"/>
-          <w:vertAlign w:val="superscript"/>
-        </w:rPr>
-        <w:t>th</w:t>
-      </w:r>
-      <w:r>
-        <w:rPr>
-          <w:rFonts w:ascii="Calibri" w:hAnsi="Calibri" w:cs="Arial"/>
-        </w:rPr>
-        <w:t xml:space="preserve"> I believe, I reworked the code after the meeting with my supervisor as I was told there was an easier way with the database after I </w:t>
-      </w:r>
-      <w:r>
-        <w:rPr>
-          <w:rFonts w:ascii="Calibri" w:hAnsi="Calibri" w:cs="Arial"/>
-        </w:rPr>
-        <w:t>worked it out, so there is much less code and it’s so much neater and understandable.</w:t>
-      </w:r>
-      <w:r>
-        <w:rPr>
-          <w:rFonts w:ascii="Calibri" w:hAnsi="Calibri" w:cs="Arial"/>
-        </w:rPr>
-        <w:t xml:space="preserve"> I then also just made colour changes, font changes</w:t>
-      </w:r>
-      <w:r>
-        <w:rPr>
-          <w:rFonts w:ascii="Calibri" w:hAnsi="Calibri" w:cs="Arial"/>
-        </w:rPr>
-        <w:t>, and had to rework the modals so it could work through the database too.</w:t>
-      </w:r>
-    </w:p>
-    <w:p>
-      <w:pPr>
-        <w:ind w:left="-709" w:right="-568"/>
-        <w:rPr>
-          <w:rFonts w:ascii="Calibri" w:hAnsi="Calibri" w:cs="Arial"/>
-        </w:rPr>
-      </w:pPr>
-    </w:p>
-    <w:p>
-      <w:pPr>
-        <w:ind w:left="-709" w:right="-568"/>
-        <w:rPr>
-          <w:rFonts w:ascii="Calibri" w:hAnsi="Calibri" w:cs="Arial"/>
-          <w:b/>
-          <w:bCs/>
-        </w:rPr>
-      </w:pPr>
-    </w:p>
-    <w:p>
-      <w:pPr>
-        <w:ind w:left="-709" w:right="-568"/>
-        <w:rPr>
-          <w:rFonts w:ascii="Calibri" w:hAnsi="Calibri" w:cs="Arial"/>
-          <w:b/>
-          <w:bCs/>
-        </w:rPr>
-      </w:pPr>
-    </w:p>
-    <w:p>
-      <w:pPr>
-        <w:ind w:left="-709" w:right="-568"/>
-        <w:rPr>
-          <w:rFonts w:ascii="Calibri" w:hAnsi="Calibri" w:cs="Arial"/>
-        </w:rPr>
-      </w:pPr>
-      <w:r>
-        <w:rPr>
-          <w:rFonts w:ascii="Calibri" w:hAnsi="Calibri" w:cs="Arial"/>
-          <w:b/>
-          <w:bCs/>
-        </w:rPr>
-        <w:t>Notes (and things to remember)</w:t>
-      </w:r>
-      <w:r>
-        <w:rPr>
-          <w:rFonts w:ascii="Calibri" w:hAnsi="Calibri" w:cs="Arial"/>
-        </w:rPr>
-        <w:t>:</w:t>
-      </w:r>
-    </w:p>
-    <w:p>
-      <w:pPr>
-        <w:ind w:left="-709" w:right="-568"/>
-        <w:rPr>
-          <w:rFonts w:ascii="Calibri" w:hAnsi="Calibri" w:cs="Arial"/>
-        </w:rPr>
-      </w:pPr>
-    </w:p>
-    <w:p>
-      <w:pPr>
-        <w:spacing w:line="480" w:lineRule="auto"/>
-        <w:ind w:left="-709" w:right="-568"/>
-        <w:rPr>
-          <w:rFonts w:ascii="Calibri" w:hAnsi="Calibri" w:cs="Arial"/>
-        </w:rPr>
-      </w:pPr>
-      <w:r>
-        <w:rPr>
-          <w:rFonts w:ascii="Calibri" w:hAnsi="Calibri" w:cs="Arial"/>
-        </w:rPr>
-        <w:t>Get registration done after all thoughts are filled out on each vinyl</w:t>
-      </w:r>
-    </w:p>
-    <w:p>
-      <w:pPr>
-        <w:spacing w:line="480" w:lineRule="auto"/>
-        <w:ind w:left="-709" w:right="-568"/>
-        <w:rPr>
-          <w:rFonts w:ascii="Calibri" w:hAnsi="Calibri" w:cs="Arial"/>
-        </w:rPr>
-      </w:pPr>
-      <w:r>
-        <w:rPr>
-          <w:rFonts w:ascii="Calibri" w:hAnsi="Calibri" w:cs="Arial"/>
-        </w:rPr>
-        <w:t>________________________________________________________________________________</w:t>
-      </w:r>
-    </w:p>
-    <w:p>
-      <w:pPr>
-        <w:spacing w:line="480" w:lineRule="auto"/>
-        <w:ind w:left="-709" w:right="-568"/>
-        <w:rPr>
-          <w:rFonts w:ascii="Calibri" w:hAnsi="Calibri" w:cs="Arial"/>
-        </w:rPr>
-      </w:pPr>
-      <w:r>
-        <w:rPr>
-          <w:rFonts w:ascii="Calibri" w:hAnsi="Calibri" w:cs="Arial"/>
-        </w:rPr>
-        <w:t>________________________________________________________________________________</w:t>
-      </w:r>
-    </w:p>
-    <w:p>
-      <w:pPr>
-        <w:spacing w:line="480" w:lineRule="auto"/>
-        <w:ind w:left="-709" w:right="-568"/>
-        <w:rPr>
-          <w:rFonts w:ascii="Calibri" w:hAnsi="Calibri" w:cs="Arial"/>
-        </w:rPr>
-      </w:pPr>
-      <w:r>
-        <w:rPr>
-          <w:rFonts w:ascii="Calibri" w:hAnsi="Calibri" w:cs="Arial"/>
-        </w:rPr>
-        <w:t>________________________________________________________________________________</w:t>
-      </w:r>
-    </w:p>
-    <w:p>
-      <w:pPr>
-        <w:spacing w:line="480" w:lineRule="auto"/>
-        <w:ind w:left="-709" w:right="-568"/>
-        <w:rPr>
-          <w:rFonts w:ascii="Calibri" w:hAnsi="Calibri" w:cs="Arial"/>
-        </w:rPr>
-      </w:pPr>
-      <w:r>
-        <w:rPr>
-          <w:rFonts w:ascii="Calibri" w:hAnsi="Calibri" w:cs="Arial"/>
-        </w:rPr>
-        <w:t>________________________________________________________________________________</w:t>
-      </w:r>
-    </w:p>
-    <w:p>
-      <w:pPr>
-        <w:spacing w:line="480" w:lineRule="auto"/>
-        <w:ind w:left="-709" w:right="-568"/>
-        <w:rPr>
-          <w:rFonts w:ascii="Calibri" w:hAnsi="Calibri" w:cs="Arial"/>
-        </w:rPr>
-      </w:pPr>
-      <w:r>
-        <w:rPr>
-          <w:rFonts w:ascii="Calibri" w:hAnsi="Calibri" w:cs="Arial"/>
-        </w:rPr>
-        <w:t>________________________________________________________________________________</w:t>
-      </w:r>
-    </w:p>
-    <w:p>
-      <w:pPr>
-        <w:spacing w:line="480" w:lineRule="auto"/>
-        <w:ind w:left="-709" w:right="-568"/>
-        <w:rPr>
-          <w:rFonts w:ascii="Calibri" w:hAnsi="Calibri" w:cs="Arial"/>
-        </w:rPr>
-      </w:pPr>
-      <w:r>
-        <w:rPr>
-          <w:rFonts w:ascii="Calibri" w:hAnsi="Calibri" w:cs="Arial"/>
-        </w:rPr>
-        <w:t>________________________________________________________________________________</w:t>
-      </w:r>
-    </w:p>
-    <w:p>
-      <w:pPr>
-        <w:ind w:left="-709" w:right="-568"/>
-        <w:rPr>
-          <w:rFonts w:ascii="Calibri" w:hAnsi="Calibri" w:cs="Arial"/>
-          <w:b/>
-          <w:bCs/>
-        </w:rPr>
-      </w:pPr>
-    </w:p>
-    <w:p>
-      <w:pPr>
-        <w:ind w:left="-709" w:right="-568"/>
-        <w:rPr>
-          <w:rFonts w:ascii="Calibri" w:hAnsi="Calibri" w:cs="Arial"/>
-        </w:rPr>
-      </w:pPr>
-      <w:r>
-        <w:rPr>
-          <w:rFonts w:ascii="Calibri" w:hAnsi="Calibri" w:cs="Arial"/>
-          <w:b/>
-          <w:bCs/>
-        </w:rPr>
-        <w:t>Signed (and dated)</w:t>
-      </w:r>
-      <w:r>
-        <w:rPr>
-          <w:rFonts w:ascii="Calibri" w:hAnsi="Calibri" w:cs="Arial"/>
-        </w:rPr>
-        <w:t>:</w:t>
-      </w:r>
-    </w:p>
-    <w:p>
-      <w:pPr>
-        <w:ind w:left="-709" w:right="-568"/>
-        <w:rPr>
-          <w:rFonts w:ascii="Calibri" w:hAnsi="Calibri" w:cs="Arial"/>
-        </w:rPr>
-      </w:pPr>
-    </w:p>
-    <w:p>
-      <w:pPr>
-        <w:ind w:left="-709" w:right="-568"/>
-        <w:rPr>
-          <w:rFonts w:ascii="Calibri" w:hAnsi="Calibri" w:cs="Arial"/>
-          <w:b/>
-          <w:bCs/>
-        </w:rPr>
-      </w:pPr>
-      <w:r>
-        <w:rPr>
-          <w:rFonts w:ascii="Calibri" w:hAnsi="Calibri" w:cs="Arial"/>
-        </w:rPr>
-        <w:t>Aleksandra Skarzycka 25/02/26</w:t>
+        <w:drawing>
+          <wp:inline distT="0" distB="0" distL="0" distR="0" wp14:anchorId="752FED8C" wp14:editId="4AB9121D">
+            <wp:extent cx="1400000" cy="552381"/>
+            <wp:effectExtent l="0" t="0" r="0" b="635"/>
+            <wp:docPr id="500468016" name="Picture 1"/>
+            <wp:cNvGraphicFramePr>
+              <a:graphicFrameLocks xmlns:a="http://schemas.openxmlformats.org/drawingml/2006/main" noChangeAspect="1"/>
+            </wp:cNvGraphicFramePr>
+            <a:graphic xmlns:a="http://schemas.openxmlformats.org/drawingml/2006/main">
+              <a:graphicData uri="http://schemas.openxmlformats.org/drawingml/2006/picture">
+                <pic:pic xmlns:pic="http://schemas.openxmlformats.org/drawingml/2006/picture">
+                  <pic:nvPicPr>
+                    <pic:cNvPr id="500468016" name=""/>
+                    <pic:cNvPicPr/>
+                  </pic:nvPicPr>
+                  <pic:blipFill>
+                    <a:blip r:embed="rId11"/>
+                    <a:stretch>
+                      <a:fillRect/>
+                    </a:stretch>
+                  </pic:blipFill>
+                  <pic:spPr>
+                    <a:xfrm>
+                      <a:off x="0" y="0"/>
+                      <a:ext cx="1400000" cy="552381"/>
+                    </a:xfrm>
+                    <a:prstGeom prst="rect">
+                      <a:avLst/>
+                    </a:prstGeom>
+                  </pic:spPr>
+                </pic:pic>
+              </a:graphicData>
+            </a:graphic>
+          </wp:inline>
+        </w:drawing>
+      </w:r>
+      <w:r>
+        <w:rPr>
+          <w:rFonts w:ascii="Calibri" w:hAnsi="Calibri" w:cs="Arial"/>
+        </w:rPr>
+        <w:t xml:space="preserve"> </w:t>
+      </w:r>
+      <w:r>
+        <w:rPr>
+          <w:rFonts w:ascii="Calibri" w:hAnsi="Calibri" w:cs="Arial"/>
+        </w:rPr>
+        <w:t>25/02/26</w:t>
       </w:r>
       <w:r>
         <w:rPr>
@@ -5438,21 +5647,7 @@
         <w:rPr>
           <w:rFonts w:ascii="Calibri" w:hAnsi="Calibri" w:cs="Arial"/>
         </w:rPr>
-        <w:t xml:space="preserve">after I finally decide which ones are </w:t>
-      </w:r>
-      <w:proofErr w:type="gramStart"/>
-      <w:r>
-        <w:rPr>
-          <w:rFonts w:ascii="Calibri" w:hAnsi="Calibri" w:cs="Arial"/>
-        </w:rPr>
-        <w:t>definitely staying</w:t>
-      </w:r>
-      <w:proofErr w:type="gramEnd"/>
-      <w:r>
-        <w:rPr>
-          <w:rFonts w:ascii="Calibri" w:hAnsi="Calibri" w:cs="Arial"/>
-        </w:rPr>
-        <w:t>.</w:t>
+        <w:t>after I finally decide which ones are definitely staying.</w:t>
       </w:r>
     </w:p>
     <w:p>
@@ -5472,14 +5667,7 @@
         <w:rPr>
           <w:rFonts w:ascii="Calibri" w:hAnsi="Calibri" w:cs="Arial"/>
         </w:rPr>
-        <w:t xml:space="preserve"> Still </w:t>
-      </w:r>
-      <w:r>
-        <w:rPr>
-          <w:rFonts w:ascii="Calibri" w:hAnsi="Calibri" w:cs="Arial"/>
-        </w:rPr>
-        <w:lastRenderedPageBreak/>
-        <w:t>working with the same images</w:t>
+        <w:t xml:space="preserve"> Still working with the same images</w:t>
       </w:r>
       <w:r>
         <w:rPr>
@@ -5694,9 +5882,55 @@
       </w:pPr>
       <w:r>
         <w:rPr>
-          <w:rFonts w:ascii="Calibri" w:hAnsi="Calibri" w:cs="Arial"/>
-        </w:rPr>
-        <w:t>Aleksandra Skarzycka 03/03/26</w:t>
+          <w:noProof/>
+        </w:rPr>
+        <w:drawing>
+          <wp:inline distT="0" distB="0" distL="0" distR="0" wp14:anchorId="74BA4E3F" wp14:editId="2A58B9FA">
+            <wp:extent cx="1400000" cy="552381"/>
+            <wp:effectExtent l="0" t="0" r="0" b="635"/>
+            <wp:docPr id="1401169059" name="Picture 1"/>
+            <wp:cNvGraphicFramePr>
+              <a:graphicFrameLocks xmlns:a="http://schemas.openxmlformats.org/drawingml/2006/main" noChangeAspect="1"/>
+            </wp:cNvGraphicFramePr>
+            <a:graphic xmlns:a="http://schemas.openxmlformats.org/drawingml/2006/main">
+              <a:graphicData uri="http://schemas.openxmlformats.org/drawingml/2006/picture">
+                <pic:pic xmlns:pic="http://schemas.openxmlformats.org/drawingml/2006/picture">
+                  <pic:nvPicPr>
+                    <pic:cNvPr id="1401169059" name=""/>
+                    <pic:cNvPicPr/>
+                  </pic:nvPicPr>
+                  <pic:blipFill>
+                    <a:blip r:embed="rId11"/>
+                    <a:stretch>
+                      <a:fillRect/>
+                    </a:stretch>
+                  </pic:blipFill>
+                  <pic:spPr>
+                    <a:xfrm>
+                      <a:off x="0" y="0"/>
+                      <a:ext cx="1400000" cy="552381"/>
+                    </a:xfrm>
+                    <a:prstGeom prst="rect">
+                      <a:avLst/>
+                    </a:prstGeom>
+                  </pic:spPr>
+                </pic:pic>
+              </a:graphicData>
+            </a:graphic>
+          </wp:inline>
+        </w:drawing>
+      </w:r>
+      <w:r>
+        <w:rPr>
+          <w:rFonts w:ascii="Calibri" w:hAnsi="Calibri" w:cs="Arial"/>
+        </w:rPr>
+        <w:t xml:space="preserve"> </w:t>
+      </w:r>
+      <w:r>
+        <w:rPr>
+          <w:rFonts w:ascii="Calibri" w:hAnsi="Calibri" w:cs="Arial"/>
+        </w:rPr>
+        <w:t>03/03/26</w:t>
       </w:r>
       <w:r>
         <w:rPr>
@@ -6081,7 +6315,6 @@
         <w:rPr>
           <w:rFonts w:ascii="Calibri" w:hAnsi="Calibri" w:cs="Arial"/>
         </w:rPr>
-        <w:lastRenderedPageBreak/>
         <w:t>________________________________________________________________________________</w:t>
       </w:r>
     </w:p>
@@ -6151,9 +6384,55 @@
       </w:pPr>
       <w:r>
         <w:rPr>
-          <w:rFonts w:ascii="Calibri" w:hAnsi="Calibri" w:cs="Arial"/>
-        </w:rPr>
-        <w:t>Aleksandra Skarzycka 23/04/26</w:t>
+          <w:noProof/>
+        </w:rPr>
+        <w:drawing>
+          <wp:inline distT="0" distB="0" distL="0" distR="0" wp14:anchorId="1AABDC9A" wp14:editId="4E3AC27B">
+            <wp:extent cx="1400000" cy="552381"/>
+            <wp:effectExtent l="0" t="0" r="0" b="635"/>
+            <wp:docPr id="1871062769" name="Picture 1"/>
+            <wp:cNvGraphicFramePr>
+              <a:graphicFrameLocks xmlns:a="http://schemas.openxmlformats.org/drawingml/2006/main" noChangeAspect="1"/>
+            </wp:cNvGraphicFramePr>
+            <a:graphic xmlns:a="http://schemas.openxmlformats.org/drawingml/2006/main">
+              <a:graphicData uri="http://schemas.openxmlformats.org/drawingml/2006/picture">
+                <pic:pic xmlns:pic="http://schemas.openxmlformats.org/drawingml/2006/picture">
+                  <pic:nvPicPr>
+                    <pic:cNvPr id="1871062769" name=""/>
+                    <pic:cNvPicPr/>
+                  </pic:nvPicPr>
+                  <pic:blipFill>
+                    <a:blip r:embed="rId11"/>
+                    <a:stretch>
+                      <a:fillRect/>
+                    </a:stretch>
+                  </pic:blipFill>
+                  <pic:spPr>
+                    <a:xfrm>
+                      <a:off x="0" y="0"/>
+                      <a:ext cx="1400000" cy="552381"/>
+                    </a:xfrm>
+                    <a:prstGeom prst="rect">
+                      <a:avLst/>
+                    </a:prstGeom>
+                  </pic:spPr>
+                </pic:pic>
+              </a:graphicData>
+            </a:graphic>
+          </wp:inline>
+        </w:drawing>
+      </w:r>
+      <w:r>
+        <w:rPr>
+          <w:rFonts w:ascii="Calibri" w:hAnsi="Calibri" w:cs="Arial"/>
+        </w:rPr>
+        <w:t xml:space="preserve"> </w:t>
+      </w:r>
+      <w:r>
+        <w:rPr>
+          <w:rFonts w:ascii="Calibri" w:hAnsi="Calibri" w:cs="Arial"/>
+        </w:rPr>
+        <w:t>23/04/26</w:t>
       </w:r>
       <w:r>
         <w:rPr>
@@ -6391,21 +6670,7 @@
         <w:rPr>
           <w:rFonts w:ascii="Calibri" w:hAnsi="Calibri" w:cs="Arial"/>
         </w:rPr>
-        <w:t xml:space="preserve">Started the process of adding in registration/login for users, prepared and added in needed routes following a </w:t>
-      </w:r>
-      <w:proofErr w:type="spellStart"/>
-      <w:r>
-        <w:rPr>
-          <w:rFonts w:ascii="Calibri" w:hAnsi="Calibri" w:cs="Arial"/>
-        </w:rPr>
-        <w:t>Supabase</w:t>
-      </w:r>
-      <w:proofErr w:type="spellEnd"/>
-      <w:r>
-        <w:rPr>
-          <w:rFonts w:ascii="Calibri" w:hAnsi="Calibri" w:cs="Arial"/>
-        </w:rPr>
-        <w:t xml:space="preserve"> Doc.</w:t>
+        <w:t>Started the process of adding in registration/login for users, prepared and added in needed routes following a Supabase Doc.</w:t>
       </w:r>
     </w:p>
     <w:p>
@@ -6523,6 +6788,7 @@
         <w:rPr>
           <w:rFonts w:ascii="Calibri" w:hAnsi="Calibri" w:cs="Arial"/>
         </w:rPr>
+        <w:lastRenderedPageBreak/>
         <w:t>________________________________________________________________________________</w:t>
       </w:r>
     </w:p>
@@ -6622,9 +6888,55 @@
       </w:pPr>
       <w:r>
         <w:rPr>
-          <w:rFonts w:ascii="Calibri" w:hAnsi="Calibri" w:cs="Arial"/>
-        </w:rPr>
-        <w:t>Aleksandra Skarzycka 23/04/26</w:t>
+          <w:noProof/>
+        </w:rPr>
+        <w:drawing>
+          <wp:inline distT="0" distB="0" distL="0" distR="0" wp14:anchorId="7C3AEE18" wp14:editId="7BCD06D3">
+            <wp:extent cx="1400000" cy="552381"/>
+            <wp:effectExtent l="0" t="0" r="0" b="635"/>
+            <wp:docPr id="81509148" name="Picture 1"/>
+            <wp:cNvGraphicFramePr>
+              <a:graphicFrameLocks xmlns:a="http://schemas.openxmlformats.org/drawingml/2006/main" noChangeAspect="1"/>
+            </wp:cNvGraphicFramePr>
+            <a:graphic xmlns:a="http://schemas.openxmlformats.org/drawingml/2006/main">
+              <a:graphicData uri="http://schemas.openxmlformats.org/drawingml/2006/picture">
+                <pic:pic xmlns:pic="http://schemas.openxmlformats.org/drawingml/2006/picture">
+                  <pic:nvPicPr>
+                    <pic:cNvPr id="81509148" name=""/>
+                    <pic:cNvPicPr/>
+                  </pic:nvPicPr>
+                  <pic:blipFill>
+                    <a:blip r:embed="rId11"/>
+                    <a:stretch>
+                      <a:fillRect/>
+                    </a:stretch>
+                  </pic:blipFill>
+                  <pic:spPr>
+                    <a:xfrm>
+                      <a:off x="0" y="0"/>
+                      <a:ext cx="1400000" cy="552381"/>
+                    </a:xfrm>
+                    <a:prstGeom prst="rect">
+                      <a:avLst/>
+                    </a:prstGeom>
+                  </pic:spPr>
+                </pic:pic>
+              </a:graphicData>
+            </a:graphic>
+          </wp:inline>
+        </w:drawing>
+      </w:r>
+      <w:r>
+        <w:rPr>
+          <w:rFonts w:ascii="Calibri" w:hAnsi="Calibri" w:cs="Arial"/>
+        </w:rPr>
+        <w:t xml:space="preserve"> </w:t>
+      </w:r>
+      <w:r>
+        <w:rPr>
+          <w:rFonts w:ascii="Calibri" w:hAnsi="Calibri" w:cs="Arial"/>
+        </w:rPr>
+        <w:t>23/04/26</w:t>
       </w:r>
       <w:r>
         <w:rPr>
@@ -6889,7 +7201,6 @@
           <w:b/>
           <w:bCs/>
         </w:rPr>
-        <w:lastRenderedPageBreak/>
         <w:t>Notes (and things to remember)</w:t>
       </w:r>
       <w:r>
@@ -7063,9 +7374,55 @@
       </w:pPr>
       <w:r>
         <w:rPr>
-          <w:rFonts w:ascii="Calibri" w:hAnsi="Calibri" w:cs="Arial"/>
-        </w:rPr>
-        <w:t>Aleksandra Skarzycka 23/04/26</w:t>
+          <w:noProof/>
+        </w:rPr>
+        <w:drawing>
+          <wp:inline distT="0" distB="0" distL="0" distR="0" wp14:anchorId="664B6E42" wp14:editId="76D1CD23">
+            <wp:extent cx="1400000" cy="552381"/>
+            <wp:effectExtent l="0" t="0" r="0" b="635"/>
+            <wp:docPr id="883837291" name="Picture 1"/>
+            <wp:cNvGraphicFramePr>
+              <a:graphicFrameLocks xmlns:a="http://schemas.openxmlformats.org/drawingml/2006/main" noChangeAspect="1"/>
+            </wp:cNvGraphicFramePr>
+            <a:graphic xmlns:a="http://schemas.openxmlformats.org/drawingml/2006/main">
+              <a:graphicData uri="http://schemas.openxmlformats.org/drawingml/2006/picture">
+                <pic:pic xmlns:pic="http://schemas.openxmlformats.org/drawingml/2006/picture">
+                  <pic:nvPicPr>
+                    <pic:cNvPr id="883837291" name=""/>
+                    <pic:cNvPicPr/>
+                  </pic:nvPicPr>
+                  <pic:blipFill>
+                    <a:blip r:embed="rId11"/>
+                    <a:stretch>
+                      <a:fillRect/>
+                    </a:stretch>
+                  </pic:blipFill>
+                  <pic:spPr>
+                    <a:xfrm>
+                      <a:off x="0" y="0"/>
+                      <a:ext cx="1400000" cy="552381"/>
+                    </a:xfrm>
+                    <a:prstGeom prst="rect">
+                      <a:avLst/>
+                    </a:prstGeom>
+                  </pic:spPr>
+                </pic:pic>
+              </a:graphicData>
+            </a:graphic>
+          </wp:inline>
+        </w:drawing>
+      </w:r>
+      <w:r>
+        <w:rPr>
+          <w:rFonts w:ascii="Calibri" w:hAnsi="Calibri" w:cs="Arial"/>
+        </w:rPr>
+        <w:t xml:space="preserve"> </w:t>
+      </w:r>
+      <w:r>
+        <w:rPr>
+          <w:rFonts w:ascii="Calibri" w:hAnsi="Calibri" w:cs="Arial"/>
+        </w:rPr>
+        <w:t>23/04/26</w:t>
       </w:r>
       <w:r>
         <w:rPr>
@@ -7285,6 +7642,7 @@
           <w:b/>
           <w:bCs/>
         </w:rPr>
+        <w:lastRenderedPageBreak/>
         <w:t>Description of Work Completed</w:t>
       </w:r>
       <w:r>
@@ -7524,9 +7882,55 @@
       </w:pPr>
       <w:r>
         <w:rPr>
-          <w:rFonts w:ascii="Calibri" w:hAnsi="Calibri" w:cs="Arial"/>
-        </w:rPr>
-        <w:t>Aleksandra Skarzycka 23/04/26</w:t>
+          <w:noProof/>
+        </w:rPr>
+        <w:drawing>
+          <wp:inline distT="0" distB="0" distL="0" distR="0" wp14:anchorId="7D134967" wp14:editId="67F3ED6D">
+            <wp:extent cx="1400000" cy="552381"/>
+            <wp:effectExtent l="0" t="0" r="0" b="635"/>
+            <wp:docPr id="1742720614" name="Picture 1"/>
+            <wp:cNvGraphicFramePr>
+              <a:graphicFrameLocks xmlns:a="http://schemas.openxmlformats.org/drawingml/2006/main" noChangeAspect="1"/>
+            </wp:cNvGraphicFramePr>
+            <a:graphic xmlns:a="http://schemas.openxmlformats.org/drawingml/2006/main">
+              <a:graphicData uri="http://schemas.openxmlformats.org/drawingml/2006/picture">
+                <pic:pic xmlns:pic="http://schemas.openxmlformats.org/drawingml/2006/picture">
+                  <pic:nvPicPr>
+                    <pic:cNvPr id="1742720614" name=""/>
+                    <pic:cNvPicPr/>
+                  </pic:nvPicPr>
+                  <pic:blipFill>
+                    <a:blip r:embed="rId11"/>
+                    <a:stretch>
+                      <a:fillRect/>
+                    </a:stretch>
+                  </pic:blipFill>
+                  <pic:spPr>
+                    <a:xfrm>
+                      <a:off x="0" y="0"/>
+                      <a:ext cx="1400000" cy="552381"/>
+                    </a:xfrm>
+                    <a:prstGeom prst="rect">
+                      <a:avLst/>
+                    </a:prstGeom>
+                  </pic:spPr>
+                </pic:pic>
+              </a:graphicData>
+            </a:graphic>
+          </wp:inline>
+        </w:drawing>
+      </w:r>
+      <w:r>
+        <w:rPr>
+          <w:rFonts w:ascii="Calibri" w:hAnsi="Calibri" w:cs="Arial"/>
+        </w:rPr>
+        <w:t xml:space="preserve"> </w:t>
+      </w:r>
+      <w:r>
+        <w:rPr>
+          <w:rFonts w:ascii="Calibri" w:hAnsi="Calibri" w:cs="Arial"/>
+        </w:rPr>
+        <w:t>23/04/26</w:t>
       </w:r>
       <w:r>
         <w:rPr>
@@ -7929,6 +8333,7 @@
         <w:rPr>
           <w:rFonts w:ascii="Calibri" w:hAnsi="Calibri" w:cs="Arial"/>
         </w:rPr>
+        <w:lastRenderedPageBreak/>
         <w:t>________________________________________________________________________________</w:t>
       </w:r>
     </w:p>
@@ -8013,9 +8418,55 @@
       </w:pPr>
       <w:r>
         <w:rPr>
-          <w:rFonts w:ascii="Calibri" w:hAnsi="Calibri" w:cs="Arial"/>
-        </w:rPr>
-        <w:t>Aleksandra Skarzycka 23/04/26</w:t>
+          <w:noProof/>
+        </w:rPr>
+        <w:drawing>
+          <wp:inline distT="0" distB="0" distL="0" distR="0" wp14:anchorId="594237AB" wp14:editId="5C5E87B1">
+            <wp:extent cx="1400000" cy="552381"/>
+            <wp:effectExtent l="0" t="0" r="0" b="635"/>
+            <wp:docPr id="1615637831" name="Picture 1"/>
+            <wp:cNvGraphicFramePr>
+              <a:graphicFrameLocks xmlns:a="http://schemas.openxmlformats.org/drawingml/2006/main" noChangeAspect="1"/>
+            </wp:cNvGraphicFramePr>
+            <a:graphic xmlns:a="http://schemas.openxmlformats.org/drawingml/2006/main">
+              <a:graphicData uri="http://schemas.openxmlformats.org/drawingml/2006/picture">
+                <pic:pic xmlns:pic="http://schemas.openxmlformats.org/drawingml/2006/picture">
+                  <pic:nvPicPr>
+                    <pic:cNvPr id="1615637831" name=""/>
+                    <pic:cNvPicPr/>
+                  </pic:nvPicPr>
+                  <pic:blipFill>
+                    <a:blip r:embed="rId11"/>
+                    <a:stretch>
+                      <a:fillRect/>
+                    </a:stretch>
+                  </pic:blipFill>
+                  <pic:spPr>
+                    <a:xfrm>
+                      <a:off x="0" y="0"/>
+                      <a:ext cx="1400000" cy="552381"/>
+                    </a:xfrm>
+                    <a:prstGeom prst="rect">
+                      <a:avLst/>
+                    </a:prstGeom>
+                  </pic:spPr>
+                </pic:pic>
+              </a:graphicData>
+            </a:graphic>
+          </wp:inline>
+        </w:drawing>
+      </w:r>
+      <w:r>
+        <w:rPr>
+          <w:rFonts w:ascii="Calibri" w:hAnsi="Calibri" w:cs="Arial"/>
+        </w:rPr>
+        <w:t xml:space="preserve"> </w:t>
+      </w:r>
+      <w:r>
+        <w:rPr>
+          <w:rFonts w:ascii="Calibri" w:hAnsi="Calibri" w:cs="Arial"/>
+        </w:rPr>
+        <w:t>23/04/26</w:t>
       </w:r>
       <w:r>
         <w:rPr>
@@ -8307,7 +8758,6 @@
           <w:b/>
           <w:bCs/>
         </w:rPr>
-        <w:lastRenderedPageBreak/>
         <w:t>Notes (and things to remember)</w:t>
       </w:r>
       <w:r>
@@ -8481,9 +8931,55 @@
       </w:pPr>
       <w:r>
         <w:rPr>
-          <w:rFonts w:ascii="Calibri" w:hAnsi="Calibri" w:cs="Arial"/>
-        </w:rPr>
-        <w:t>Aleksandra Skarzycka 23/04/26</w:t>
+          <w:noProof/>
+        </w:rPr>
+        <w:drawing>
+          <wp:inline distT="0" distB="0" distL="0" distR="0" wp14:anchorId="0C1A8C99" wp14:editId="71906F1E">
+            <wp:extent cx="1400000" cy="552381"/>
+            <wp:effectExtent l="0" t="0" r="0" b="635"/>
+            <wp:docPr id="857817169" name="Picture 1"/>
+            <wp:cNvGraphicFramePr>
+              <a:graphicFrameLocks xmlns:a="http://schemas.openxmlformats.org/drawingml/2006/main" noChangeAspect="1"/>
+            </wp:cNvGraphicFramePr>
+            <a:graphic xmlns:a="http://schemas.openxmlformats.org/drawingml/2006/main">
+              <a:graphicData uri="http://schemas.openxmlformats.org/drawingml/2006/picture">
+                <pic:pic xmlns:pic="http://schemas.openxmlformats.org/drawingml/2006/picture">
+                  <pic:nvPicPr>
+                    <pic:cNvPr id="857817169" name=""/>
+                    <pic:cNvPicPr/>
+                  </pic:nvPicPr>
+                  <pic:blipFill>
+                    <a:blip r:embed="rId11"/>
+                    <a:stretch>
+                      <a:fillRect/>
+                    </a:stretch>
+                  </pic:blipFill>
+                  <pic:spPr>
+                    <a:xfrm>
+                      <a:off x="0" y="0"/>
+                      <a:ext cx="1400000" cy="552381"/>
+                    </a:xfrm>
+                    <a:prstGeom prst="rect">
+                      <a:avLst/>
+                    </a:prstGeom>
+                  </pic:spPr>
+                </pic:pic>
+              </a:graphicData>
+            </a:graphic>
+          </wp:inline>
+        </w:drawing>
+      </w:r>
+      <w:r>
+        <w:rPr>
+          <w:rFonts w:ascii="Calibri" w:hAnsi="Calibri" w:cs="Arial"/>
+        </w:rPr>
+        <w:t xml:space="preserve"> </w:t>
+      </w:r>
+      <w:r>
+        <w:rPr>
+          <w:rFonts w:ascii="Calibri" w:hAnsi="Calibri" w:cs="Arial"/>
+        </w:rPr>
+        <w:t>23/04/26</w:t>
       </w:r>
       <w:r>
         <w:rPr>
@@ -8531,6 +9027,7 @@
           <w:b/>
           <w:bCs/>
         </w:rPr>
+        <w:lastRenderedPageBreak/>
         <w:t>Student</w:t>
       </w:r>
       <w:r>
@@ -8870,167 +9367,167 @@
         <w:rPr>
           <w:rFonts w:ascii="Calibri" w:hAnsi="Calibri" w:cs="Arial"/>
         </w:rPr>
+        <w:t>________________________________________________________________________________</w:t>
+      </w:r>
+    </w:p>
+    <w:p>
+      <w:pPr>
+        <w:spacing w:line="480" w:lineRule="auto"/>
+        <w:ind w:left="-709" w:right="-568"/>
+        <w:rPr>
+          <w:rFonts w:ascii="Calibri" w:hAnsi="Calibri" w:cs="Arial"/>
+        </w:rPr>
+      </w:pPr>
+      <w:r>
+        <w:rPr>
+          <w:rFonts w:ascii="Calibri" w:hAnsi="Calibri" w:cs="Arial"/>
+        </w:rPr>
+        <w:t>________________________________________________________________________________</w:t>
+      </w:r>
+    </w:p>
+    <w:p>
+      <w:pPr>
+        <w:spacing w:line="480" w:lineRule="auto"/>
+        <w:ind w:left="-709" w:right="-568"/>
+        <w:rPr>
+          <w:rFonts w:ascii="Calibri" w:hAnsi="Calibri" w:cs="Arial"/>
+        </w:rPr>
+      </w:pPr>
+      <w:r>
+        <w:rPr>
+          <w:rFonts w:ascii="Calibri" w:hAnsi="Calibri" w:cs="Arial"/>
+        </w:rPr>
+        <w:t>________________________________________________________________________________</w:t>
+      </w:r>
+    </w:p>
+    <w:p>
+      <w:pPr>
+        <w:spacing w:line="480" w:lineRule="auto"/>
+        <w:ind w:left="-709" w:right="-568"/>
+        <w:rPr>
+          <w:rFonts w:ascii="Calibri" w:hAnsi="Calibri" w:cs="Arial"/>
+        </w:rPr>
+      </w:pPr>
+      <w:r>
+        <w:rPr>
+          <w:rFonts w:ascii="Calibri" w:hAnsi="Calibri" w:cs="Arial"/>
+        </w:rPr>
+        <w:t>________________________________________________________________________________</w:t>
+      </w:r>
+    </w:p>
+    <w:p>
+      <w:pPr>
+        <w:spacing w:line="480" w:lineRule="auto"/>
+        <w:ind w:left="-709" w:right="-568"/>
+        <w:rPr>
+          <w:rFonts w:ascii="Calibri" w:hAnsi="Calibri" w:cs="Arial"/>
+        </w:rPr>
+      </w:pPr>
+      <w:r>
+        <w:rPr>
+          <w:rFonts w:ascii="Calibri" w:hAnsi="Calibri" w:cs="Arial"/>
+        </w:rPr>
+        <w:t>________________________________________________________________________________</w:t>
+      </w:r>
+    </w:p>
+    <w:p>
+      <w:pPr>
+        <w:spacing w:line="480" w:lineRule="auto"/>
+        <w:ind w:left="-709" w:right="-568"/>
+        <w:rPr>
+          <w:rFonts w:ascii="Calibri" w:hAnsi="Calibri" w:cs="Arial"/>
+        </w:rPr>
+      </w:pPr>
+      <w:r>
+        <w:rPr>
+          <w:rFonts w:ascii="Calibri" w:hAnsi="Calibri" w:cs="Arial"/>
+        </w:rPr>
+        <w:t>________________________________________________________________________________</w:t>
+      </w:r>
+    </w:p>
+    <w:p>
+      <w:pPr>
+        <w:spacing w:line="480" w:lineRule="auto"/>
+        <w:ind w:left="-709" w:right="-568"/>
+        <w:rPr>
+          <w:rFonts w:ascii="Calibri" w:hAnsi="Calibri" w:cs="Arial"/>
+        </w:rPr>
+      </w:pPr>
+      <w:r>
+        <w:rPr>
+          <w:rFonts w:ascii="Calibri" w:hAnsi="Calibri" w:cs="Arial"/>
+        </w:rPr>
+        <w:t>________________________________________________________________________________</w:t>
+      </w:r>
+    </w:p>
+    <w:p>
+      <w:pPr>
+        <w:spacing w:line="480" w:lineRule="auto"/>
+        <w:ind w:left="-709" w:right="-568"/>
+        <w:rPr>
+          <w:rFonts w:ascii="Calibri" w:hAnsi="Calibri" w:cs="Arial"/>
+        </w:rPr>
+      </w:pPr>
+      <w:r>
+        <w:rPr>
+          <w:rFonts w:ascii="Calibri" w:hAnsi="Calibri" w:cs="Arial"/>
+        </w:rPr>
+        <w:t>________________________________________________________________________________</w:t>
+      </w:r>
+    </w:p>
+    <w:p>
+      <w:pPr>
+        <w:spacing w:line="480" w:lineRule="auto"/>
+        <w:ind w:left="-709" w:right="-568"/>
+        <w:rPr>
+          <w:rFonts w:ascii="Calibri" w:hAnsi="Calibri" w:cs="Arial"/>
+        </w:rPr>
+      </w:pPr>
+      <w:r>
+        <w:rPr>
+          <w:rFonts w:ascii="Calibri" w:hAnsi="Calibri" w:cs="Arial"/>
+        </w:rPr>
+        <w:t>________________________________________________________________________________</w:t>
+      </w:r>
+    </w:p>
+    <w:p>
+      <w:pPr>
+        <w:spacing w:line="480" w:lineRule="auto"/>
+        <w:ind w:left="-709" w:right="-568"/>
+        <w:rPr>
+          <w:rFonts w:ascii="Calibri" w:hAnsi="Calibri" w:cs="Arial"/>
+        </w:rPr>
+      </w:pPr>
+      <w:r>
+        <w:rPr>
+          <w:rFonts w:ascii="Calibri" w:hAnsi="Calibri" w:cs="Arial"/>
+        </w:rPr>
+        <w:t>________________________________________________________________________________</w:t>
+      </w:r>
+    </w:p>
+    <w:p>
+      <w:pPr>
+        <w:spacing w:line="480" w:lineRule="auto"/>
+        <w:ind w:left="-709" w:right="-568"/>
+        <w:rPr>
+          <w:rFonts w:ascii="Calibri" w:hAnsi="Calibri" w:cs="Arial"/>
+        </w:rPr>
+      </w:pPr>
+      <w:r>
+        <w:rPr>
+          <w:rFonts w:ascii="Calibri" w:hAnsi="Calibri" w:cs="Arial"/>
+        </w:rPr>
         <w:lastRenderedPageBreak/>
         <w:t>________________________________________________________________________________</w:t>
       </w:r>
     </w:p>
-    <w:p>
-      <w:pPr>
-        <w:spacing w:line="480" w:lineRule="auto"/>
-        <w:ind w:left="-709" w:right="-568"/>
-        <w:rPr>
-          <w:rFonts w:ascii="Calibri" w:hAnsi="Calibri" w:cs="Arial"/>
-        </w:rPr>
-      </w:pPr>
-      <w:r>
-        <w:rPr>
-          <w:rFonts w:ascii="Calibri" w:hAnsi="Calibri" w:cs="Arial"/>
-        </w:rPr>
-        <w:t>________________________________________________________________________________</w:t>
-      </w:r>
-    </w:p>
-    <w:p>
-      <w:pPr>
-        <w:spacing w:line="480" w:lineRule="auto"/>
-        <w:ind w:left="-709" w:right="-568"/>
-        <w:rPr>
-          <w:rFonts w:ascii="Calibri" w:hAnsi="Calibri" w:cs="Arial"/>
-        </w:rPr>
-      </w:pPr>
-      <w:r>
-        <w:rPr>
-          <w:rFonts w:ascii="Calibri" w:hAnsi="Calibri" w:cs="Arial"/>
-        </w:rPr>
-        <w:t>________________________________________________________________________________</w:t>
-      </w:r>
-    </w:p>
-    <w:p>
-      <w:pPr>
-        <w:spacing w:line="480" w:lineRule="auto"/>
-        <w:ind w:left="-709" w:right="-568"/>
-        <w:rPr>
-          <w:rFonts w:ascii="Calibri" w:hAnsi="Calibri" w:cs="Arial"/>
-        </w:rPr>
-      </w:pPr>
-      <w:r>
-        <w:rPr>
-          <w:rFonts w:ascii="Calibri" w:hAnsi="Calibri" w:cs="Arial"/>
-        </w:rPr>
-        <w:t>________________________________________________________________________________</w:t>
-      </w:r>
-    </w:p>
-    <w:p>
-      <w:pPr>
-        <w:spacing w:line="480" w:lineRule="auto"/>
-        <w:ind w:left="-709" w:right="-568"/>
-        <w:rPr>
-          <w:rFonts w:ascii="Calibri" w:hAnsi="Calibri" w:cs="Arial"/>
-        </w:rPr>
-      </w:pPr>
-      <w:r>
-        <w:rPr>
-          <w:rFonts w:ascii="Calibri" w:hAnsi="Calibri" w:cs="Arial"/>
-        </w:rPr>
-        <w:t>________________________________________________________________________________</w:t>
-      </w:r>
-    </w:p>
-    <w:p>
-      <w:pPr>
-        <w:spacing w:line="480" w:lineRule="auto"/>
-        <w:ind w:left="-709" w:right="-568"/>
-        <w:rPr>
-          <w:rFonts w:ascii="Calibri" w:hAnsi="Calibri" w:cs="Arial"/>
-        </w:rPr>
-      </w:pPr>
-      <w:r>
-        <w:rPr>
-          <w:rFonts w:ascii="Calibri" w:hAnsi="Calibri" w:cs="Arial"/>
-        </w:rPr>
-        <w:t>________________________________________________________________________________</w:t>
-      </w:r>
-    </w:p>
-    <w:p>
-      <w:pPr>
-        <w:spacing w:line="480" w:lineRule="auto"/>
-        <w:ind w:left="-709" w:right="-568"/>
-        <w:rPr>
-          <w:rFonts w:ascii="Calibri" w:hAnsi="Calibri" w:cs="Arial"/>
-        </w:rPr>
-      </w:pPr>
-      <w:r>
-        <w:rPr>
-          <w:rFonts w:ascii="Calibri" w:hAnsi="Calibri" w:cs="Arial"/>
-        </w:rPr>
-        <w:t>________________________________________________________________________________</w:t>
-      </w:r>
-    </w:p>
-    <w:p>
-      <w:pPr>
-        <w:spacing w:line="480" w:lineRule="auto"/>
-        <w:ind w:left="-709" w:right="-568"/>
-        <w:rPr>
-          <w:rFonts w:ascii="Calibri" w:hAnsi="Calibri" w:cs="Arial"/>
-        </w:rPr>
-      </w:pPr>
-      <w:r>
-        <w:rPr>
-          <w:rFonts w:ascii="Calibri" w:hAnsi="Calibri" w:cs="Arial"/>
-        </w:rPr>
-        <w:t>________________________________________________________________________________</w:t>
-      </w:r>
-    </w:p>
-    <w:p>
-      <w:pPr>
-        <w:spacing w:line="480" w:lineRule="auto"/>
-        <w:ind w:left="-709" w:right="-568"/>
-        <w:rPr>
-          <w:rFonts w:ascii="Calibri" w:hAnsi="Calibri" w:cs="Arial"/>
-        </w:rPr>
-      </w:pPr>
-      <w:r>
-        <w:rPr>
-          <w:rFonts w:ascii="Calibri" w:hAnsi="Calibri" w:cs="Arial"/>
-        </w:rPr>
-        <w:t>________________________________________________________________________________</w:t>
-      </w:r>
-    </w:p>
-    <w:p>
-      <w:pPr>
-        <w:spacing w:line="480" w:lineRule="auto"/>
-        <w:ind w:left="-709" w:right="-568"/>
-        <w:rPr>
-          <w:rFonts w:ascii="Calibri" w:hAnsi="Calibri" w:cs="Arial"/>
-        </w:rPr>
-      </w:pPr>
-      <w:r>
-        <w:rPr>
-          <w:rFonts w:ascii="Calibri" w:hAnsi="Calibri" w:cs="Arial"/>
-        </w:rPr>
-        <w:t>________________________________________________________________________________</w:t>
-      </w:r>
-    </w:p>
-    <w:p>
-      <w:pPr>
-        <w:spacing w:line="480" w:lineRule="auto"/>
-        <w:ind w:left="-709" w:right="-568"/>
-        <w:rPr>
-          <w:rFonts w:ascii="Calibri" w:hAnsi="Calibri" w:cs="Arial"/>
-        </w:rPr>
-      </w:pPr>
-      <w:r>
-        <w:rPr>
-          <w:rFonts w:ascii="Calibri" w:hAnsi="Calibri" w:cs="Arial"/>
-        </w:rPr>
-        <w:t>________________________________________________________________________________</w:t>
-      </w:r>
-    </w:p>
     <w:sectPr>
-      <w:headerReference w:type="even" r:id="rId11"/>
-      <w:headerReference w:type="default" r:id="rId12"/>
-      <w:footerReference w:type="even" r:id="rId13"/>
-      <w:footerReference w:type="default" r:id="rId14"/>
-      <w:headerReference w:type="first" r:id="rId15"/>
-      <w:footerReference w:type="first" r:id="rId16"/>
+      <w:headerReference w:type="even" r:id="rId12"/>
+      <w:headerReference w:type="default" r:id="rId13"/>
+      <w:footerReference w:type="even" r:id="rId14"/>
+      <w:footerReference w:type="default" r:id="rId15"/>
+      <w:headerReference w:type="first" r:id="rId16"/>
+      <w:footerReference w:type="first" r:id="rId17"/>
       <w:pgSz w:w="11906" w:h="16838"/>
       <w:pgMar w:top="284" w:right="851" w:bottom="1134" w:left="851" w:header="720" w:footer="720" w:gutter="0"/>
       <w:cols w:space="720"/>

</xml_diff>